<commit_message>
Rectify Cell Leaders Conference: Faithfulness in Ministry to 100% verbatim speaker words
</commit_message>
<xml_diff>
--- a/Cell_Leaders_Conference_Faithfulness_in_Ministry.docx
+++ b/Cell_Leaders_Conference_Faithfulness_in_Ministry.docx
@@ -28,7 +28,7 @@
           <w:i/>
           <w:sz w:val="28"/>
         </w:rPr>
-        <w:t>December 2021 — Expository Teaching on Stewardship, Proven Character, and Pastoral Oversight</w:t>
+        <w:t>December 2021 — Teaching by Pastor Segun Ayodele</w:t>
       </w:r>
     </w:p>
     <w:p>
@@ -41,7 +41,32 @@
           <w:b/>
           <w:sz w:val="24"/>
         </w:rPr>
-        <w:t>The Requirement of a Steward: Faithfulness, Reliability, and 100% Commitment to the Cause</w:t>
+        <w:t>It Is Required in Stewards That a Man Be Found Faithful</w:t>
+      </w:r>
+    </w:p>
+    <w:p>
+      <w:pPr>
+        <w:spacing w:before="80" w:after="80" w:line="276" w:lineRule="auto"/>
+      </w:pPr>
+      <w:r>
+        <w:rPr>
+          <w:rFonts w:ascii="Arial" w:hAnsi="Arial"/>
+          <w:i/>
+          <w:sz w:val="24"/>
+        </w:rPr>
+        <w:t>First Corinthians 4. I shared this yesterday and I am just going to run through it again. I know you must have seen it on my Facebook, and I rarely share my notes like that, but I just wanted people to read it and see it.</w:t>
+      </w:r>
+    </w:p>
+    <w:p>
+      <w:pPr>
+        <w:spacing w:before="80" w:after="80" w:line="276" w:lineRule="auto"/>
+      </w:pPr>
+      <w:r>
+        <w:rPr>
+          <w:rFonts w:ascii="Arial" w:hAnsi="Arial"/>
+          <w:sz w:val="24"/>
+        </w:rPr>
+        <w:t>First Corinthians 4:2, starting from verse 1:</w:t>
       </w:r>
     </w:p>
     <w:p>
@@ -97,37 +122,7 @@
           <w:rFonts w:ascii="Arial" w:hAnsi="Arial"/>
           <w:sz w:val="24"/>
         </w:rPr>
-        <w:t xml:space="preserve">In </w:t>
-      </w:r>
-      <w:r>
-        <w:rPr>
-          <w:rFonts w:ascii="Arial" w:hAnsi="Arial"/>
-          <w:b/>
-          <w:sz w:val="24"/>
-        </w:rPr>
-        <w:t>1 Corinthians 4:1-2</w:t>
-      </w:r>
-      <w:r>
-        <w:rPr>
-          <w:rFonts w:ascii="Arial" w:hAnsi="Arial"/>
-          <w:sz w:val="24"/>
-        </w:rPr>
-        <w:t xml:space="preserve">, the Apostle Paul defines the governing baseline of Christian ministerial service. A Christian worker is not to be accounted by worldly titles, public acclaim, or social visibility, but as a minister of Christ and a steward of the mysteries of God. Paul declares the singular, non-negotiable requirement laid upon every steward: </w:t>
-      </w:r>
-      <w:r>
-        <w:rPr>
-          <w:rFonts w:ascii="Arial" w:hAnsi="Arial"/>
-          <w:b/>
-          <w:sz w:val="24"/>
-        </w:rPr>
-        <w:t>moreover it is required in stewards, that a man be found faithful</w:t>
-      </w:r>
-      <w:r>
-        <w:rPr>
-          <w:rFonts w:ascii="Arial" w:hAnsi="Arial"/>
-          <w:sz w:val="24"/>
-        </w:rPr>
-        <w:t xml:space="preserve">. The word translated 'faithful' is the very same Greek word for faith, </w:t>
+        <w:t xml:space="preserve">That a man be found faithful. The word faithful is the same word for faith, </w:t>
       </w:r>
       <w:r>
         <w:rPr>
@@ -143,23 +138,19 @@
           <w:rFonts w:ascii="Arial" w:hAnsi="Arial"/>
           <w:sz w:val="24"/>
         </w:rPr>
-        <w:t xml:space="preserve">, derived from the verb </w:t>
+        <w:t>. It means to be reliable, to be trustworthy, faithful.</w:t>
       </w:r>
-      <w:r>
-        <w:rPr>
-          <w:rFonts w:ascii="Arial" w:hAnsi="Arial"/>
-          <w:b/>
-          <w:i/>
-          <w:sz w:val="24"/>
-        </w:rPr>
-        <w:t>pisteuo</w:t>
-      </w:r>
+    </w:p>
+    <w:p>
+      <w:pPr>
+        <w:spacing w:before="80" w:after="80" w:line="276" w:lineRule="auto"/>
+      </w:pPr>
       <w:r>
         <w:rPr>
           <w:rFonts w:ascii="Arial" w:hAnsi="Arial"/>
           <w:sz w:val="24"/>
         </w:rPr>
-        <w:t>. It denotes utter reliability, dependability, and steadfast trustworthiness under every condition.</w:t>
+        <w:t>Now, we often say God is faithful. First Corinthians chapter 10 verse 13 says God is faithful:</w:t>
       </w:r>
     </w:p>
     <w:p>
@@ -200,38 +191,65 @@
           <w:rFonts w:ascii="Arial" w:hAnsi="Arial"/>
           <w:sz w:val="24"/>
         </w:rPr>
-        <w:t xml:space="preserve">Believers frequently declare, 'God is faithful,' as affirmed in </w:t>
+        <w:t xml:space="preserve">He is faithful. We say that. </w:t>
       </w:r>
+      <w:r>
+        <w:rPr>
+          <w:rFonts w:ascii="Arial" w:hAnsi="Arial"/>
+          <w:i/>
+          <w:sz w:val="24"/>
+        </w:rPr>
+        <w:t>You know why?</w:t>
+      </w:r>
+      <w:r>
+        <w:rPr>
+          <w:rFonts w:ascii="Arial" w:hAnsi="Arial"/>
+          <w:sz w:val="24"/>
+        </w:rPr>
+        <w:t xml:space="preserve"> Because He is reliable. What else? He is always available. He does not change His commitment. He does not change His word in spite and despite opposing circumstances. That is why faithfulness is also called loyalty, and loyalty means to be committed to a cause 100%—to be committed to a cause 100%.</w:t>
+      </w:r>
+    </w:p>
+    <w:p>
+      <w:pPr>
+        <w:spacing w:before="80" w:after="80" w:line="276" w:lineRule="auto"/>
+      </w:pPr>
+      <w:r>
+        <w:rPr>
+          <w:rFonts w:ascii="Arial" w:hAnsi="Arial"/>
+          <w:sz w:val="24"/>
+        </w:rPr>
+        <w:t>So Paul is saying it is required of a steward—a believer is a steward—that one be found loyal, loyal to what one is doing, to be faithful, to be found loyal.</w:t>
+      </w:r>
+    </w:p>
+    <w:p>
+      <w:pPr>
+        <w:spacing w:before="280" w:after="80"/>
+      </w:pPr>
       <w:r>
         <w:rPr>
           <w:rFonts w:ascii="Arial" w:hAnsi="Arial"/>
           <w:b/>
           <w:sz w:val="24"/>
         </w:rPr>
-        <w:t>1 Corinthians 10:13</w:t>
+        <w:t>Faithfulness vs. Ambition: Ruth and Naomi and the Test of Unfulfilled Desires</w:t>
       </w:r>
+    </w:p>
+    <w:p>
+      <w:pPr>
+        <w:spacing w:before="80" w:after="80" w:line="276" w:lineRule="auto"/>
+      </w:pPr>
       <w:r>
         <w:rPr>
           <w:rFonts w:ascii="Arial" w:hAnsi="Arial"/>
           <w:sz w:val="24"/>
         </w:rPr>
-        <w:t xml:space="preserve">. Why is God faithful? Because He is reliable, He is always available, and He never alters His word or reneges on His commitment in spite and despite opposing circumstances or extremities. Look at the intense pressure, hostility, and negativity God walked through leading up to the cross of Christ—yet He remained steadfast and never altered His word. That is why faithfulness is also called </w:t>
+        <w:t>I look at Ruth and Naomi. When Ruth told Naomi:</w:t>
       </w:r>
-      <w:r>
-        <w:rPr>
-          <w:rFonts w:ascii="Arial" w:hAnsi="Arial"/>
-          <w:b/>
-          <w:sz w:val="24"/>
-        </w:rPr>
-        <w:t>loyalty</w:t>
-      </w:r>
-      <w:r>
-        <w:rPr>
-          <w:rFonts w:ascii="Arial" w:hAnsi="Arial"/>
-          <w:sz w:val="24"/>
-        </w:rPr>
-        <w:t xml:space="preserve">, and loyalty is defined as </w:t>
-      </w:r>
+    </w:p>
+    <w:p>
+      <w:pPr>
+        <w:spacing w:before="160" w:after="40"/>
+      </w:pPr>
       <w:r>
         <w:rPr>
           <w:rFonts w:ascii="Arial" w:hAnsi="Arial"/>
@@ -239,32 +257,13 @@
           <w:i/>
           <w:sz w:val="24"/>
         </w:rPr>
-        <w:t>being committed to a cause 100%</w:t>
-      </w:r>
-      <w:r>
-        <w:rPr>
-          <w:rFonts w:ascii="Arial" w:hAnsi="Arial"/>
-          <w:sz w:val="24"/>
-        </w:rPr>
-        <w:t>. When Paul asserts that it is required of a steward to be found faithful, he demands that every leader be found totally loyal to the assignment, the local church, and the spiritual oversight committed to their care.</w:t>
+        <w:t>Ruth 1:16</w:t>
       </w:r>
     </w:p>
     <w:p>
       <w:pPr>
-        <w:spacing w:before="280" w:after="80"/>
-      </w:pPr>
-      <w:r>
-        <w:rPr>
-          <w:rFonts w:ascii="Arial" w:hAnsi="Arial"/>
-          <w:b/>
-          <w:sz w:val="24"/>
-        </w:rPr>
-        <w:t>Faithfulness vs. Ambition: Ruth and Naomi and the Diagnostic of Unfulfilled Desires</w:t>
-      </w:r>
-    </w:p>
-    <w:p>
-      <w:pPr>
-        <w:spacing w:before="160" w:after="40"/>
+        <w:spacing w:before="20" w:after="20"/>
+        <w:ind w:left="360"/>
       </w:pPr>
       <w:r>
         <w:rPr>
@@ -273,37 +272,7 @@
           <w:i/>
           <w:sz w:val="24"/>
         </w:rPr>
-        <w:t>Ruth 1:16-17</w:t>
-      </w:r>
-    </w:p>
-    <w:p>
-      <w:pPr>
-        <w:spacing w:before="20" w:after="20"/>
-        <w:ind w:left="360"/>
-      </w:pPr>
-      <w:r>
-        <w:rPr>
-          <w:rFonts w:ascii="Arial" w:hAnsi="Arial"/>
-          <w:b/>
-          <w:i/>
-          <w:sz w:val="24"/>
-        </w:rPr>
-        <w:t>[16] And Ruth said, Intreat me not to leave thee, or to return from following after thee: for whither thou goest, I will go; and where thou lodgest, I will lodge: thy people shall be my people, and thy God my God:</w:t>
-      </w:r>
-    </w:p>
-    <w:p>
-      <w:pPr>
-        <w:spacing w:before="20" w:after="20"/>
-        <w:ind w:left="360"/>
-      </w:pPr>
-      <w:r>
-        <w:rPr>
-          <w:rFonts w:ascii="Arial" w:hAnsi="Arial"/>
-          <w:b/>
-          <w:i/>
-          <w:sz w:val="24"/>
-        </w:rPr>
-        <w:t>[17] Where thou diest, will I die, and there will I be buried: the LORD do so to me, and more also, if ought but death part thee and me.</w:t>
+        <w:t>[16] And Ruth said, Intreat me not to leave thee, or to return from following after thee: for whither thou goest, I will go; and where thou lodgest, I will lodge: thy people shall be my people, and thy God my God.</w:t>
       </w:r>
     </w:p>
     <w:p>
@@ -315,94 +284,56 @@
           <w:rFonts w:ascii="Arial" w:hAnsi="Arial"/>
           <w:sz w:val="24"/>
         </w:rPr>
-        <w:t xml:space="preserve">Consider the covenant loyalty between Ruth and Naomi in </w:t>
+        <w:t>She was not looking for anything. That is faithfulness.</w:t>
       </w:r>
+    </w:p>
+    <w:p>
+      <w:pPr>
+        <w:spacing w:before="80" w:after="80" w:line="276" w:lineRule="auto"/>
+      </w:pPr>
+      <w:r>
+        <w:rPr>
+          <w:rFonts w:ascii="Arial" w:hAnsi="Arial"/>
+          <w:sz w:val="24"/>
+        </w:rPr>
+        <w:t>There is a difference between faithfulness and ambition. And one of the ways one knows whether they are faithful or just ambitious is if their desires are not given to them. There are people who join a church or join a place so that they can rise through the ranks. They will be acting faithful, but the way one will know that they are not: any little alteration, they will change. That means they were never faithful.</w:t>
+      </w:r>
+    </w:p>
+    <w:p>
+      <w:pPr>
+        <w:spacing w:before="80" w:after="80" w:line="276" w:lineRule="auto"/>
+      </w:pPr>
+      <w:r>
+        <w:rPr>
+          <w:rFonts w:ascii="Arial" w:hAnsi="Arial"/>
+          <w:sz w:val="24"/>
+        </w:rPr>
+        <w:t>So faithfulness has nothing to do with circumstances. God gave His word, but look at what He walked through before Christ died on the cross—it was a lot of negativities, extremities. Faithful men do not break under pressure. No, the faithful man is reliable, no excuses.</w:t>
+      </w:r>
+    </w:p>
+    <w:p>
+      <w:pPr>
+        <w:spacing w:before="280" w:after="80"/>
+      </w:pPr>
       <w:r>
         <w:rPr>
           <w:rFonts w:ascii="Arial" w:hAnsi="Arial"/>
           <w:b/>
           <w:sz w:val="24"/>
         </w:rPr>
-        <w:t>Ruth 1</w:t>
+        <w:t>Serving with All the Heart: Elisha Pouring Water on Elijah's Hands</w:t>
       </w:r>
+    </w:p>
+    <w:p>
+      <w:pPr>
+        <w:spacing w:before="80" w:after="80" w:line="276" w:lineRule="auto"/>
+      </w:pPr>
       <w:r>
         <w:rPr>
           <w:rFonts w:ascii="Arial" w:hAnsi="Arial"/>
           <w:sz w:val="24"/>
         </w:rPr>
-        <w:t xml:space="preserve">. Following the death of her husband and sons in Moab, Naomi urged her daughters-in-law to return to their maternal homes. Orpah kissed Naomi and departed, but Ruth clave unto her, uttering that monumental confession: </w:t>
-      </w:r>
-      <w:r>
-        <w:rPr>
-          <w:rFonts w:ascii="Arial" w:hAnsi="Arial"/>
-          <w:b/>
-          <w:i/>
-          <w:sz w:val="24"/>
-        </w:rPr>
-        <w:t>'Whither thou goest, I will go; and where thou lodgest, I will lodge: thy people shall be my people, and thy God my God.'</w:t>
-      </w:r>
-      <w:r>
-        <w:rPr>
-          <w:rFonts w:ascii="Arial" w:hAnsi="Arial"/>
-          <w:sz w:val="24"/>
-        </w:rPr>
-        <w:t xml:space="preserve"> Ruth was an alien Gentile entering Israel with zero guarantees of financial security, marriage, or social status. She was looking for absolutely nothing in return. That is the very definition of faithfulness.</w:t>
-      </w:r>
-    </w:p>
-    <w:p>
-      <w:pPr>
-        <w:spacing w:before="80" w:after="80" w:line="276" w:lineRule="auto"/>
-      </w:pPr>
-      <w:r>
-        <w:rPr>
-          <w:rFonts w:ascii="Arial" w:hAnsi="Arial"/>
-          <w:sz w:val="24"/>
-        </w:rPr>
-        <w:t xml:space="preserve">There is a sharp, irreconcilable difference between </w:t>
-      </w:r>
-      <w:r>
-        <w:rPr>
-          <w:rFonts w:ascii="Arial" w:hAnsi="Arial"/>
-          <w:b/>
-          <w:sz w:val="24"/>
-        </w:rPr>
-        <w:t>faithfulness and personal ambition</w:t>
-      </w:r>
-      <w:r>
-        <w:rPr>
-          <w:rFonts w:ascii="Arial" w:hAnsi="Arial"/>
-          <w:sz w:val="24"/>
-        </w:rPr>
-        <w:t xml:space="preserve">. The definitive spiritual diagnostic that distinguishes the two is this: </w:t>
-      </w:r>
-      <w:r>
-        <w:rPr>
-          <w:rFonts w:ascii="Arial" w:hAnsi="Arial"/>
-          <w:b/>
-          <w:i/>
-          <w:sz w:val="24"/>
-        </w:rPr>
-        <w:t>one discovers whether an individual is genuinely faithful or merely ambitious when their personal desires are delayed or denied</w:t>
-      </w:r>
-      <w:r>
-        <w:rPr>
-          <w:rFonts w:ascii="Arial" w:hAnsi="Arial"/>
-          <w:sz w:val="24"/>
-        </w:rPr>
-        <w:t>. There are individuals who join a local church or enter ministry specifically to climb ecclesiastical ladders, gain prominence, or be noticed by senior leadership. Such people put on an elaborate appearance of faithfulness, but the moment their personal expectations suffer the slightest alteration, correction, or delay, their posture changes immediately. That sudden shift unmasks their true motive: they were never faithful. True faithfulness has nothing to do with favorable circumstances; faithful men and women do not break under pressure, make no excuses, and remain one hundred percent committed to the cause.</w:t>
-      </w:r>
-    </w:p>
-    <w:p>
-      <w:pPr>
-        <w:spacing w:before="280" w:after="80"/>
-      </w:pPr>
-      <w:r>
-        <w:rPr>
-          <w:rFonts w:ascii="Arial" w:hAnsi="Arial"/>
-          <w:b/>
-          <w:sz w:val="24"/>
-        </w:rPr>
-        <w:t>Wholehearted Servanthood: Elisha Pouring Water on Elijah's Hands and Wearing the Father's Ministry</w:t>
+        <w:t>We find Elijah and Elisha. Elisha did not know all that was going on; he just followed Elijah faithfully. Historical facts indicate Elisha came from a wealthy family and he probably was older, yet he served Elijah with all his heart. When the king asked who has the word of the Lord, he said:</w:t>
       </w:r>
     </w:p>
     <w:p>
@@ -443,23 +374,47 @@
           <w:rFonts w:ascii="Arial" w:hAnsi="Arial"/>
           <w:sz w:val="24"/>
         </w:rPr>
-        <w:t xml:space="preserve">The scriptural pattern of faithful stewardship is powerfully illustrated in Elijah and Elisha. Elisha did not know all that lay ahead when he was summoned from the plow; he simply followed Elijah with an undivided heart. Historical indications suggest Elisha came from an affluent agricultural household and was likely older, yet he willingly subjected himself to humble, menial servanthood. When the allied kings sought a prophet of the Lord, the accrediting testimony given concerning Elisha was: </w:t>
+        <w:t xml:space="preserve">He poured water—a symbolic term on the hands of Elijah, which means he served him faithfully. And he followed him through. Notice as they were pressing through Jericho before Jordan, all the sons of the prophets stayed behind. </w:t>
       </w:r>
       <w:r>
         <w:rPr>
           <w:rFonts w:ascii="Arial" w:hAnsi="Arial"/>
-          <w:b/>
           <w:i/>
           <w:sz w:val="24"/>
         </w:rPr>
-        <w:t>'Here is Elisha the son of Shaphat, which poured water on the hands of Elijah.'</w:t>
+        <w:t>They said, 'Why are you following this man? What are you following him for? Don't you know he is going today?'</w:t>
       </w:r>
       <w:r>
         <w:rPr>
           <w:rFonts w:ascii="Arial" w:hAnsi="Arial"/>
           <w:sz w:val="24"/>
         </w:rPr>
-        <w:t xml:space="preserve"> He was celebrated not by oratorical titles, but by dependable, servant-hearted loyalty.</w:t>
+        <w:t xml:space="preserve"> Elisha did not answer them; he kept following. When Elijah said, 'What do you ask of me?' Elisha said, 'I want a double portion of your spirit,' which is the firstborn inheritance to be the head of the prophets.</w:t>
+      </w:r>
+    </w:p>
+    <w:p>
+      <w:pPr>
+        <w:spacing w:before="80" w:after="80" w:line="276" w:lineRule="auto"/>
+      </w:pPr>
+      <w:r>
+        <w:rPr>
+          <w:rFonts w:ascii="Arial" w:hAnsi="Arial"/>
+          <w:sz w:val="24"/>
+        </w:rPr>
+        <w:t>Elijah said, 'What you ask of me is very hard, but if you see me go, it shall be so.' And Elisha was there faithful.</w:t>
+      </w:r>
+    </w:p>
+    <w:p>
+      <w:pPr>
+        <w:spacing w:before="80" w:after="80" w:line="276" w:lineRule="auto"/>
+      </w:pPr>
+      <w:r>
+        <w:rPr>
+          <w:rFonts w:ascii="Arial" w:hAnsi="Arial"/>
+          <w:i/>
+          <w:sz w:val="24"/>
+        </w:rPr>
+        <w:t>And one knows he did not do it for himself. As soon as he left—and I shared a bit of that in church today about Jordan—and the mantle came on him and he split the Jordan, he said:</w:t>
       </w:r>
     </w:p>
     <w:p>
@@ -500,91 +455,82 @@
           <w:rFonts w:ascii="Arial" w:hAnsi="Arial"/>
           <w:sz w:val="24"/>
         </w:rPr>
-        <w:t>As Elijah made his final journey through Gilgal, Bethel, Jericho, and toward Jordan (</w:t>
+        <w:t>That is what he said. That is faithfulness. Nothing changed; he was not doing it for himself. 'Where is the Lord God?' He did not say, 'Where is the God of Elisha?' No, he said, 'Where is the Lord God of Elijah?' He is letting everybody know, 'I am wearing Elijah's ministry.' That is a faithful person. He is loyal, just like Joshua. Joshua stayed with the fact that this is the instruction of Moses, the servant of the Lord.</w:t>
       </w:r>
+    </w:p>
+    <w:p>
+      <w:pPr>
+        <w:spacing w:before="80" w:after="80" w:line="276" w:lineRule="auto"/>
+      </w:pPr>
+      <w:r>
+        <w:rPr>
+          <w:rFonts w:ascii="Arial" w:hAnsi="Arial"/>
+          <w:i/>
+          <w:sz w:val="24"/>
+        </w:rPr>
+        <w:t>Joshua did not use Moses to preach, saying, 'Moses could have brought us here, but he is not the one that eventually entered; you know what happened to him.' No! He stayed with the fact that this is Moses' instruction.</w:t>
+      </w:r>
+    </w:p>
+    <w:p>
+      <w:pPr>
+        <w:spacing w:before="80" w:after="80" w:line="276" w:lineRule="auto"/>
+      </w:pPr>
+      <w:r>
+        <w:rPr>
+          <w:rFonts w:ascii="Arial" w:hAnsi="Arial"/>
+          <w:sz w:val="24"/>
+        </w:rPr>
+        <w:t>Loyal, faithful people do not do otherwise when leadership is not there. Faithful people will do in the service what they would have done if Jesus were seated in the front seat. Faithful people will do in the service what they would have done if Pastor were seated in the service. It is not because leadership is present; in fact, they do things behind leadership as though leadership were seated there. It is required of a steward that a man be found faithful, reliable under every circumstance—trustworthy.</w:t>
+      </w:r>
+    </w:p>
+    <w:p>
+      <w:pPr>
+        <w:spacing w:before="280" w:after="80"/>
+      </w:pPr>
       <w:r>
         <w:rPr>
           <w:rFonts w:ascii="Arial" w:hAnsi="Arial"/>
           <w:b/>
           <w:sz w:val="24"/>
         </w:rPr>
-        <w:t>2 Kings 2</w:t>
+        <w:t>Like a Broken Tooth and a Foot out of Joint</w:t>
       </w:r>
+    </w:p>
+    <w:p>
+      <w:pPr>
+        <w:spacing w:before="80" w:after="80" w:line="276" w:lineRule="auto"/>
+      </w:pPr>
+      <w:r>
+        <w:rPr>
+          <w:rFonts w:ascii="Arial" w:hAnsi="Arial"/>
+          <w:i/>
+          <w:sz w:val="24"/>
+        </w:rPr>
+        <w:t>Look at what Pastor Somi shared with us at the Believers Convention. I told him I was going to make it a teaching.</w:t>
+      </w:r>
+    </w:p>
+    <w:p>
+      <w:pPr>
+        <w:spacing w:before="80" w:after="80" w:line="276" w:lineRule="auto"/>
+      </w:pPr>
       <w:r>
         <w:rPr>
           <w:rFonts w:ascii="Arial" w:hAnsi="Arial"/>
           <w:sz w:val="24"/>
         </w:rPr>
-        <w:t xml:space="preserve">), the cynical sons of the prophets lingered behind as passive observers, questioning Elisha: 'Why are you following this master? Do you not know he will be taken from you today?' Elisha refused to be distracted by their cynicism and stood faithfully with his spiritual father to the very end. When Elijah asked what he desired, Elisha requested a double portion of his spirit—the legal birthright of the firstborn inheritor to maintain the continuity of the prophetic office. When Elijah was caught up and the mantle fell, Elisha demonstrated that his service was entirely devoid of personal ambition. Striking the waters of the Jordan, he cried: </w:t>
+        <w:t>We saw Timothy everywhere. One can readily call Paul's epistles Timothy's epistles—faithful, everywhere.</w:t>
       </w:r>
-      <w:r>
-        <w:rPr>
-          <w:rFonts w:ascii="Arial" w:hAnsi="Arial"/>
-          <w:b/>
-          <w:i/>
-          <w:sz w:val="24"/>
-        </w:rPr>
-        <w:t>'Where is the LORD God of Elijah?'</w:t>
-      </w:r>
+    </w:p>
+    <w:p>
+      <w:pPr>
+        <w:spacing w:before="80" w:after="80" w:line="276" w:lineRule="auto"/>
+      </w:pPr>
       <w:r>
         <w:rPr>
           <w:rFonts w:ascii="Arial" w:hAnsi="Arial"/>
           <w:sz w:val="24"/>
         </w:rPr>
-        <w:t xml:space="preserve"> He did not proclaim, 'Where is the God of Elisha?' He made it abundantly clear to all that he was merely wearing Elijah's ministry under the same God.</w:t>
-      </w:r>
-    </w:p>
-    <w:p>
-      <w:pPr>
-        <w:spacing w:before="80" w:after="80" w:line="276" w:lineRule="auto"/>
-      </w:pPr>
-      <w:r>
-        <w:rPr>
-          <w:rFonts w:ascii="Arial" w:hAnsi="Arial"/>
-          <w:sz w:val="24"/>
-        </w:rPr>
-        <w:t xml:space="preserve">In identical fashion, Joshua honored Moses. He faithfully executed Moses' instructions and never exploited Moses' passing or human shortcomings as pulpit sermon material to manufacture an independent reputation. Faithful people do not conduct themselves differently when leadership is absent. Indeed, this establishes the cardinal rule of ministerial integrity: </w:t>
-      </w:r>
-      <w:r>
-        <w:rPr>
-          <w:rFonts w:ascii="Arial" w:hAnsi="Arial"/>
-          <w:b/>
-          <w:i/>
-          <w:sz w:val="24"/>
-        </w:rPr>
-        <w:t>faithful leaders conduct themselves in the background precisely as they would if Jesus Christ or their senior pastor were seated in the front row</w:t>
-      </w:r>
-      <w:r>
-        <w:rPr>
-          <w:rFonts w:ascii="Arial" w:hAnsi="Arial"/>
-          <w:sz w:val="24"/>
-        </w:rPr>
-        <w:t>. Their diligence, reverence, and pastoral care remain constant whether observed or unobserved.</w:t>
-      </w:r>
-    </w:p>
-    <w:p>
-      <w:pPr>
-        <w:spacing w:before="280" w:after="80"/>
-      </w:pPr>
-      <w:r>
-        <w:rPr>
-          <w:rFonts w:ascii="Arial" w:hAnsi="Arial"/>
-          <w:b/>
-          <w:sz w:val="24"/>
-        </w:rPr>
-        <w:t>The Broken Tooth and Foot out of Joint: The Acute Damage of Unfaithfulness</w:t>
-      </w:r>
-    </w:p>
-    <w:p>
-      <w:pPr>
-        <w:spacing w:before="80" w:after="80" w:line="276" w:lineRule="auto"/>
-      </w:pPr>
-      <w:r>
-        <w:rPr>
-          <w:rFonts w:ascii="Arial" w:hAnsi="Arial"/>
-          <w:sz w:val="24"/>
-        </w:rPr>
-        <w:t>Consider the Apostle Paul's ministry. Throughout the New Testament epistles, Timothy appears consistently as Paul's dependable associate—so ubiquitous that one could readily refer to Paul's epistles as Timothy's epistles. Timothy was thoroughly reliable, sharing Paul's heart and naturally caring for the welfare of the flock.</w:t>
+        <w:t>Proverbs 25:19:</w:t>
       </w:r>
     </w:p>
     <w:p>
@@ -623,25 +569,65 @@
       <w:r>
         <w:rPr>
           <w:rFonts w:ascii="Arial" w:hAnsi="Arial"/>
+          <w:i/>
           <w:sz w:val="24"/>
         </w:rPr>
-        <w:t xml:space="preserve">In sharp contrast, </w:t>
+        <w:t>I have experienced it too. A broken tooth is painful; it cannot chew. A foot out of joint cannot walk.</w:t>
       </w:r>
-      <w:r>
-        <w:rPr>
-          <w:rFonts w:ascii="Arial" w:hAnsi="Arial"/>
-          <w:b/>
-          <w:sz w:val="24"/>
-        </w:rPr>
-        <w:t>Proverbs 25:19</w:t>
-      </w:r>
+    </w:p>
+    <w:p>
+      <w:pPr>
+        <w:spacing w:before="80" w:after="80" w:line="276" w:lineRule="auto"/>
+      </w:pPr>
       <w:r>
         <w:rPr>
           <w:rFonts w:ascii="Arial" w:hAnsi="Arial"/>
           <w:sz w:val="24"/>
         </w:rPr>
-        <w:t xml:space="preserve"> reveals the acute dysfunction and excruciating pain inflicted by unreliable workers: </w:t>
+        <w:t>An individual is there, they have a responsibility—they have been made a cell leader, their name is on the roll, they are a head of department or a pastor—but they are like a broken tooth: we cannot chew, we cannot walk, yet they are there.</w:t>
       </w:r>
+    </w:p>
+    <w:p>
+      <w:pPr>
+        <w:spacing w:before="80" w:after="80" w:line="276" w:lineRule="auto"/>
+      </w:pPr>
+      <w:r>
+        <w:rPr>
+          <w:rFonts w:ascii="Arial" w:hAnsi="Arial"/>
+          <w:sz w:val="24"/>
+        </w:rPr>
+        <w:t>Anybody who says that what one does in the service of God has no consequence is deceiving people.</w:t>
+      </w:r>
+    </w:p>
+    <w:p>
+      <w:pPr>
+        <w:spacing w:before="80" w:after="80" w:line="276" w:lineRule="auto"/>
+      </w:pPr>
+      <w:r>
+        <w:rPr>
+          <w:rFonts w:ascii="Arial" w:hAnsi="Arial"/>
+          <w:i/>
+          <w:sz w:val="24"/>
+        </w:rPr>
+        <w:t>There was a guy I told last year: 'Read my lips. Before you were born, I have been teaching unconditional forgiveness. Before you were even old enough to go to hell, I have been teaching the grace of God. Watch—read my lips: you will bear the consequences.' He did not do anything to me personally, but I said, 'Hear what I have said very well: when you are serving God, you do not joke.'</w:t>
+      </w:r>
+    </w:p>
+    <w:p>
+      <w:pPr>
+        <w:spacing w:before="80" w:after="80" w:line="276" w:lineRule="auto"/>
+      </w:pPr>
+      <w:r>
+        <w:rPr>
+          <w:rFonts w:ascii="Arial" w:hAnsi="Arial"/>
+          <w:sz w:val="24"/>
+        </w:rPr>
+        <w:t>God practically treasures lives. That is why Jesus said:</w:t>
+      </w:r>
+    </w:p>
+    <w:p>
+      <w:pPr>
+        <w:spacing w:before="160" w:after="40"/>
+      </w:pPr>
       <w:r>
         <w:rPr>
           <w:rFonts w:ascii="Arial" w:hAnsi="Arial"/>
@@ -649,56 +635,7 @@
           <w:i/>
           <w:sz w:val="24"/>
         </w:rPr>
-        <w:t>'Confidence in an unfaithful man in time of trouble is like a broken tooth, and a foot out of joint.'</w:t>
-      </w:r>
-      <w:r>
-        <w:rPr>
-          <w:rFonts w:ascii="Arial" w:hAnsi="Arial"/>
-          <w:sz w:val="24"/>
-        </w:rPr>
-        <w:t xml:space="preserve"> When an individual attempts to chew with a fractured tooth, the result is sharp agony and incapacity. When one attempts to walk on a dislocated foot, mobility collapses. In like manner, when an unfaithful individual occupies the office of a cell leader, department head, or pastor, their presence provides no functional support; when ministerial pressure arrives, they collapse, crippling the local assembly and inflicting agonizing hindrance upon the work of God.</w:t>
-      </w:r>
-    </w:p>
-    <w:p>
-      <w:pPr>
-        <w:spacing w:before="280" w:after="80"/>
-      </w:pPr>
-      <w:r>
-        <w:rPr>
-          <w:rFonts w:ascii="Arial" w:hAnsi="Arial"/>
-          <w:b/>
-          <w:sz w:val="24"/>
-        </w:rPr>
-        <w:t>The Eternal Weight of Ministerial Consequences: God's Value for Human Lives</w:t>
-      </w:r>
-    </w:p>
-    <w:p>
-      <w:pPr>
-        <w:spacing w:before="160" w:after="40"/>
-      </w:pPr>
-      <w:r>
-        <w:rPr>
-          <w:rFonts w:ascii="Arial" w:hAnsi="Arial"/>
-          <w:b/>
-          <w:i/>
-          <w:sz w:val="24"/>
-        </w:rPr>
-        <w:t>Luke 17:1-2</w:t>
-      </w:r>
-    </w:p>
-    <w:p>
-      <w:pPr>
-        <w:spacing w:before="20" w:after="20"/>
-        <w:ind w:left="360"/>
-      </w:pPr>
-      <w:r>
-        <w:rPr>
-          <w:rFonts w:ascii="Arial" w:hAnsi="Arial"/>
-          <w:b/>
-          <w:i/>
-          <w:sz w:val="24"/>
-        </w:rPr>
-        <w:t>[1] It is impossible but that offences will come: but woe unto him, through whom they come!</w:t>
+        <w:t>Luke 17:2</w:t>
       </w:r>
     </w:p>
     <w:p>
@@ -718,14 +655,15 @@
     </w:p>
     <w:p>
       <w:pPr>
-        <w:spacing w:before="80" w:after="80" w:line="276" w:lineRule="auto"/>
+        <w:spacing w:before="280" w:after="80"/>
       </w:pPr>
       <w:r>
         <w:rPr>
           <w:rFonts w:ascii="Arial" w:hAnsi="Arial"/>
+          <w:b/>
           <w:sz w:val="24"/>
         </w:rPr>
-        <w:t>Let every leader understand that ministerial service carries severe spiritual consequences. While believers rejoice in unconditional justification and the eternal grace of God, ministry is not a casual game. Anyone who asserts that ministerial negligence carries no consequences is sorely deceived.</w:t>
+        <w:t>God Practically Treasures Lives: The Casual Handling of Disciples</w:t>
       </w:r>
     </w:p>
     <w:p>
@@ -738,7 +676,56 @@
           <w:i/>
           <w:sz w:val="24"/>
         </w:rPr>
-        <w:t>There was an individual I warned last year: 'Read my lips: before you were born, I have been teaching unconditional forgiveness. Before you were ever in danger of hell, I have been teaching the grace of God. But hear me clearly—you will bear the consequences of your actions.' He had done nothing to me personally, but I gave him that sober warning because when serving God, one cannot joke. God places immense value upon human lives. That is why the Lord Jesus declared in Luke 17:1-2 that it were better for a heavy millstone to be fastened around a man's neck and he be cast into the depth of the sea than to cause one of His little ones to stumble.</w:t>
+        <w:t>Somebody from church came to me making plans to leave the country. I said, 'Okay, you want to leave the country—no problem. Have you thought about the people that you disciple?' He said, 'Oh, I was just thinking that since my pastor knows them...' You get to the US, the UK, or Canada, and you start to struggle in ministry, and you wonder why you are struggling. In Nigeria, you treated God's people like that! He said, 'My pastor should...' very casually. I said, 'No, you ought to have been thinking about these ones!'</w:t>
+      </w:r>
+    </w:p>
+    <w:p>
+      <w:pPr>
+        <w:spacing w:before="80" w:after="80" w:line="276" w:lineRule="auto"/>
+      </w:pPr>
+      <w:r>
+        <w:rPr>
+          <w:rFonts w:ascii="Arial" w:hAnsi="Arial"/>
+          <w:sz w:val="24"/>
+        </w:rPr>
+        <w:t>People feel that those things are just for Saints Community—just bring people, dump them in the service, and say, 'Yeah, we are changing lives,' until another natural opportunity changes them. No—one million times no! A leader cannot think outside those people. Whatever one does to lives is how God sees them.</w:t>
+      </w:r>
+    </w:p>
+    <w:p>
+      <w:pPr>
+        <w:spacing w:before="80" w:after="80" w:line="276" w:lineRule="auto"/>
+      </w:pPr>
+      <w:r>
+        <w:rPr>
+          <w:rFonts w:ascii="Arial" w:hAnsi="Arial"/>
+          <w:sz w:val="24"/>
+        </w:rPr>
+        <w:t>Lives are like treasure; lives are like money. Most who are cell leaders have twenty or thirty people under their care; some have forty or fifty; some fellowship leaders have more than that. And then for the same twenty people, the leader does not have time for them. The leader says, 'Well, the nature of my job, you know where I live.' Excuses enough for the Old Testament have been reeled out, while praying for increase!</w:t>
+      </w:r>
+    </w:p>
+    <w:p>
+      <w:pPr>
+        <w:spacing w:before="280" w:after="80"/>
+      </w:pPr>
+      <w:r>
+        <w:rPr>
+          <w:rFonts w:ascii="Arial" w:hAnsi="Arial"/>
+          <w:b/>
+          <w:sz w:val="24"/>
+        </w:rPr>
+        <w:t>Lives Are Like Money: The Akara Business Illustration</w:t>
+      </w:r>
+    </w:p>
+    <w:p>
+      <w:pPr>
+        <w:spacing w:before="80" w:after="80" w:line="276" w:lineRule="auto"/>
+      </w:pPr>
+      <w:r>
+        <w:rPr>
+          <w:rFonts w:ascii="Arial" w:hAnsi="Arial"/>
+          <w:sz w:val="24"/>
+        </w:rPr>
+        <w:t>How will increase come?</w:t>
       </w:r>
     </w:p>
     <w:p>
@@ -751,7 +738,82 @@
           <w:i/>
           <w:sz w:val="24"/>
         </w:rPr>
-        <w:t>A church member once approached me sharing plans to relocate abroad. When I inquired, 'Have you thought about the disciples committed to your care?' he replied with complete flippancy: 'Oh, I was just thinking that since my pastor knows them, the church will take care of them.' I told him: 'No! You ought to be deeply concerned about those lives!' People discard their pastoral responsibilities in Nigeria, arrive in North America or Europe, and then wonder why they encounter persistent frustration and sterility in ministry. They treated God's people like disposable commodities, dumping them into services without ongoing pastoral oversight until personal convenience dictated their departure. One cannot think outside the people God has entrusted to their hands.</w:t>
+        <w:t>Consider the example I gave yesterday: If you give somebody one hundred thousand naira to go and do business—to fry akara (akara is bean cake). The person is happy: 'Oh, you gave me 100k so I can fry akara!' Then two weeks, three weeks, one month passes. He starts sending text messages: 'Sorry, you know there is COVID, people are not really eating akara again because they are wearing masks.' Three weeks after: 'You know beans is now expensive.'</w:t>
+      </w:r>
+    </w:p>
+    <w:p>
+      <w:pPr>
+        <w:spacing w:before="80" w:after="80" w:line="276" w:lineRule="auto"/>
+      </w:pPr>
+      <w:r>
+        <w:rPr>
+          <w:rFonts w:ascii="Arial" w:hAnsi="Arial"/>
+          <w:i/>
+          <w:sz w:val="24"/>
+        </w:rPr>
+        <w:t>Where is the 100k? 'We cannot get the 100k back, but to the glory of God, in the next one year I can get you 20k back.' And then you come back at a convention saying, 'I want to get one million! We are changing lives!' Anybody that gives you fifty thousand naira is an idiot, because look at your track record! Ten souls were given to you, only one remains, and that one is your cousin—and you say you want more? More of what?</w:t>
+      </w:r>
+    </w:p>
+    <w:p>
+      <w:pPr>
+        <w:spacing w:before="80" w:after="80" w:line="276" w:lineRule="auto"/>
+      </w:pPr>
+      <w:r>
+        <w:rPr>
+          <w:rFonts w:ascii="Arial" w:hAnsi="Arial"/>
+          <w:sz w:val="24"/>
+        </w:rPr>
+        <w:t>Lives are like an investment. For every life, the person who preached the gospel invested, and that investment is in the flock. The person who saw to it that one grew in the Word was investing in lives they did not even know.</w:t>
+      </w:r>
+    </w:p>
+    <w:p>
+      <w:pPr>
+        <w:spacing w:before="80" w:after="80" w:line="276" w:lineRule="auto"/>
+      </w:pPr>
+      <w:r>
+        <w:rPr>
+          <w:rFonts w:ascii="Arial" w:hAnsi="Arial"/>
+          <w:sz w:val="24"/>
+        </w:rPr>
+        <w:t>Lives are like money. For every one person whose life is changed, other lives are being changed. Look at the reverse case: for every one person whose life is wasted, other lives are being wasted.</w:t>
+      </w:r>
+    </w:p>
+    <w:p>
+      <w:pPr>
+        <w:spacing w:before="80" w:after="80" w:line="276" w:lineRule="auto"/>
+      </w:pPr>
+      <w:r>
+        <w:rPr>
+          <w:rFonts w:ascii="Arial" w:hAnsi="Arial"/>
+          <w:sz w:val="24"/>
+        </w:rPr>
+        <w:t>Every day, give reports on what is done concerning lives. When a leader fails to do it daily and excuses it—'My data finished, there was no power'—a destructive path is being created.</w:t>
+      </w:r>
+    </w:p>
+    <w:p>
+      <w:pPr>
+        <w:spacing w:before="80" w:after="80" w:line="276" w:lineRule="auto"/>
+      </w:pPr>
+      <w:r>
+        <w:rPr>
+          <w:rFonts w:ascii="Arial" w:hAnsi="Arial"/>
+          <w:i/>
+          <w:sz w:val="24"/>
+        </w:rPr>
+        <w:t>If we were to say one thousand dollars per soul, there would be no street left uncovered—'covering the earth' would happen in one month! One thousand dollars: that means ten souls is ten thousand dollars. Immediately, the conversion rate is calculated. One hundred souls: 'Pastor, why can't we do Storm every day?' One hundred souls is one hundred thousand dollars—fifty million naira. Why wouldn't someone win one hundred souls a day? The excuse of being tired in the evening would vanish: 'I am not tired in Jesus! I have the strength of God! What useless sleep am I sleeping? I am for the Lord!' Why? Because money is attached. But those lives are money—they are expensive, very expensive.</w:t>
+      </w:r>
+    </w:p>
+    <w:p>
+      <w:pPr>
+        <w:spacing w:before="80" w:after="80" w:line="276" w:lineRule="auto"/>
+      </w:pPr>
+      <w:r>
+        <w:rPr>
+          <w:rFonts w:ascii="Arial" w:hAnsi="Arial"/>
+          <w:i/>
+          <w:sz w:val="24"/>
+        </w:rPr>
+        <w:t>Recently, I had this very troubling headache. Somebody in the room said, 'Pastor, rest.' I said, 'No. I know I should rest, but I will be fine. There is work to be done. I will look away from it and act like the Word of God is true. This job has to be done.'</w:t>
       </w:r>
     </w:p>
     <w:p>
@@ -764,7 +826,19 @@
           <w:b/>
           <w:sz w:val="24"/>
         </w:rPr>
-        <w:t>Lives as Divine Capital: The Akara Trader Analogy and the Soul-Winning Test</w:t>
+        <w:t>Faithful with Little: Success in Ministry Is Planned</w:t>
+      </w:r>
+    </w:p>
+    <w:p>
+      <w:pPr>
+        <w:spacing w:before="80" w:after="80" w:line="276" w:lineRule="auto"/>
+      </w:pPr>
+      <w:r>
+        <w:rPr>
+          <w:rFonts w:ascii="Arial" w:hAnsi="Arial"/>
+          <w:sz w:val="24"/>
+        </w:rPr>
+        <w:t>Jesus said:</w:t>
       </w:r>
     </w:p>
     <w:p>
@@ -778,7 +852,7 @@
           <w:i/>
           <w:sz w:val="24"/>
         </w:rPr>
-        <w:t>Luke 16:10-12</w:t>
+        <w:t>Luke 16:10</w:t>
       </w:r>
     </w:p>
     <w:p>
@@ -798,36 +872,6 @@
     </w:p>
     <w:p>
       <w:pPr>
-        <w:spacing w:before="20" w:after="20"/>
-        <w:ind w:left="360"/>
-      </w:pPr>
-      <w:r>
-        <w:rPr>
-          <w:rFonts w:ascii="Arial" w:hAnsi="Arial"/>
-          <w:b/>
-          <w:i/>
-          <w:sz w:val="24"/>
-        </w:rPr>
-        <w:t>[11] If therefore ye have not been faithful in the unrighteous mammon, who will commit to your trust the true riches?</w:t>
-      </w:r>
-    </w:p>
-    <w:p>
-      <w:pPr>
-        <w:spacing w:before="20" w:after="20"/>
-        <w:ind w:left="360"/>
-      </w:pPr>
-      <w:r>
-        <w:rPr>
-          <w:rFonts w:ascii="Arial" w:hAnsi="Arial"/>
-          <w:b/>
-          <w:i/>
-          <w:sz w:val="24"/>
-        </w:rPr>
-        <w:t>[12] And if ye have not been faithful in that which is another man's, who shall give you that which is your own?</w:t>
-      </w:r>
-    </w:p>
-    <w:p>
-      <w:pPr>
         <w:spacing w:before="80" w:after="80" w:line="276" w:lineRule="auto"/>
       </w:pPr>
       <w:r>
@@ -835,7 +879,7 @@
           <w:rFonts w:ascii="Arial" w:hAnsi="Arial"/>
           <w:sz w:val="24"/>
         </w:rPr>
-        <w:t>In the kingdom of God, human lives are spiritual currency. When God places ten, twenty, thirty, or fifty people under a cell leader's charge, He has entrusted that leader with capital of infinite eternal worth. Yet many leaders casually excuse numerical decline, citing secular employment, transit difficulties, or residential distance, while simultaneously offering empty prayers for church increase.</w:t>
+        <w:t>Who will commit much to your hands? Sometimes people look at numerically grown churches and think, 'It is because they are preaching false doctrine.' Go and try preaching false doctrine and let us see! Are there not people preaching false doctrine in your backyard? People think, 'It is because they are using oil and mantles.' That is not it! In many instances, you find people who are totally dedicated to what they are doing, totally given to it.</w:t>
       </w:r>
     </w:p>
     <w:p>
@@ -848,7 +892,7 @@
           <w:i/>
           <w:sz w:val="24"/>
         </w:rPr>
-        <w:t>Consider the practical illustration I shared yesterday: If you entrust an entrepreneur with one hundred thousand naira to trade and fry akara (bean cakes), and after weeks of silence he returns claiming, 'COVID came, people are wearing masks and not eating akara, beans are now expensive, and the entire principal is lost, but to the glory of God, I might recover twenty thousand naira over the next year'—would any prudent person commit a million naira into his hands? Anyone who gives him fifty thousand naira is an idiot! Look at his track record. Yet leaders present an identical track record before God: ten souls were committed to their cell, nine have vanished through negligence with only a personal cousin remaining, and yet they come to church conventions praying for increase! More of what? What increase can be committed to hands that squander divine investment?</w:t>
+        <w:t>My dad told me that success is planned. He said that when he got to school, because he knew his reading attention span was just one hour, he ensured that he read one hour five times a day. He cut short a lot of activities and he made a first class. He planned it.</w:t>
       </w:r>
     </w:p>
     <w:p>
@@ -860,19 +904,7 @@
           <w:rFonts w:ascii="Arial" w:hAnsi="Arial"/>
           <w:sz w:val="24"/>
         </w:rPr>
-        <w:t>Every soul under a leader's care represents the accumulated spiritual investment of those who went before—the evangelist who proclaimed the gospel, the pastor who taught, and the intercessors who labored. For every soul a leader edifies and preserves, a generational lineage of disciples is impacted. Conversely, for every soul a leader neglects and loses, a branch of the kingdom's harvest is severed. When cell leaders fail to submit daily reports and offer trite excuses about depleted data or power outages, they demonstrate disregard for divine capital.</w:t>
-      </w:r>
-    </w:p>
-    <w:p>
-      <w:pPr>
-        <w:spacing w:before="80" w:after="80" w:line="276" w:lineRule="auto"/>
-      </w:pPr>
-      <w:r>
-        <w:rPr>
-          <w:rFonts w:ascii="Arial" w:hAnsi="Arial"/>
-          <w:sz w:val="24"/>
-        </w:rPr>
-        <w:t>Expose the hypocrisy of natural motivation: if church leadership were to announce a financial compensation of one thousand dollars for every soul won and successfully integrated into the local assembly, streets would be covered within a month! For ten souls, a leader would receive ten thousand dollars; for one hundred souls, one hundred thousand dollars. Complaints of evening fatigue would vanish instantly; leaders would claim divine strength, eliminate unnecessary sleep, and hold continuous outreaches because monetary gain is in view. Yet the eternal value of a single human life bought by the blood of Christ infinitely surpasses earthly wealth.</w:t>
+        <w:t>In the same way, ministry cannot just grow because one is praying. Praying while doing the exact opposite is like having bullets and no gun to shoot them. The prayer is the ammunition, but it is not being utilized through practical execution.</w:t>
       </w:r>
     </w:p>
     <w:p>
@@ -885,7 +917,19 @@
           <w:i/>
           <w:sz w:val="24"/>
         </w:rPr>
-        <w:t>Recently, I experienced a severe, troubling headache. Someone in the room urged: 'Pastor, you need to rest.' I replied: 'No. I know I should rest, but there is work to be done. I will look away from physical symptoms and act like the Word of God is true. The job has to be done.' Souls are precious; their value demands unwavering consecration.</w:t>
+        <w:t>I told the pastors that for every soul that comes to our conventions—while we may not be able to account for those from other churches—we must give account of each one of ours. If we do not learn to do it with ten thousand, we will not be able to do it with one hundred thousand or one million. We must show accountability.</w:t>
+      </w:r>
+    </w:p>
+    <w:p>
+      <w:pPr>
+        <w:spacing w:before="80" w:after="80" w:line="276" w:lineRule="auto"/>
+      </w:pPr>
+      <w:r>
+        <w:rPr>
+          <w:rFonts w:ascii="Arial" w:hAnsi="Arial"/>
+          <w:sz w:val="24"/>
+        </w:rPr>
+        <w:t>Faithfulness is the breath of ministry: always being at one's duty post. The holiday period is not a holiday for ministry. No, it is not!</w:t>
       </w:r>
     </w:p>
     <w:p>
@@ -898,48 +942,7 @@
           <w:b/>
           <w:sz w:val="24"/>
         </w:rPr>
-        <w:t>Success in Ministry Is Planned: Dedication, Structure, and Ministerial Alertness</w:t>
-      </w:r>
-    </w:p>
-    <w:p>
-      <w:pPr>
-        <w:spacing w:before="160" w:after="40"/>
-      </w:pPr>
-      <w:r>
-        <w:rPr>
-          <w:rFonts w:ascii="Arial" w:hAnsi="Arial"/>
-          <w:b/>
-          <w:i/>
-          <w:sz w:val="24"/>
-        </w:rPr>
-        <w:t>1 Corinthians 9:26</w:t>
-      </w:r>
-    </w:p>
-    <w:p>
-      <w:pPr>
-        <w:spacing w:before="20" w:after="20"/>
-        <w:ind w:left="360"/>
-      </w:pPr>
-      <w:r>
-        <w:rPr>
-          <w:rFonts w:ascii="Arial" w:hAnsi="Arial"/>
-          <w:b/>
-          <w:i/>
-          <w:sz w:val="24"/>
-        </w:rPr>
-        <w:t>[26] I therefore so run, not as uncertainly; so fight I, not as one that beateth the air.</w:t>
-      </w:r>
-    </w:p>
-    <w:p>
-      <w:pPr>
-        <w:spacing w:before="80" w:after="80" w:line="276" w:lineRule="auto"/>
-      </w:pPr>
-      <w:r>
-        <w:rPr>
-          <w:rFonts w:ascii="Arial" w:hAnsi="Arial"/>
-          <w:sz w:val="24"/>
-        </w:rPr>
-        <w:t>Ministers frequently make the erroneous assumption that numerical growth in other assemblies is merely the byproduct of false doctrine, sensationalism, or theatrical gimmicks like mantles and holy oil. That is completely false. In many instances, those assemblies expand because their leaders are totally dedicated, exceptionally hardworking, and administratively disciplined. Erroneous doctrine in itself does not gather people; discipline and labor do.</w:t>
+        <w:t>Always at the Duty Post: No Holidays from Ministry</w:t>
       </w:r>
     </w:p>
     <w:p>
@@ -952,31 +955,7 @@
           <w:i/>
           <w:sz w:val="24"/>
         </w:rPr>
-        <w:t>My father taught me that success in any endeavor is deliberate and planned. When he recognized that his natural reading attention span did not exceed one hour, he did not surrender to mediocrity. Instead, he structured his day into five distinct one-hour study blocks separated by rest, eliminated extraneous social activities, and graduated with first-class honors. Spiritual ministry operates by the very same principle. A cell group or local assembly will never flourish merely because a leader offers fervent prayers while neglecting practical execution. Praying without disciplined pastoral planning is like stockpiling ammunition in an armory without possessing a firearm to discharge it.</w:t>
-      </w:r>
-    </w:p>
-    <w:p>
-      <w:pPr>
-        <w:spacing w:before="80" w:after="80" w:line="276" w:lineRule="auto"/>
-      </w:pPr>
-      <w:r>
-        <w:rPr>
-          <w:rFonts w:ascii="Arial" w:hAnsi="Arial"/>
-          <w:sz w:val="24"/>
-        </w:rPr>
-        <w:t>Accountability must begin at the smallest scale. If a leadership core cannot meticulously track, follow up, and account for attendees at a convention, it is completely incapacitated from overseeing tens of thousands or hundreds of thousands of souls. Faithfulness is the foundational breath of ministry: it requires an unbroken presence at one's duty post.</w:t>
-      </w:r>
-    </w:p>
-    <w:p>
-      <w:pPr>
-        <w:spacing w:before="80" w:after="80" w:line="276" w:lineRule="auto"/>
-      </w:pPr>
-      <w:r>
-        <w:rPr>
-          <w:rFonts w:ascii="Arial" w:hAnsi="Arial"/>
-          <w:sz w:val="24"/>
-        </w:rPr>
-        <w:t>Furthermore, the pastoral calling recognizes no secular vacations. Holidays declared by civil government are not holidays from the work of the ministry. While temporal employees pause work, the spiritual steward recognizes that human needs, demonic pressures, and pastoral oversights operate continuously.</w:t>
+        <w:t>A holiday from the government is not a gift. If you are a businessman and took credit from the bank, interest runs on the holiday while you are praying on Sunday morning! How much more in ministry?</w:t>
       </w:r>
     </w:p>
     <w:p>
@@ -989,7 +968,32 @@
           <w:i/>
           <w:sz w:val="24"/>
         </w:rPr>
-        <w:t>One Christmas Day, returning from the United States via Dallas, I had an extended conversation with Brother Pelumi and missed my flight due to casual inattention. Later, observing from the airplane, I noticed airport security working, planes flying, air traffic controllers directing flights without singing holiday carols, emergency physicians on call delivering babies on Christmas Day, and police officers inspecting vehicle trunks while wishing motorists a Merry Christmas. Operations were continuing around the clock. I told myself: 'I am a preacher of the eternal gospel; I must maintain unyielding spiritual alertness.' Faithful leaders must be faithful with time and alertness in the execution of their duties.</w:t>
+        <w:t>One day I was coming back from the US on Christmas Day. I was in Dallas and Brother Pelumi was hosting me. Somehow we got talking and hugging, and I missed my flight. (I did that with Femi Adetimobi too at the airport).</w:t>
+      </w:r>
+    </w:p>
+    <w:p>
+      <w:pPr>
+        <w:spacing w:before="80" w:after="80" w:line="276" w:lineRule="auto"/>
+      </w:pPr>
+      <w:r>
+        <w:rPr>
+          <w:rFonts w:ascii="Arial" w:hAnsi="Arial"/>
+          <w:i/>
+          <w:sz w:val="24"/>
+        </w:rPr>
+        <w:t>On Christmas Day, on the plane, I made observations: security personnel were working, planes were operating, air traffic controllers were directing planes without singing 'Jingle Bells.' Doctors were working on call on Christmas Day. Babies were being born on Christmas Day, and doctors were on duty. The police were saying, 'Merry Christmas, please let me check your car boot.' Everybody was working around the clock. So I told myself: 'I am a preacher of the gospel; I must be alert.'</w:t>
+      </w:r>
+    </w:p>
+    <w:p>
+      <w:pPr>
+        <w:spacing w:before="80" w:after="80" w:line="276" w:lineRule="auto"/>
+      </w:pPr>
+      <w:r>
+        <w:rPr>
+          <w:rFonts w:ascii="Arial" w:hAnsi="Arial"/>
+          <w:sz w:val="24"/>
+        </w:rPr>
+        <w:t>One must be faithful with time, faithful with alertness in the things committed to them.</w:t>
       </w:r>
     </w:p>
     <w:p>
@@ -1002,51 +1006,7 @@
           <w:b/>
           <w:sz w:val="24"/>
         </w:rPr>
-        <w:t>Proving and Testing: The Biblical Ecclesiastical Statute for Leadership</w:t>
-      </w:r>
-    </w:p>
-    <w:p>
-      <w:pPr>
-        <w:spacing w:before="160" w:after="40"/>
-      </w:pPr>
-      <w:r>
-        <w:rPr>
-          <w:rFonts w:ascii="Arial" w:hAnsi="Arial"/>
-          <w:b/>
-          <w:i/>
-          <w:sz w:val="24"/>
-        </w:rPr>
-        <w:t>1 Samuel 16:6-7</w:t>
-      </w:r>
-    </w:p>
-    <w:p>
-      <w:pPr>
-        <w:spacing w:before="20" w:after="20"/>
-        <w:ind w:left="360"/>
-      </w:pPr>
-      <w:r>
-        <w:rPr>
-          <w:rFonts w:ascii="Arial" w:hAnsi="Arial"/>
-          <w:b/>
-          <w:i/>
-          <w:sz w:val="24"/>
-        </w:rPr>
-        <w:t>[6] And it came to pass, when they were come, that he looked on Eliab, and said, Surely the LORD'S anointed is before him.</w:t>
-      </w:r>
-    </w:p>
-    <w:p>
-      <w:pPr>
-        <w:spacing w:before="20" w:after="20"/>
-        <w:ind w:left="360"/>
-      </w:pPr>
-      <w:r>
-        <w:rPr>
-          <w:rFonts w:ascii="Arial" w:hAnsi="Arial"/>
-          <w:b/>
-          <w:i/>
-          <w:sz w:val="24"/>
-        </w:rPr>
-        <w:t>[7] But the LORD said unto Samuel, Look not on his countenance, or on the height of his stature; because I have refused him: for the LORD seeth not as man seeth; for man looketh on the outward appearance, but the LORD looketh on the heart.</w:t>
+        <w:t>Testing and Proving: Let These Also First Be Proved</w:t>
       </w:r>
     </w:p>
     <w:p>
@@ -1058,22 +1018,19 @@
           <w:rFonts w:ascii="Arial" w:hAnsi="Arial"/>
           <w:sz w:val="24"/>
         </w:rPr>
-        <w:t>God does not commit spiritual authority to untested vessels. When the prophet Samuel arrived to anoint a king in Bethlehem (</w:t>
+        <w:t>Things will come to test that one is faithful. Remember when Eliab was to be anointed by Samuel in 1 Samuel 16? Samuel said, 'Surely the Lord's anointed is before me.' But the Lord said, 'No, it is not Eliab; I have rejected him.' The Hebrew carries the force of someone who failed the test.</w:t>
       </w:r>
-      <w:r>
-        <w:rPr>
-          <w:rFonts w:ascii="Arial" w:hAnsi="Arial"/>
-          <w:b/>
-          <w:sz w:val="24"/>
-        </w:rPr>
-        <w:t>1 Samuel 16:6-7</w:t>
-      </w:r>
+    </w:p>
+    <w:p>
+      <w:pPr>
+        <w:spacing w:before="80" w:after="80" w:line="276" w:lineRule="auto"/>
+      </w:pPr>
       <w:r>
         <w:rPr>
           <w:rFonts w:ascii="Arial" w:hAnsi="Arial"/>
           <w:sz w:val="24"/>
         </w:rPr>
-        <w:t>), he looked upon Eliab's commanding physical stature and concluded that the Lord's anointed stood before him. But the Lord rejected Eliab, declaring that man looks on the outward appearance, but God looks upon the heart. In the original Hebrew, the term for rejection carries the force of one who has failed the moral examination. Divine testing is not designed to orchestrate human destruction; rather, it is akin to test-driving a newly engineered machine to demonstrate its structural integrity.</w:t>
+        <w:t>One never knows when the test comes. God tests people—not so that they fail, but the way one test-drives a car. Look at what He said about Job: 'Have you considered My servant Job?' What a boast! He has integrity.</w:t>
       </w:r>
     </w:p>
     <w:p>
@@ -1144,8 +1101,25 @@
           <w:rFonts w:ascii="Arial" w:hAnsi="Arial"/>
           <w:sz w:val="24"/>
         </w:rPr>
-        <w:t xml:space="preserve">God boasted of Job's integrity: </w:t>
+        <w:t>When one runs from tests, one runs from the character required to do the work of the ministry.</w:t>
       </w:r>
+    </w:p>
+    <w:p>
+      <w:pPr>
+        <w:spacing w:before="80" w:after="80" w:line="276" w:lineRule="auto"/>
+      </w:pPr>
+      <w:r>
+        <w:rPr>
+          <w:rFonts w:ascii="Arial" w:hAnsi="Arial"/>
+          <w:sz w:val="24"/>
+        </w:rPr>
+        <w:t>In 1 Timothy chapter 3, Paul writes concerning deacons—the associates of the pastor:</w:t>
+      </w:r>
+    </w:p>
+    <w:p>
+      <w:pPr>
+        <w:spacing w:before="160" w:after="40"/>
+      </w:pPr>
       <w:r>
         <w:rPr>
           <w:rFonts w:ascii="Arial" w:hAnsi="Arial"/>
@@ -1153,15 +1127,14 @@
           <w:i/>
           <w:sz w:val="24"/>
         </w:rPr>
-        <w:t>'Hast thou considered my servant Job, that there is none like him in the earth?'</w:t>
+        <w:t>1 Timothy 3:13</w:t>
       </w:r>
-      <w:r>
-        <w:rPr>
-          <w:rFonts w:ascii="Arial" w:hAnsi="Arial"/>
-          <w:sz w:val="24"/>
-        </w:rPr>
-        <w:t xml:space="preserve"> When trials confront the minister, James instructs that it should be received with joy, knowing that the trial of faith produces steadfast patience (</w:t>
-      </w:r>
+    </w:p>
+    <w:p>
+      <w:pPr>
+        <w:spacing w:before="20" w:after="20"/>
+        <w:ind w:left="360"/>
+      </w:pPr>
       <w:r>
         <w:rPr>
           <w:rFonts w:ascii="Arial" w:hAnsi="Arial"/>
@@ -1169,14 +1142,7 @@
           <w:i/>
           <w:sz w:val="24"/>
         </w:rPr>
-        <w:t>hypomone</w:t>
-      </w:r>
-      <w:r>
-        <w:rPr>
-          <w:rFonts w:ascii="Arial" w:hAnsi="Arial"/>
-          <w:sz w:val="24"/>
-        </w:rPr>
-        <w:t>), maturing the believer until they lack nothing. Running from divine tests is running from the very character required to fulfill the ministry.</w:t>
+        <w:t>[13] For they that have used the office of a deacon well purchase to themselves a good degree, and great boldness in the faith which is in Christ Jesus.</w:t>
       </w:r>
     </w:p>
     <w:p>
@@ -1190,7 +1156,7 @@
           <w:i/>
           <w:sz w:val="24"/>
         </w:rPr>
-        <w:t>1 Timothy 3:10, 13</w:t>
+        <w:t>1 Timothy 3:10</w:t>
       </w:r>
     </w:p>
     <w:p>
@@ -1210,21 +1176,6 @@
     </w:p>
     <w:p>
       <w:pPr>
-        <w:spacing w:before="20" w:after="20"/>
-        <w:ind w:left="360"/>
-      </w:pPr>
-      <w:r>
-        <w:rPr>
-          <w:rFonts w:ascii="Arial" w:hAnsi="Arial"/>
-          <w:b/>
-          <w:i/>
-          <w:sz w:val="24"/>
-        </w:rPr>
-        <w:t>[13] For they that have used the office of a deacon well purchase to themselves a good degree, and great boldness in the faith which is in Christ Jesus.</w:t>
-      </w:r>
-    </w:p>
-    <w:p>
-      <w:pPr>
         <w:spacing w:before="80" w:after="80" w:line="276" w:lineRule="auto"/>
       </w:pPr>
       <w:r>
@@ -1232,53 +1183,7 @@
           <w:rFonts w:ascii="Arial" w:hAnsi="Arial"/>
           <w:sz w:val="24"/>
         </w:rPr>
-        <w:t xml:space="preserve">In </w:t>
-      </w:r>
-      <w:r>
-        <w:rPr>
-          <w:rFonts w:ascii="Arial" w:hAnsi="Arial"/>
-          <w:b/>
-          <w:sz w:val="24"/>
-        </w:rPr>
-        <w:t>1 Timothy 3:10</w:t>
-      </w:r>
-      <w:r>
-        <w:rPr>
-          <w:rFonts w:ascii="Arial" w:hAnsi="Arial"/>
-          <w:sz w:val="24"/>
-        </w:rPr>
-        <w:t xml:space="preserve">, the Apostle Paul establishes a mandatory ecclesiastical statute: </w:t>
-      </w:r>
-      <w:r>
-        <w:rPr>
-          <w:rFonts w:ascii="Arial" w:hAnsi="Arial"/>
-          <w:b/>
-          <w:sz w:val="24"/>
-        </w:rPr>
-        <w:t>let these also first be proved</w:t>
-      </w:r>
-      <w:r>
-        <w:rPr>
-          <w:rFonts w:ascii="Arial" w:hAnsi="Arial"/>
-          <w:sz w:val="24"/>
-        </w:rPr>
-        <w:t xml:space="preserve">. The term translated 'proved' is the Greek verb </w:t>
-      </w:r>
-      <w:r>
-        <w:rPr>
-          <w:rFonts w:ascii="Arial" w:hAnsi="Arial"/>
-          <w:b/>
-          <w:i/>
-          <w:sz w:val="24"/>
-        </w:rPr>
-        <w:t>dokimazo</w:t>
-      </w:r>
-      <w:r>
-        <w:rPr>
-          <w:rFonts w:ascii="Arial" w:hAnsi="Arial"/>
-          <w:sz w:val="24"/>
-        </w:rPr>
-        <w:t>, meaning to scrutinize, examine closely, and test thoroughly as metal in a furnace. Notice that Paul does not instruct Timothy to wait for a mystical sign from heaven; rather, human leadership is commanded to actively test and observe prospective workers. A leader must possess discerning eyes to assess individuals' character under pressure, their punctuality, their submission to instruction, and their dependability.</w:t>
+        <w:t>Let them be examined closely, tested thoroughly. Who does the proving? Does Paul say the Spirit of God will prove them? No—the leader will do it! In leadership, one opens their eyes to know people and their true character.</w:t>
       </w:r>
     </w:p>
     <w:p>
@@ -1319,38 +1224,25 @@
           <w:rFonts w:ascii="Arial" w:hAnsi="Arial"/>
           <w:sz w:val="24"/>
         </w:rPr>
-        <w:t xml:space="preserve">Paul reinforces this standard in </w:t>
+        <w:t>'Approved' is the same word: tested—a tested workman. A leader cannot be untested.</w:t>
       </w:r>
-      <w:r>
-        <w:rPr>
-          <w:rFonts w:ascii="Arial" w:hAnsi="Arial"/>
-          <w:b/>
-          <w:sz w:val="24"/>
-        </w:rPr>
-        <w:t>2 Timothy 2:15</w:t>
-      </w:r>
+    </w:p>
+    <w:p>
+      <w:pPr>
+        <w:spacing w:before="80" w:after="80" w:line="276" w:lineRule="auto"/>
+      </w:pPr>
       <w:r>
         <w:rPr>
           <w:rFonts w:ascii="Arial" w:hAnsi="Arial"/>
           <w:sz w:val="24"/>
         </w:rPr>
-        <w:t xml:space="preserve">: the minister must labor to present themselves </w:t>
+        <w:t>When the apostles in Acts 15 were going to send Paul and Barnabas to the Gentile churches:</w:t>
       </w:r>
-      <w:r>
-        <w:rPr>
-          <w:rFonts w:ascii="Arial" w:hAnsi="Arial"/>
-          <w:b/>
-          <w:sz w:val="24"/>
-        </w:rPr>
-        <w:t>approved unto God</w:t>
-      </w:r>
-      <w:r>
-        <w:rPr>
-          <w:rFonts w:ascii="Arial" w:hAnsi="Arial"/>
-          <w:sz w:val="24"/>
-        </w:rPr>
-        <w:t xml:space="preserve">. The word 'approved' is </w:t>
-      </w:r>
+    </w:p>
+    <w:p>
+      <w:pPr>
+        <w:spacing w:before="160" w:after="40"/>
+      </w:pPr>
       <w:r>
         <w:rPr>
           <w:rFonts w:ascii="Arial" w:hAnsi="Arial"/>
@@ -1358,43 +1250,7 @@
           <w:i/>
           <w:sz w:val="24"/>
         </w:rPr>
-        <w:t>dokimos</w:t>
-      </w:r>
-      <w:r>
-        <w:rPr>
-          <w:rFonts w:ascii="Arial" w:hAnsi="Arial"/>
-          <w:sz w:val="24"/>
-        </w:rPr>
-        <w:t>—a certified, thoroughly tested workman who stands unashamed. Untested leadership is an ecclesiastical catastrophe.</w:t>
-      </w:r>
-    </w:p>
-    <w:p>
-      <w:pPr>
-        <w:spacing w:before="160" w:after="40"/>
-      </w:pPr>
-      <w:r>
-        <w:rPr>
-          <w:rFonts w:ascii="Arial" w:hAnsi="Arial"/>
-          <w:b/>
-          <w:i/>
-          <w:sz w:val="24"/>
-        </w:rPr>
-        <w:t>Acts 15:25-26</w:t>
-      </w:r>
-    </w:p>
-    <w:p>
-      <w:pPr>
-        <w:spacing w:before="20" w:after="20"/>
-        <w:ind w:left="360"/>
-      </w:pPr>
-      <w:r>
-        <w:rPr>
-          <w:rFonts w:ascii="Arial" w:hAnsi="Arial"/>
-          <w:b/>
-          <w:i/>
-          <w:sz w:val="24"/>
-        </w:rPr>
-        <w:t>[25] It seemed good unto us, being assembled with one accord, to send chosen men unto you with our beloved Barnabas and Paul,</w:t>
+        <w:t>Acts 15:26</w:t>
       </w:r>
     </w:p>
     <w:p>
@@ -1421,38 +1277,93 @@
           <w:rFonts w:ascii="Arial" w:hAnsi="Arial"/>
           <w:sz w:val="24"/>
         </w:rPr>
-        <w:t>When the apostles in Jerusalem dispatched representatives to the Gentile assemblies (</w:t>
+        <w:t>They knew they had been proven. They put everything on the table. The apostles said, 'We know these men; we have seen them through hard times. They are not fair-weather men; listen to them.'</w:t>
       </w:r>
+    </w:p>
+    <w:p>
+      <w:pPr>
+        <w:spacing w:before="80" w:after="80" w:line="276" w:lineRule="auto"/>
+      </w:pPr>
+      <w:r>
+        <w:rPr>
+          <w:rFonts w:ascii="Arial" w:hAnsi="Arial"/>
+          <w:i/>
+          <w:sz w:val="24"/>
+        </w:rPr>
+        <w:t>There are people who joined this church and ran away. Why? They were trying to get visibility. Even if you were an Archbishop where you came from, pocket it at the door when you arrive here! Join membership class. We will test you with the Operations department, then Works, then Security. Those who were singing were assigned to Operations to watch toilets!</w:t>
+      </w:r>
+    </w:p>
+    <w:p>
+      <w:pPr>
+        <w:spacing w:before="80" w:after="80" w:line="276" w:lineRule="auto"/>
+      </w:pPr>
+      <w:r>
+        <w:rPr>
+          <w:rFonts w:ascii="Arial" w:hAnsi="Arial"/>
+          <w:sz w:val="24"/>
+        </w:rPr>
+        <w:t>People must be proven. Did one come to have a position, or to serve? If one came to serve, anywhere they are placed, they will serve.</w:t>
+      </w:r>
+    </w:p>
+    <w:p>
+      <w:pPr>
+        <w:spacing w:before="280" w:after="80"/>
+      </w:pPr>
       <w:r>
         <w:rPr>
           <w:rFonts w:ascii="Arial" w:hAnsi="Arial"/>
           <w:b/>
           <w:sz w:val="24"/>
         </w:rPr>
-        <w:t>Acts 15:25-26</w:t>
+        <w:t>Joseph vs. Gehazi: Integrity Across Circumstances</w:t>
       </w:r>
+    </w:p>
+    <w:p>
+      <w:pPr>
+        <w:spacing w:before="80" w:after="80" w:line="276" w:lineRule="auto"/>
+      </w:pPr>
       <w:r>
         <w:rPr>
           <w:rFonts w:ascii="Arial" w:hAnsi="Arial"/>
           <w:sz w:val="24"/>
         </w:rPr>
-        <w:t xml:space="preserve">), their commendation was unequivocal: </w:t>
+        <w:t>When people are tested, they emerge either as a Joseph or as a Gehazi.</w:t>
       </w:r>
-      <w:r>
-        <w:rPr>
-          <w:rFonts w:ascii="Arial" w:hAnsi="Arial"/>
-          <w:b/>
-          <w:i/>
-          <w:sz w:val="24"/>
-        </w:rPr>
-        <w:t>'Men that have hazarded their lives for the name of our Lord Jesus Christ.'</w:t>
-      </w:r>
+    </w:p>
+    <w:p>
+      <w:pPr>
+        <w:spacing w:before="80" w:after="80" w:line="276" w:lineRule="auto"/>
+      </w:pPr>
       <w:r>
         <w:rPr>
           <w:rFonts w:ascii="Arial" w:hAnsi="Arial"/>
           <w:sz w:val="24"/>
         </w:rPr>
-        <w:t xml:space="preserve"> These were not fair-weather enthusiasts; their commitment had been demonstrated through persecution, sacrifice, and adversity.</w:t>
+        <w:t>Joseph was faithful as the father's favorite son. When he was sold as a slave into Potiphar's house, no circumstance changed him. He was faithful, and Potiphar committed the whole house into his hands. When Potiphar's wife tested him, saying her husband would not know, Joseph said, 'How can I sin against God?' She pressed him repeatedly, and eventually defamed him.</w:t>
+      </w:r>
+    </w:p>
+    <w:p>
+      <w:pPr>
+        <w:spacing w:before="80" w:after="80" w:line="276" w:lineRule="auto"/>
+      </w:pPr>
+      <w:r>
+        <w:rPr>
+          <w:rFonts w:ascii="Arial" w:hAnsi="Arial"/>
+          <w:sz w:val="24"/>
+        </w:rPr>
+        <w:t>He arrived in prison and did not grumble or say, 'After serving God, look at what happened; let me plan a prison escape.' In prison, when the butler and baker had dreams, he was not bitter, saying, 'Is it not dreams that got me here? I am not ready for all this ministry nonsense.' No—he simply interpreted the dreams. Faithful! And when the butler forgot him, he did not grumble.</w:t>
+      </w:r>
+    </w:p>
+    <w:p>
+      <w:pPr>
+        <w:spacing w:before="80" w:after="80" w:line="276" w:lineRule="auto"/>
+      </w:pPr>
+      <w:r>
+        <w:rPr>
+          <w:rFonts w:ascii="Arial" w:hAnsi="Arial"/>
+          <w:sz w:val="24"/>
+        </w:rPr>
+        <w:t>If one is going to handle a nation, one must know how to handle trouble. When summoned before Pharaoh, Joseph did not set conditions: 'First, you must release me; second, execute the woman who lied against me; third, send me home.' He simply gave the interpretation and said God would give Pharaoh an answer of peace. Pharaoh recognized that the Spirit of God was in him, and placed him in charge of the entire nation.</w:t>
       </w:r>
     </w:p>
     <w:p>
@@ -1465,49 +1376,7 @@
           <w:i/>
           <w:sz w:val="24"/>
         </w:rPr>
-        <w:t>Certain individuals join a local church seeking rapid prominence, platforms, or ordination. When individuals arrive boasting of previous titles—even if they were an archbishop elsewhere—they must pocket the title at the door, attend membership classes, and be tested in Operations, Works, and Security. Those who came desiring only to sing in the choir were assigned to clean and watch the toilets. True servants count it an honor to serve anywhere they are placed; those motivated by carnal ambition flee when handed a mop or instructed to assist in menial tasks.</w:t>
-      </w:r>
-    </w:p>
-    <w:p>
-      <w:pPr>
-        <w:spacing w:before="280" w:after="80"/>
-      </w:pPr>
-      <w:r>
-        <w:rPr>
-          <w:rFonts w:ascii="Arial" w:hAnsi="Arial"/>
-          <w:b/>
-          <w:sz w:val="24"/>
-        </w:rPr>
-        <w:t>Joseph vs. Gehazi: Integrity Under Pressure vs. Covetous Compromise</w:t>
-      </w:r>
-    </w:p>
-    <w:p>
-      <w:pPr>
-        <w:spacing w:before="160" w:after="40"/>
-      </w:pPr>
-      <w:r>
-        <w:rPr>
-          <w:rFonts w:ascii="Arial" w:hAnsi="Arial"/>
-          <w:b/>
-          <w:i/>
-          <w:sz w:val="24"/>
-        </w:rPr>
-        <w:t>Genesis 39:9</w:t>
-      </w:r>
-    </w:p>
-    <w:p>
-      <w:pPr>
-        <w:spacing w:before="20" w:after="20"/>
-        <w:ind w:left="360"/>
-      </w:pPr>
-      <w:r>
-        <w:rPr>
-          <w:rFonts w:ascii="Arial" w:hAnsi="Arial"/>
-          <w:b/>
-          <w:i/>
-          <w:sz w:val="24"/>
-        </w:rPr>
-        <w:t>[9] There is none greater in this house than I; neither hath he kept back any thing from me but thee, because thou art his wife: how then can I do this great wickedness, and sin against God?</w:t>
+        <w:t>He was now in charge of the whole nation, including Potiphar's household. When Potiphar's wife came for rations, Joseph did not seek vengeance; he provided food and let her go.</w:t>
       </w:r>
     </w:p>
     <w:p>
@@ -1519,50 +1388,7 @@
           <w:rFonts w:ascii="Arial" w:hAnsi="Arial"/>
           <w:sz w:val="24"/>
         </w:rPr>
-        <w:t xml:space="preserve">When testing arrives, leaders invariably emerge as either a </w:t>
-      </w:r>
-      <w:r>
-        <w:rPr>
-          <w:rFonts w:ascii="Arial" w:hAnsi="Arial"/>
-          <w:b/>
-          <w:sz w:val="24"/>
-        </w:rPr>
-        <w:t>Joseph or a Gehazi</w:t>
-      </w:r>
-      <w:r>
-        <w:rPr>
-          <w:rFonts w:ascii="Arial" w:hAnsi="Arial"/>
-          <w:sz w:val="24"/>
-        </w:rPr>
-        <w:t xml:space="preserve">. Joseph exemplified unwavering faithfulness across every station of life. In Canaan, he was his father's favored son; yet when cast into slavery in Potiphar's house, his diligence was so conspicuous that Potiphar committed the entire estate into his hands. When Potiphar's wife repeatedly solicited him to commit adultery, Joseph refused to compromise, asserting: </w:t>
-      </w:r>
-      <w:r>
-        <w:rPr>
-          <w:rFonts w:ascii="Arial" w:hAnsi="Arial"/>
-          <w:b/>
-          <w:i/>
-          <w:sz w:val="24"/>
-        </w:rPr>
-        <w:t>'How then can I do this great wickedness, and sin against God?'</w:t>
-      </w:r>
-      <w:r>
-        <w:rPr>
-          <w:rFonts w:ascii="Arial" w:hAnsi="Arial"/>
-          <w:sz w:val="24"/>
-        </w:rPr>
-        <w:t xml:space="preserve"> He fled the trap, leaving his garment behind.</w:t>
-      </w:r>
-    </w:p>
-    <w:p>
-      <w:pPr>
-        <w:spacing w:before="80" w:after="80" w:line="276" w:lineRule="auto"/>
-      </w:pPr>
-      <w:r>
-        <w:rPr>
-          <w:rFonts w:ascii="Arial" w:hAnsi="Arial"/>
-          <w:sz w:val="24"/>
-        </w:rPr>
-        <w:t>Falsely accused and thrown into Pharaoh's dungeon, Joseph did not collapse into self-pity, bitterness, or rebellion against God. Instead, he maintained his spiritual sensitivity, interpreting the prophetic dreams of the baker and the butler. When forgotten for two full years, he harbored no resentment. When summoned before Pharaoh, he did not negotiate terms, demand compensation for false imprisonment, or seek the execution of Potiphar's wife. He stood before the monarch with pure theological clarity, declaring that God would give Pharaoh an answer of peace.</w:t>
+        <w:t>When the brothers came after their father died, they were afraid and conjured up a message claiming their father asked Joseph to forgive them. Joseph wept and said:</w:t>
       </w:r>
     </w:p>
     <w:p>
@@ -1603,67 +1429,19 @@
           <w:rFonts w:ascii="Arial" w:hAnsi="Arial"/>
           <w:sz w:val="24"/>
         </w:rPr>
-        <w:t xml:space="preserve">When exalted to govern Egypt, Joseph administered food to the nation, extending provision even to Potiphar's household without vindictiveness. When his brothers arrived trembling after Jacob's death, manufacturing an apologetic message out of fear, Joseph wept and comforted them, revealing the character of Christ: </w:t>
+        <w:t>See the character of Jesus Christ. That is faithfulness. No circumstance changes a faithful man.</w:t>
       </w:r>
-      <w:r>
-        <w:rPr>
-          <w:rFonts w:ascii="Arial" w:hAnsi="Arial"/>
-          <w:b/>
-          <w:i/>
-          <w:sz w:val="24"/>
-        </w:rPr>
-        <w:t>'Fear not: for am I in the place of God? But as for you, ye thought evil against me; but God meant it unto good.'</w:t>
-      </w:r>
+    </w:p>
+    <w:p>
+      <w:pPr>
+        <w:spacing w:before="80" w:after="80" w:line="276" w:lineRule="auto"/>
+      </w:pPr>
       <w:r>
         <w:rPr>
           <w:rFonts w:ascii="Arial" w:hAnsi="Arial"/>
           <w:sz w:val="24"/>
         </w:rPr>
-        <w:t xml:space="preserve"> True faithfulness remains constant whether in the pit, the prison, or the palace.</w:t>
-      </w:r>
-    </w:p>
-    <w:p>
-      <w:pPr>
-        <w:spacing w:before="160" w:after="40"/>
-      </w:pPr>
-      <w:r>
-        <w:rPr>
-          <w:rFonts w:ascii="Arial" w:hAnsi="Arial"/>
-          <w:b/>
-          <w:i/>
-          <w:sz w:val="24"/>
-        </w:rPr>
-        <w:t>2 Kings 5:26-27</w:t>
-      </w:r>
-    </w:p>
-    <w:p>
-      <w:pPr>
-        <w:spacing w:before="20" w:after="20"/>
-        <w:ind w:left="360"/>
-      </w:pPr>
-      <w:r>
-        <w:rPr>
-          <w:rFonts w:ascii="Arial" w:hAnsi="Arial"/>
-          <w:b/>
-          <w:i/>
-          <w:sz w:val="24"/>
-        </w:rPr>
-        <w:t>[26] And he said unto him, Went not mine heart with thee, when the man turned again from his chariot to meet thee? Is it a time to receive money, and to receive garments, and oliveyards, and vineyards, and sheep, and oxen, and menservants, and maidservants?</w:t>
-      </w:r>
-    </w:p>
-    <w:p>
-      <w:pPr>
-        <w:spacing w:before="20" w:after="20"/>
-        <w:ind w:left="360"/>
-      </w:pPr>
-      <w:r>
-        <w:rPr>
-          <w:rFonts w:ascii="Arial" w:hAnsi="Arial"/>
-          <w:b/>
-          <w:i/>
-          <w:sz w:val="24"/>
-        </w:rPr>
-        <w:t>[27] The leprosy therefore of Naaman shall cleave unto thee, and unto thy seed for ever. And he went out from his presence a leper as white as snow.</w:t>
+        <w:t>As a minister, one could be like Gehazi. Gehazi wanted something material; he ran after Naaman and contracted leprosy.</w:t>
       </w:r>
     </w:p>
     <w:p>
@@ -1675,50 +1453,96 @@
           <w:rFonts w:ascii="Arial" w:hAnsi="Arial"/>
           <w:sz w:val="24"/>
         </w:rPr>
-        <w:t xml:space="preserve">In tragic contrast stands Gehazi. Gehazi served under the prophet Elisha, witnessing supernatural demonstrations and holding the potential to inherit the prophetic succession. Yet when Naaman was healed of leprosy and Elisha refused material remuneration, Gehazi's hidden covetousness flared. Pursuing Naaman deceitfully, he fabricated a story to extract silver and garments. Elisha exposed his compromise: </w:t>
-      </w:r>
-      <w:r>
-        <w:rPr>
-          <w:rFonts w:ascii="Arial" w:hAnsi="Arial"/>
-          <w:b/>
-          <w:i/>
-          <w:sz w:val="24"/>
-        </w:rPr>
-        <w:t>'Went not mine heart with thee, when the man turned again from his chariot to meet thee?'</w:t>
-      </w:r>
-      <w:r>
-        <w:rPr>
-          <w:rFonts w:ascii="Arial" w:hAnsi="Arial"/>
-          <w:sz w:val="24"/>
-        </w:rPr>
-        <w:t xml:space="preserve"> Gehazi traded eternal spiritual inheritance for temporal gain, leaving Elisha's presence a leper as white as snow. Untested ambition invariably produces Gehazi-like catastrophes.</w:t>
+        <w:t>God does not use people He does not test. He tests one so that He can entrust more to them. He builds character, strength, and commitment.</w:t>
       </w:r>
     </w:p>
     <w:p>
       <w:pPr>
-        <w:spacing w:before="80" w:after="80" w:line="276" w:lineRule="auto"/>
-      </w:pPr>
-      <w:r>
-        <w:rPr>
-          <w:rFonts w:ascii="Arial" w:hAnsi="Arial"/>
-          <w:sz w:val="24"/>
-        </w:rPr>
-        <w:t xml:space="preserve">Pastors and senior leaders must strictly observe this rule: </w:t>
-      </w:r>
+        <w:spacing w:before="280" w:after="80"/>
+      </w:pPr>
       <w:r>
         <w:rPr>
           <w:rFonts w:ascii="Arial" w:hAnsi="Arial"/>
           <w:b/>
           <w:sz w:val="24"/>
         </w:rPr>
-        <w:t>never donate spiritual responsibility to unproven individuals</w:t>
+        <w:t>Never Donate Responsibility to Unproven People</w:t>
       </w:r>
+    </w:p>
+    <w:p>
+      <w:pPr>
+        <w:spacing w:before="80" w:after="80" w:line="276" w:lineRule="auto"/>
+      </w:pPr>
       <w:r>
         <w:rPr>
           <w:rFonts w:ascii="Arial" w:hAnsi="Arial"/>
           <w:sz w:val="24"/>
         </w:rPr>
-        <w:t>. When individuals volunteer to launch independent groups or seek platforms without operating within established church structures, their ambition must be tested. God intentionally permits fires and difficult seasons so that those who cannot endure the desert are prevented from contaminating the promised land. Leadership oversight cannot be exercised through social media analytics; it requires direct, personal proving through the heat of service.</w:t>
+        <w:t>All leaders must hear this: do not use people you have not proven. Do not donate responsibility to people.</w:t>
+      </w:r>
+    </w:p>
+    <w:p>
+      <w:pPr>
+        <w:spacing w:before="80" w:after="80" w:line="276" w:lineRule="auto"/>
+      </w:pPr>
+      <w:r>
+        <w:rPr>
+          <w:rFonts w:ascii="Arial" w:hAnsi="Arial"/>
+          <w:i/>
+          <w:sz w:val="24"/>
+        </w:rPr>
+        <w:t>Someone once told me, 'Pastor, I am gathering some people in church.' I said, 'Go and do it in your zone and submit reports to your Zonal Pastor.' The person became uncomfortable, and I knew he was ambitious; he does not attend anymore because his motive was merely to be noticed by the senior pastor.</w:t>
+      </w:r>
+    </w:p>
+    <w:p>
+      <w:pPr>
+        <w:spacing w:before="80" w:after="80" w:line="276" w:lineRule="auto"/>
+      </w:pPr>
+      <w:r>
+        <w:rPr>
+          <w:rFonts w:ascii="Arial" w:hAnsi="Arial"/>
+          <w:sz w:val="24"/>
+        </w:rPr>
+        <w:t>Pastors, do not change the method. Let us see what workers do ourselves.</w:t>
+      </w:r>
+    </w:p>
+    <w:p>
+      <w:pPr>
+        <w:spacing w:before="80" w:after="80" w:line="276" w:lineRule="auto"/>
+      </w:pPr>
+      <w:r>
+        <w:rPr>
+          <w:rFonts w:ascii="Arial" w:hAnsi="Arial"/>
+          <w:i/>
+          <w:sz w:val="24"/>
+        </w:rPr>
+        <w:t>If you are placed on a committee to supervise a hostel at Believers Convention and everything falls apart, we look at that. If you are assigned to Works and arrive late, that matters. If you had eight workers and only two remain while six are gone, that matters a lot. Eye-service will not take anyone far.</w:t>
+      </w:r>
+    </w:p>
+    <w:p>
+      <w:pPr>
+        <w:spacing w:before="80" w:after="80" w:line="276" w:lineRule="auto"/>
+      </w:pPr>
+      <w:r>
+        <w:rPr>
+          <w:rFonts w:ascii="Arial" w:hAnsi="Arial"/>
+          <w:i/>
+          <w:sz w:val="24"/>
+        </w:rPr>
+        <w:t>God allows certain fires so that those who cannot be with you in the promised land do not cross the desert.</w:t>
+      </w:r>
+    </w:p>
+    <w:p>
+      <w:pPr>
+        <w:spacing w:before="80" w:after="80" w:line="276" w:lineRule="auto"/>
+      </w:pPr>
+      <w:r>
+        <w:rPr>
+          <w:rFonts w:ascii="Arial" w:hAnsi="Arial"/>
+          <w:i/>
+          <w:sz w:val="24"/>
+        </w:rPr>
+        <w:t>Forget all this social media pastoring. God does not give pastoral oversight through social media. There is no scripture for having oversight over people through media—following people online is not pastoring. Do not run from tests; be faithful.</w:t>
       </w:r>
     </w:p>
     <w:p>
@@ -1731,7 +1555,19 @@
           <w:b/>
           <w:sz w:val="24"/>
         </w:rPr>
-        <w:t>Keeping the Few Sheep: David's Pastoral Faithfulness in Obscurity</w:t>
+        <w:t>David the Shepherd: Keeping the Few Sheep</w:t>
+      </w:r>
+    </w:p>
+    <w:p>
+      <w:pPr>
+        <w:spacing w:before="80" w:after="80" w:line="276" w:lineRule="auto"/>
+      </w:pPr>
+      <w:r>
+        <w:rPr>
+          <w:rFonts w:ascii="Arial" w:hAnsi="Arial"/>
+          <w:sz w:val="24"/>
+        </w:rPr>
+        <w:t>Look at David in 1 Samuel 16. In Ezekiel 34, the prophetic name given to Jesus is David. Look at David the shepherd: the very first time we hear about him in 1 Samuel 16:</w:t>
       </w:r>
     </w:p>
     <w:p>
@@ -1760,7 +1596,7 @@
           <w:i/>
           <w:sz w:val="24"/>
         </w:rPr>
-        <w:t>[11] And Samuel said unto Jesse, Are here all thy children? And he said, There remaineth yet the youngest, and, behold, he keepeth the sheep. And Samuel said unto Jesse, Send and fetch him: for we will not sit down till he come hither.</w:t>
+        <w:t>[11] And Samuel said unto Jesse, Are here all thy children? And he said, There remaineth yet the youngest, and, behold, he keepeth the sheep.</w:t>
       </w:r>
     </w:p>
     <w:p>
@@ -1772,23 +1608,37 @@
           <w:rFonts w:ascii="Arial" w:hAnsi="Arial"/>
           <w:sz w:val="24"/>
         </w:rPr>
-        <w:t>The scriptural portrait of shepherd leadership finds its pinnacle in David, whose life prophetically foreshadows Jesus Christ—the Good Shepherd (</w:t>
+        <w:t>The very first thing known of him was that he was keeping the sheep.</w:t>
       </w:r>
-      <w:r>
-        <w:rPr>
-          <w:rFonts w:ascii="Arial" w:hAnsi="Arial"/>
-          <w:b/>
-          <w:sz w:val="24"/>
-        </w:rPr>
-        <w:t>Ezekiel 34:23; John 10:11</w:t>
-      </w:r>
+    </w:p>
+    <w:p>
+      <w:pPr>
+        <w:spacing w:before="80" w:after="80" w:line="276" w:lineRule="auto"/>
+      </w:pPr>
       <w:r>
         <w:rPr>
           <w:rFonts w:ascii="Arial" w:hAnsi="Arial"/>
           <w:sz w:val="24"/>
         </w:rPr>
-        <w:t xml:space="preserve">). When the prophet Samuel arrived in Bethlehem to anoint Israel's next king, all of Jesse's older sons were presented, while David was absent in the wilderness. The scripture records the first mention of his character: </w:t>
+        <w:t>When he went to the battlefield and his brother Eliab mocked him concerning the few sheep in the wilderness, David had left them in good care with a keeper.</w:t>
       </w:r>
+    </w:p>
+    <w:p>
+      <w:pPr>
+        <w:spacing w:before="80" w:after="80" w:line="276" w:lineRule="auto"/>
+      </w:pPr>
+      <w:r>
+        <w:rPr>
+          <w:rFonts w:ascii="Arial" w:hAnsi="Arial"/>
+          <w:sz w:val="24"/>
+        </w:rPr>
+        <w:t>When he stood before Saul, what were his credentials?</w:t>
+      </w:r>
+    </w:p>
+    <w:p>
+      <w:pPr>
+        <w:spacing w:before="160" w:after="40"/>
+      </w:pPr>
       <w:r>
         <w:rPr>
           <w:rFonts w:ascii="Arial" w:hAnsi="Arial"/>
@@ -1796,58 +1646,7 @@
           <w:i/>
           <w:sz w:val="24"/>
         </w:rPr>
-        <w:t>'Behold, he keepeth the sheep.'</w:t>
-      </w:r>
-      <w:r>
-        <w:rPr>
-          <w:rFonts w:ascii="Arial" w:hAnsi="Arial"/>
-          <w:sz w:val="24"/>
-        </w:rPr>
-        <w:t xml:space="preserve"> Faithfulness in obscurity is the prerequisite for public stewardship.</w:t>
-      </w:r>
-    </w:p>
-    <w:p>
-      <w:pPr>
-        <w:spacing w:before="160" w:after="40"/>
-      </w:pPr>
-      <w:r>
-        <w:rPr>
-          <w:rFonts w:ascii="Arial" w:hAnsi="Arial"/>
-          <w:b/>
-          <w:i/>
-          <w:sz w:val="24"/>
-        </w:rPr>
-        <w:t>1 Samuel 17:20, 28, 34-36</w:t>
-      </w:r>
-    </w:p>
-    <w:p>
-      <w:pPr>
-        <w:spacing w:before="20" w:after="20"/>
-        <w:ind w:left="360"/>
-      </w:pPr>
-      <w:r>
-        <w:rPr>
-          <w:rFonts w:ascii="Arial" w:hAnsi="Arial"/>
-          <w:b/>
-          <w:i/>
-          <w:sz w:val="24"/>
-        </w:rPr>
-        <w:t>[20] And David rose up early in the morning, and left the sheep with a keeper...</w:t>
-      </w:r>
-    </w:p>
-    <w:p>
-      <w:pPr>
-        <w:spacing w:before="20" w:after="20"/>
-        <w:ind w:left="360"/>
-      </w:pPr>
-      <w:r>
-        <w:rPr>
-          <w:rFonts w:ascii="Arial" w:hAnsi="Arial"/>
-          <w:b/>
-          <w:i/>
-          <w:sz w:val="24"/>
-        </w:rPr>
-        <w:t>[28] And Eliab his eldest brother heard when he spake unto the men; and Eliab's anger was kindled against David, and he said, Why camest thou down hither? and with whom hast thou left those few sheep in the wilderness?</w:t>
+        <w:t>1 Samuel 17:34-36</w:t>
       </w:r>
     </w:p>
     <w:p>
@@ -1892,7 +1691,7 @@
           <w:i/>
           <w:sz w:val="24"/>
         </w:rPr>
-        <w:t>[36] Thy servant slew both the lion and the bear: and this uncircumcised Philistine shall be as one of them...</w:t>
+        <w:t>[36] Thy servant slew both the lion and the bear...</w:t>
       </w:r>
     </w:p>
     <w:p>
@@ -1904,63 +1703,32 @@
           <w:rFonts w:ascii="Arial" w:hAnsi="Arial"/>
           <w:sz w:val="24"/>
         </w:rPr>
-        <w:t xml:space="preserve">When David arrived at the battle encampment, his eldest brother Eliab falsely accused him of insolence, asking condescendingly: </w:t>
+        <w:t>He did not lose a single sheep. He mirrored the Good Shepherd. Faithful with a few! God proved David with the sheep, and then gave him the nation—just as Moses was forty years faithful with the flock before God gave him Israel. Faithfulness must never be in the past; faithfulness is what one is doing now. Lives are God's investment into other lives.</w:t>
       </w:r>
-      <w:r>
-        <w:rPr>
-          <w:rFonts w:ascii="Arial" w:hAnsi="Arial"/>
-          <w:b/>
-          <w:i/>
-          <w:sz w:val="24"/>
-        </w:rPr>
-        <w:t>'With whom hast thou left those few sheep in the wilderness?'</w:t>
-      </w:r>
-      <w:r>
-        <w:rPr>
-          <w:rFonts w:ascii="Arial" w:hAnsi="Arial"/>
-          <w:sz w:val="24"/>
-        </w:rPr>
-        <w:t xml:space="preserve"> But David had already ensured that those few sheep were placed in the custody of a dependable keeper (</w:t>
-      </w:r>
+    </w:p>
+    <w:p>
+      <w:pPr>
+        <w:spacing w:before="280" w:after="80"/>
+      </w:pPr>
       <w:r>
         <w:rPr>
           <w:rFonts w:ascii="Arial" w:hAnsi="Arial"/>
           <w:b/>
           <w:sz w:val="24"/>
         </w:rPr>
-        <w:t>1 Samuel 17:20</w:t>
+        <w:t>The Word and the Spirit: Resources to Manage Lives</w:t>
       </w:r>
+    </w:p>
+    <w:p>
+      <w:pPr>
+        <w:spacing w:before="80" w:after="80" w:line="276" w:lineRule="auto"/>
+      </w:pPr>
       <w:r>
         <w:rPr>
           <w:rFonts w:ascii="Arial" w:hAnsi="Arial"/>
           <w:sz w:val="24"/>
         </w:rPr>
-        <w:t>). Even when visiting a national battlefield, the safety of his small flock remained his primary concern.</w:t>
-      </w:r>
-    </w:p>
-    <w:p>
-      <w:pPr>
-        <w:spacing w:before="80" w:after="80" w:line="276" w:lineRule="auto"/>
-      </w:pPr>
-      <w:r>
-        <w:rPr>
-          <w:rFonts w:ascii="Arial" w:hAnsi="Arial"/>
-          <w:sz w:val="24"/>
-        </w:rPr>
-        <w:t>When brought before King Saul, who dismissed him as an untrained youth, David did not boast of political theories or military tactics. His credentials were born of pastoral vigilance: when a lion and a bear attacked the flock, David risked his own life, pursued the predators, struck them, delivered the lamb from their mouths, and slew them. He refused to allow a single lamb to perish. Moses tended the flock of Jethro for forty years in the back of the desert before shepherding Israel out of Egypt; David defended the few sheep before leading the twelve tribes. Faithfulness with the few is God's eternal measuring rod for greater kingdom stewardship.</w:t>
-      </w:r>
-    </w:p>
-    <w:p>
-      <w:pPr>
-        <w:spacing w:before="280" w:after="80"/>
-      </w:pPr>
-      <w:r>
-        <w:rPr>
-          <w:rFonts w:ascii="Arial" w:hAnsi="Arial"/>
-          <w:b/>
-          <w:sz w:val="24"/>
-        </w:rPr>
-        <w:t>The Word and the Spirit: Cultivating the Second Hearing and Unquenchable Hunger</w:t>
+        <w:t>The Word and the Spirit are the resources to multiply what God has given. The Word: you preach it, teach it, and act upon it. A leader is not just a preacher giving instructions left and right, but an example:</w:t>
       </w:r>
     </w:p>
     <w:p>
@@ -2030,119 +1798,162 @@
           <w:rFonts w:ascii="Arial" w:hAnsi="Arial"/>
           <w:sz w:val="24"/>
         </w:rPr>
-        <w:t xml:space="preserve">The cell leader's primary resources for multiplying divine capital are twofold: </w:t>
+        <w:t>A leader listens to God's Word with the 'second hearing'—hearing not just for oneself, but on behalf of nations.</w:t>
       </w:r>
+    </w:p>
+    <w:p>
+      <w:pPr>
+        <w:spacing w:before="80" w:after="80" w:line="276" w:lineRule="auto"/>
+      </w:pPr>
+      <w:r>
+        <w:rPr>
+          <w:rFonts w:ascii="Arial" w:hAnsi="Arial"/>
+          <w:i/>
+          <w:sz w:val="24"/>
+        </w:rPr>
+        <w:t>When we release books, nobody should need to compel a leader to get them. Decades ago, I would walk to Christian bookshops in Isolo, in a corner off Oshodi way. I would ask when Reverend Matthew was releasing the next books by Kenneth Hagin or Frederick K.C. Price. When they said two weeks, I would book down a copy in advance. They started a book club and I became number three in Nigeria as a teenager. Nobody compelled me.</w:t>
+      </w:r>
+    </w:p>
+    <w:p>
+      <w:pPr>
+        <w:spacing w:before="80" w:after="80" w:line="276" w:lineRule="auto"/>
+      </w:pPr>
+      <w:r>
+        <w:rPr>
+          <w:rFonts w:ascii="Arial" w:hAnsi="Arial"/>
+          <w:i/>
+          <w:sz w:val="24"/>
+        </w:rPr>
+        <w:t>When the Amplified Bible was very rare, I would visit the only person I knew who had a copy, sit down for thirty minutes, and copy out the translation into my notebook by hand. You have to be that hungry! Today people can download tapes. There was a bookshop opposite Deeper Life where I went to buy Brother Hagin's tapes and T.L. Osborn's materials—there was no tape they had that I did not buy.</w:t>
+      </w:r>
+    </w:p>
+    <w:p>
+      <w:pPr>
+        <w:spacing w:before="80" w:after="80" w:line="276" w:lineRule="auto"/>
+      </w:pPr>
+      <w:r>
+        <w:rPr>
+          <w:rFonts w:ascii="Arial" w:hAnsi="Arial"/>
+          <w:i/>
+          <w:sz w:val="24"/>
+        </w:rPr>
+        <w:t>In 1994, I went to a tape kiosk wearing slippers and told the attendant, 'I want all of Pastor Chris's tapes.' The attendant said, 'Do you know what you are talking about? There are over two hundred tapes!' I said, 'I want everything.' And I got them all. That is dedication—you do not go halfway, and you do not just put them on a shelf; you study them.</w:t>
+      </w:r>
+    </w:p>
+    <w:p>
+      <w:pPr>
+        <w:spacing w:before="80" w:after="80" w:line="276" w:lineRule="auto"/>
+      </w:pPr>
+      <w:r>
+        <w:rPr>
+          <w:rFonts w:ascii="Arial" w:hAnsi="Arial"/>
+          <w:i/>
+          <w:sz w:val="24"/>
+        </w:rPr>
+        <w:t>We began Living Word Correspondence twenty-four years ago, giving study books and questions to believers so they could study as students.</w:t>
+      </w:r>
+    </w:p>
+    <w:p>
+      <w:pPr>
+        <w:spacing w:before="80" w:after="80" w:line="276" w:lineRule="auto"/>
+      </w:pPr>
+      <w:r>
+        <w:rPr>
+          <w:rFonts w:ascii="Arial" w:hAnsi="Arial"/>
+          <w:i/>
+          <w:sz w:val="24"/>
+        </w:rPr>
+        <w:t>Early in November, a denomination asked me to review materials totaling 1,800 pages. They asked, 'Can you review it?' I said, 'Give me four days.' They asked, 'Did you say four months?' I said, 'Four days.' In four days, I reviewed and returned everything.</w:t>
+      </w:r>
+    </w:p>
+    <w:p>
+      <w:pPr>
+        <w:spacing w:before="80" w:after="80" w:line="276" w:lineRule="auto"/>
+      </w:pPr>
+      <w:r>
+        <w:rPr>
+          <w:rFonts w:ascii="Arial" w:hAnsi="Arial"/>
+          <w:i/>
+          <w:sz w:val="24"/>
+        </w:rPr>
+        <w:t>In 1994, God spoke to me: 'Do not follow people's results; follow their labor.' What are they doing? They are fasting and praying—do it! They are giving their all—do it! Not just how they stand on the pulpit waving their hands.</w:t>
+      </w:r>
+    </w:p>
+    <w:p>
+      <w:pPr>
+        <w:spacing w:before="80" w:after="80" w:line="276" w:lineRule="auto"/>
+      </w:pPr>
+      <w:r>
+        <w:rPr>
+          <w:rFonts w:ascii="Arial" w:hAnsi="Arial"/>
+          <w:i/>
+          <w:sz w:val="24"/>
+        </w:rPr>
+        <w:t>In 1995 and 1996, when I did not have money to buy books for everyone, I made photocopies of Brother Hagin's Bible study courses and distributed them to believers in teaching meetings. What I am telling you to do is not theory. You give your all to get materials. Invest your life, because that is your life.</w:t>
+      </w:r>
+    </w:p>
+    <w:p>
+      <w:pPr>
+        <w:spacing w:before="80" w:after="80" w:line="276" w:lineRule="auto"/>
+      </w:pPr>
+      <w:r>
+        <w:rPr>
+          <w:rFonts w:ascii="Arial" w:hAnsi="Arial"/>
+          <w:sz w:val="24"/>
+        </w:rPr>
+        <w:t>When listening to God's Word at Camp Meeting, Believers Convention, or church service, a leader listens for nations. Your resources are the Word and the Holy Ghost. Utterances, prayer—take them specially. When service ends, put them into practice. Whenever you notice God repeating something again and again, it means you have not been doing it.</w:t>
+      </w:r>
+    </w:p>
+    <w:p>
+      <w:pPr>
+        <w:spacing w:before="80" w:after="80" w:line="276" w:lineRule="auto"/>
+      </w:pPr>
+      <w:r>
+        <w:rPr>
+          <w:rFonts w:ascii="Arial" w:hAnsi="Arial"/>
+          <w:i/>
+          <w:sz w:val="24"/>
+        </w:rPr>
+        <w:t>Some of you used to walk to meetings in the sun when you did not have money. Now you say your car broke down—did you have a car then? There was a time in this ministry it was almost a sin to say you were sick; you were forced to practice divine healing! You have done these things before—you have not outgrown them.</w:t>
+      </w:r>
+    </w:p>
+    <w:p>
+      <w:pPr>
+        <w:spacing w:before="80" w:after="80" w:line="276" w:lineRule="auto"/>
+      </w:pPr>
+      <w:r>
+        <w:rPr>
+          <w:rFonts w:ascii="Arial" w:hAnsi="Arial"/>
+          <w:i/>
+          <w:sz w:val="24"/>
+        </w:rPr>
+        <w:t>We used to hold Bible seminars on sanitation Saturdays. People would arrive from Oyo State or Ogun State before 6:30 a.m. In the days of CDs, people would do anything for a CD. Now you download messages on your phone—listen to them with headphones and feed on them continuously, because those are your resources for ministry.</w:t>
+      </w:r>
+    </w:p>
+    <w:p>
+      <w:pPr>
+        <w:spacing w:before="80" w:after="80" w:line="276" w:lineRule="auto"/>
+      </w:pPr>
+      <w:r>
+        <w:rPr>
+          <w:rFonts w:ascii="Arial" w:hAnsi="Arial"/>
+          <w:i/>
+          <w:sz w:val="24"/>
+        </w:rPr>
+        <w:t>Brother Toks is one of the most consistent human beings I know—annoyingly consistent. If you wanted to meet him at five minutes to twelve, he was praying in tongues. Consistent! That is faithfulness, commitment, doggedness.</w:t>
+      </w:r>
+    </w:p>
+    <w:p>
+      <w:pPr>
+        <w:spacing w:before="280" w:after="80"/>
+      </w:pPr>
       <w:r>
         <w:rPr>
           <w:rFonts w:ascii="Arial" w:hAnsi="Arial"/>
           <w:b/>
           <w:sz w:val="24"/>
         </w:rPr>
-        <w:t>the Word of God and the Holy Spirit</w:t>
-      </w:r>
-      <w:r>
-        <w:rPr>
-          <w:rFonts w:ascii="Arial" w:hAnsi="Arial"/>
-          <w:sz w:val="24"/>
-        </w:rPr>
-        <w:t>. The minister is not called to be a mere dispenser of arbitrary commands, but an ensample (</w:t>
-      </w:r>
-      <w:r>
-        <w:rPr>
-          <w:rFonts w:ascii="Arial" w:hAnsi="Arial"/>
-          <w:b/>
-          <w:i/>
-          <w:sz w:val="24"/>
-        </w:rPr>
-        <w:t>typos</w:t>
-      </w:r>
-      <w:r>
-        <w:rPr>
-          <w:rFonts w:ascii="Arial" w:hAnsi="Arial"/>
-          <w:sz w:val="24"/>
-        </w:rPr>
-        <w:t>) to the flock in doctrine, speech, love, spiritual fervor, and moral purity (</w:t>
-      </w:r>
-      <w:r>
-        <w:rPr>
-          <w:rFonts w:ascii="Arial" w:hAnsi="Arial"/>
-          <w:b/>
-          <w:sz w:val="24"/>
-        </w:rPr>
-        <w:t>1 Peter 5:3</w:t>
-      </w:r>
-      <w:r>
-        <w:rPr>
-          <w:rFonts w:ascii="Arial" w:hAnsi="Arial"/>
-          <w:sz w:val="24"/>
-        </w:rPr>
-        <w:t xml:space="preserve">). To lead effectively, a minister must cultivate </w:t>
-      </w:r>
-      <w:r>
-        <w:rPr>
-          <w:rFonts w:ascii="Arial" w:hAnsi="Arial"/>
-          <w:b/>
-          <w:sz w:val="24"/>
-        </w:rPr>
-        <w:t>the second hearing</w:t>
-      </w:r>
-      <w:r>
-        <w:rPr>
-          <w:rFonts w:ascii="Arial" w:hAnsi="Arial"/>
-          <w:sz w:val="24"/>
-        </w:rPr>
-        <w:t>. A leader does not listen to biblical teaching merely for personal devotional encouragement; a leader listens on behalf of nations, absorbing doctrine, cross-references, and explanations to feed and establish those committed to their charge.</w:t>
-      </w:r>
-    </w:p>
-    <w:p>
-      <w:pPr>
-        <w:spacing w:before="80" w:after="80" w:line="276" w:lineRule="auto"/>
-      </w:pPr>
-      <w:r>
-        <w:rPr>
-          <w:rFonts w:ascii="Arial" w:hAnsi="Arial"/>
-          <w:i/>
-          <w:sz w:val="24"/>
-        </w:rPr>
-        <w:t>A genuine leader possesses an insatiable, self-motivated appetite for God's Word. Decades ago, when biblical teaching literature and recordings were scarce in Nigeria, no one compelled me to acquire materials. I would trek through industrial quarters to Christian book distributors, inquire when new teaching volumes by Kenneth Hagin or Frederick K.C. Price were arriving, and reserve copies weeks in advance. When the Amplified Bible was extraordinarily rare, I would visit someone who owned a copy and spend thirty constrained minutes transcribing scripture text and cross-references by hand into notebooks. When teaching audio cassettes became available, I saved my financial resources and purchased entire library collections of over two hundred tapes, studying them meticulously. This was not platform posturing; it was an unquenchable hunger for the Word of God.</w:t>
-      </w:r>
-    </w:p>
-    <w:p>
-      <w:pPr>
-        <w:spacing w:before="80" w:after="80" w:line="276" w:lineRule="auto"/>
-      </w:pPr>
-      <w:r>
-        <w:rPr>
-          <w:rFonts w:ascii="Arial" w:hAnsi="Arial"/>
-          <w:i/>
-          <w:sz w:val="24"/>
-        </w:rPr>
-        <w:t>We instituted correspondence study courses, distributing comprehensive study manuals to believers—including leaders who now pastor major branches—requiring them to answer detailed doctrinal questions so that truth was ingrained in their spirits. When denominations recently submitted an eighteen-hundred-page theological curriculum for review, expecting a four-month evaluation, I returned the completed critique within four days through relentless labor. In 1994, the Lord spoke clearly to my heart: 'Do not merely admire men's results; follow their labor.' Pulpit effectiveness is not manufactured by theatrics or waving hands; it is the direct outcome of unseen hours spent in fasting, prayer, rigorous textual examination, and absolute submission to the Holy Spirit.</w:t>
-      </w:r>
-    </w:p>
-    <w:p>
-      <w:pPr>
-        <w:spacing w:before="80" w:after="80" w:line="276" w:lineRule="auto"/>
-      </w:pPr>
-      <w:r>
-        <w:rPr>
-          <w:rFonts w:ascii="Arial" w:hAnsi="Arial"/>
-          <w:sz w:val="24"/>
-        </w:rPr>
-        <w:t>This consecration extends to physical endurance and unwavering consistency. In the early days of ministry, believers walked long distances under intense sunlight to attend seminars, rejecting physical excuses and walking in divine healing. Leaders must rekindle that same apostolic stamina. Furthermore, spiritual consistency must become second nature—exemplified by senior ministers whose prayer routines in the Spirit are so clockwork and dependable that one can set their daily schedule by their fidelity. The Word and the Holy Spirit are the only resources that can sustain and multiply God's flock.</w:t>
-      </w:r>
-    </w:p>
-    <w:p>
-      <w:pPr>
-        <w:spacing w:before="280" w:after="80"/>
-      </w:pPr>
-      <w:r>
-        <w:rPr>
-          <w:rFonts w:ascii="Arial" w:hAnsi="Arial"/>
-          <w:b/>
-          <w:sz w:val="24"/>
-        </w:rPr>
-        <w:t>The Four Demands of Pastoral Oversight: Evangelism, Establishment, Daily Feeding, and Pastoral Care</w:t>
+        <w:t>The Four Demands of Pastoral Oversight</w:t>
       </w:r>
     </w:p>
     <w:p>
@@ -2183,27 +1994,132 @@
           <w:rFonts w:ascii="Arial" w:hAnsi="Arial"/>
           <w:sz w:val="24"/>
         </w:rPr>
-        <w:t xml:space="preserve">In concluding the charge to cell leaders, the Apostle Paul's ministerial practice outlines </w:t>
+        <w:t>That habit of taking other people's church members must never be found among us! If someone asks about your disciple and you say, 'He attends that other church'—that is not your disciple. Your disciple is someone who was unsaved, unchurched, undiscipled. Not someone you dazzled with words or kidnapped—raise people from scratch: unsaved, untaught, unchurched. That is your work.</w:t>
       </w:r>
+    </w:p>
+    <w:p>
+      <w:pPr>
+        <w:spacing w:before="80" w:after="80" w:line="276" w:lineRule="auto"/>
+      </w:pPr>
+      <w:r>
+        <w:rPr>
+          <w:rFonts w:ascii="Arial" w:hAnsi="Arial"/>
+          <w:sz w:val="24"/>
+        </w:rPr>
+        <w:t>Four things are required of you concerning your flock:</w:t>
+      </w:r>
+    </w:p>
+    <w:p>
+      <w:pPr>
+        <w:spacing w:before="200" w:after="60"/>
+      </w:pPr>
       <w:r>
         <w:rPr>
           <w:rFonts w:ascii="Arial" w:hAnsi="Arial"/>
           <w:b/>
           <w:sz w:val="24"/>
         </w:rPr>
-        <w:t>four non-negotiable operational responsibilities</w:t>
+        <w:t>1. Soul Winning (Evangelism)</w:t>
       </w:r>
+    </w:p>
+    <w:p>
+      <w:pPr>
+        <w:spacing w:before="80" w:after="80" w:line="276" w:lineRule="auto"/>
+      </w:pPr>
       <w:r>
         <w:rPr>
           <w:rFonts w:ascii="Arial" w:hAnsi="Arial"/>
           <w:sz w:val="24"/>
         </w:rPr>
-        <w:t xml:space="preserve"> required of every cell leader, fellowship coordinator, and pastor:</w:t>
+        <w:t>They must be saved through you.</w:t>
       </w:r>
     </w:p>
     <w:p>
       <w:pPr>
+        <w:spacing w:before="160" w:after="40"/>
+      </w:pPr>
+      <w:r>
+        <w:rPr>
+          <w:rFonts w:ascii="Arial" w:hAnsi="Arial"/>
+          <w:b/>
+          <w:i/>
+          <w:sz w:val="24"/>
+        </w:rPr>
+        <w:t>Numbers 27:17</w:t>
+      </w:r>
+    </w:p>
+    <w:p>
+      <w:pPr>
+        <w:spacing w:before="20" w:after="20"/>
+        <w:ind w:left="360"/>
+      </w:pPr>
+      <w:r>
+        <w:rPr>
+          <w:rFonts w:ascii="Arial" w:hAnsi="Arial"/>
+          <w:b/>
+          <w:i/>
+          <w:sz w:val="24"/>
+        </w:rPr>
+        <w:t>[17] Which may go out before them, and which may go in before them, and which may lead them out, and which may bring them in; that the congregation of the LORD be not as sheep which have no shepherd.</w:t>
+      </w:r>
+    </w:p>
+    <w:p>
+      <w:pPr>
+        <w:spacing w:before="160" w:after="40"/>
+      </w:pPr>
+      <w:r>
+        <w:rPr>
+          <w:rFonts w:ascii="Arial" w:hAnsi="Arial"/>
+          <w:b/>
+          <w:i/>
+          <w:sz w:val="24"/>
+        </w:rPr>
+        <w:t>Ezekiel 34:11</w:t>
+      </w:r>
+    </w:p>
+    <w:p>
+      <w:pPr>
+        <w:spacing w:before="20" w:after="20"/>
+        <w:ind w:left="360"/>
+      </w:pPr>
+      <w:r>
+        <w:rPr>
+          <w:rFonts w:ascii="Arial" w:hAnsi="Arial"/>
+          <w:b/>
+          <w:i/>
+          <w:sz w:val="24"/>
+        </w:rPr>
+        <w:t>[11] For thus saith the Lord GOD; Behold, I, even I, will both search my sheep, and seek them out.</w:t>
+      </w:r>
+    </w:p>
+    <w:p>
+      <w:pPr>
         <w:spacing w:before="80" w:after="80" w:line="276" w:lineRule="auto"/>
+      </w:pPr>
+      <w:r>
+        <w:rPr>
+          <w:rFonts w:ascii="Arial" w:hAnsi="Arial"/>
+          <w:sz w:val="24"/>
+        </w:rPr>
+        <w:t>If your meeting venue is not full, it is because your soul winning is not on fire. When you see empty seats, it shows a lack of passion for souls.</w:t>
+      </w:r>
+    </w:p>
+    <w:p>
+      <w:pPr>
+        <w:spacing w:before="80" w:after="80" w:line="276" w:lineRule="auto"/>
+      </w:pPr>
+      <w:r>
+        <w:rPr>
+          <w:rFonts w:ascii="Arial" w:hAnsi="Arial"/>
+          <w:i/>
+          <w:sz w:val="24"/>
+        </w:rPr>
+        <w:t>When Wizkid planned a concert in London at the O2 Arena, they had to stretch it to three days because people filled the venue even when ticket prices increased. There are people out there—we just have to work and win souls!</w:t>
+      </w:r>
+    </w:p>
+    <w:p>
+      <w:pPr>
+        <w:spacing w:before="200" w:after="60"/>
       </w:pPr>
       <w:r>
         <w:rPr>
@@ -2211,94 +2127,43 @@
           <w:b/>
           <w:sz w:val="24"/>
         </w:rPr>
-        <w:t xml:space="preserve">1. Pioneer Soul Winning (Evangelism): </w:t>
+        <w:t>2. Establish Them in the Local Church</w:t>
       </w:r>
+    </w:p>
+    <w:p>
+      <w:pPr>
+        <w:spacing w:before="80" w:after="80" w:line="276" w:lineRule="auto"/>
+      </w:pPr>
       <w:r>
         <w:rPr>
           <w:rFonts w:ascii="Arial" w:hAnsi="Arial"/>
           <w:sz w:val="24"/>
         </w:rPr>
-        <w:t>A cell leader must be an active, unyielding soul winner. Paul declared his apostolic rule: striving to preach the gospel where Christ was not previously named, refusing to build upon another man's foundation (</w:t>
+        <w:t>Inculcate this into all workers: it is utterly irresponsible to just send disciples to church. You do not bring people to church; you come with your disciples to church. Their church attendance is part of your discipleship.</w:t>
       </w:r>
-      <w:r>
-        <w:rPr>
-          <w:rFonts w:ascii="Arial" w:hAnsi="Arial"/>
-          <w:b/>
-          <w:sz w:val="24"/>
-        </w:rPr>
-        <w:t>Romans 15:20</w:t>
-      </w:r>
+    </w:p>
+    <w:p>
+      <w:pPr>
+        <w:spacing w:before="80" w:after="80" w:line="276" w:lineRule="auto"/>
+      </w:pPr>
       <w:r>
         <w:rPr>
           <w:rFonts w:ascii="Arial" w:hAnsi="Arial"/>
           <w:sz w:val="24"/>
         </w:rPr>
-        <w:t xml:space="preserve">). The practice of poaching or re-circulating members from other churches is an ecclesiastical abomination that must never exist among us. True discipleship raises individuals from the foundation—winning the unsaved, reaching the unchurched, and establishing the untaught. In </w:t>
+        <w:t>It is irresponsible for a leader to come into the service, sit in front, while the people they are mentoring are seated far away somewhere else. You sit around the same area! Part of your work is to watch how they are studying, how they are praying. You are not here alone.</w:t>
       </w:r>
-      <w:r>
-        <w:rPr>
-          <w:rFonts w:ascii="Arial" w:hAnsi="Arial"/>
-          <w:b/>
-          <w:sz w:val="24"/>
-        </w:rPr>
-        <w:t>Numbers 27:17</w:t>
-      </w:r>
+    </w:p>
+    <w:p>
+      <w:pPr>
+        <w:spacing w:before="80" w:after="80" w:line="276" w:lineRule="auto"/>
+      </w:pPr>
       <w:r>
         <w:rPr>
           <w:rFonts w:ascii="Arial" w:hAnsi="Arial"/>
           <w:sz w:val="24"/>
         </w:rPr>
-        <w:t xml:space="preserve">, Moses prayed for shepherds who would lead the congregation in and out. In </w:t>
-      </w:r>
-      <w:r>
-        <w:rPr>
-          <w:rFonts w:ascii="Arial" w:hAnsi="Arial"/>
-          <w:b/>
-          <w:sz w:val="24"/>
-        </w:rPr>
-        <w:t>Ezekiel 34:11</w:t>
-      </w:r>
-      <w:r>
-        <w:rPr>
-          <w:rFonts w:ascii="Arial" w:hAnsi="Arial"/>
-          <w:sz w:val="24"/>
-        </w:rPr>
-        <w:t>, the true shepherd searches out the lost sheep. When seats in a cell meeting or church service remain empty, it is an unmistakable symptom of dormant soul winning. A cell leader must keep their soul-winning fire burning constantly.</w:t>
-      </w:r>
-    </w:p>
-    <w:p>
-      <w:pPr>
-        <w:spacing w:before="80" w:after="80" w:line="276" w:lineRule="auto"/>
-      </w:pPr>
-      <w:r>
-        <w:rPr>
-          <w:rFonts w:ascii="Arial" w:hAnsi="Arial"/>
-          <w:b/>
-          <w:sz w:val="24"/>
-        </w:rPr>
-        <w:t xml:space="preserve">2. Active Establishment in the Local Church: </w:t>
-      </w:r>
-      <w:r>
-        <w:rPr>
-          <w:rFonts w:ascii="Arial" w:hAnsi="Arial"/>
-          <w:sz w:val="24"/>
-        </w:rPr>
-        <w:t xml:space="preserve">It is utter ministerial negligence for a leader to dispatch people to church as detached spectators. A leader does not merely invite or send disciples; </w:t>
-      </w:r>
-      <w:r>
-        <w:rPr>
-          <w:rFonts w:ascii="Arial" w:hAnsi="Arial"/>
-          <w:b/>
-          <w:sz w:val="24"/>
-        </w:rPr>
-        <w:t>the leader attends church together with their disciples</w:t>
-      </w:r>
-      <w:r>
-        <w:rPr>
-          <w:rFonts w:ascii="Arial" w:hAnsi="Arial"/>
-          <w:sz w:val="24"/>
-        </w:rPr>
-        <w:t>. Church attendance is an integral continuation of discipleship. It is completely irresponsible for a leader to sit comfortably in the front rows while their disciples are scattered aimlessly across the auditorium. Leaders must sit adjacent to the people they mentor, actively observing how they follow the Word, whether they open their Bibles, take notes, sing during worship, and pray with fervor. This is the essence of pastoral oversight (</w:t>
+        <w:t>It is an insult for your disciple to be in the service without a Bible. If church attendance is a continuation of discipleship, they know they are coming to service in continuation of what you are teaching them. Do not delegate that job to the pastors; you are their pastor. You sit together: watch if they are singing, watch if they are writing notes. It is called oversight (</w:t>
       </w:r>
       <w:r>
         <w:rPr>
@@ -2314,7 +2179,61 @@
           <w:rFonts w:ascii="Arial" w:hAnsi="Arial"/>
           <w:sz w:val="24"/>
         </w:rPr>
-        <w:t>). Just as negligent parenting produces undisciplined children who disrupt society, negligent pastoring produces careless believers. Leaders must provide direct, personal supervision.</w:t>
+        <w:t>)—paying attention to behavior, paying attention to everything. Bad parenting results in an unruly society; bad pastoring results in careless Christians.</w:t>
+      </w:r>
+    </w:p>
+    <w:p>
+      <w:pPr>
+        <w:spacing w:before="200" w:after="60"/>
+      </w:pPr>
+      <w:r>
+        <w:rPr>
+          <w:rFonts w:ascii="Arial" w:hAnsi="Arial"/>
+          <w:b/>
+          <w:sz w:val="24"/>
+        </w:rPr>
+        <w:t>3. Teach Them Daily</w:t>
+      </w:r>
+    </w:p>
+    <w:p>
+      <w:pPr>
+        <w:spacing w:before="80" w:after="80" w:line="276" w:lineRule="auto"/>
+      </w:pPr>
+      <w:r>
+        <w:rPr>
+          <w:rFonts w:ascii="Arial" w:hAnsi="Arial"/>
+          <w:sz w:val="24"/>
+        </w:rPr>
+        <w:t>Do you have a plan on how your flock feeds on the Word of God daily? That does not mean you must see them physically every day—that is impossible—but do you have a plan for everyone under you to feed on God's Word daily? The work of ministry is not for weekends.</w:t>
+      </w:r>
+    </w:p>
+    <w:p>
+      <w:pPr>
+        <w:spacing w:before="160" w:after="40"/>
+      </w:pPr>
+      <w:r>
+        <w:rPr>
+          <w:rFonts w:ascii="Arial" w:hAnsi="Arial"/>
+          <w:b/>
+          <w:i/>
+          <w:sz w:val="24"/>
+        </w:rPr>
+        <w:t>Acts 20:31</w:t>
+      </w:r>
+    </w:p>
+    <w:p>
+      <w:pPr>
+        <w:spacing w:before="20" w:after="20"/>
+        <w:ind w:left="360"/>
+      </w:pPr>
+      <w:r>
+        <w:rPr>
+          <w:rFonts w:ascii="Arial" w:hAnsi="Arial"/>
+          <w:b/>
+          <w:i/>
+          <w:sz w:val="24"/>
+        </w:rPr>
+        <w:t>[31] Therefore watch, and remember, that by the space of three years I ceased not to warn every one night and day with tears.</w:t>
       </w:r>
     </w:p>
     <w:p>
@@ -2363,36 +2282,19 @@
     </w:p>
     <w:p>
       <w:pPr>
-        <w:spacing w:before="160" w:after="40"/>
+        <w:spacing w:before="80" w:after="80" w:line="276" w:lineRule="auto"/>
       </w:pPr>
       <w:r>
         <w:rPr>
           <w:rFonts w:ascii="Arial" w:hAnsi="Arial"/>
-          <w:b/>
-          <w:i/>
           <w:sz w:val="24"/>
         </w:rPr>
-        <w:t>Acts 20:31</w:t>
+        <w:t>Daily teaching! What is everyone listening to in your cell this week? Follow up: 'Have you listened to that series? Tell me what you learned.' Follow-up is not just asking, 'Hope you are not forgetting service on Sunday?' You do not merely invite disciples; you inform them and you come together.</w:t>
       </w:r>
     </w:p>
     <w:p>
       <w:pPr>
-        <w:spacing w:before="20" w:after="20"/>
-        <w:ind w:left="360"/>
-      </w:pPr>
-      <w:r>
-        <w:rPr>
-          <w:rFonts w:ascii="Arial" w:hAnsi="Arial"/>
-          <w:b/>
-          <w:i/>
-          <w:sz w:val="24"/>
-        </w:rPr>
-        <w:t>[31] Therefore watch, and remember, that by the space of three years I ceased not to warn every one night and day with tears.</w:t>
-      </w:r>
-    </w:p>
-    <w:p>
-      <w:pPr>
-        <w:spacing w:before="80" w:after="80" w:line="276" w:lineRule="auto"/>
+        <w:spacing w:before="200" w:after="60"/>
       </w:pPr>
       <w:r>
         <w:rPr>
@@ -2400,59 +2302,7 @@
           <w:b/>
           <w:sz w:val="24"/>
         </w:rPr>
-        <w:t xml:space="preserve">3. Daily Discipleship and Systematic Word Feeding: </w:t>
-      </w:r>
-      <w:r>
-        <w:rPr>
-          <w:rFonts w:ascii="Arial" w:hAnsi="Arial"/>
-          <w:sz w:val="24"/>
-        </w:rPr>
-        <w:t xml:space="preserve">The work of Christian ministry is not a weekend recreational activity; it is a daily, unceasing vocation. In Ephesus, Paul gathered the disciples and taught them </w:t>
-      </w:r>
-      <w:r>
-        <w:rPr>
-          <w:rFonts w:ascii="Arial" w:hAnsi="Arial"/>
-          <w:b/>
-          <w:sz w:val="24"/>
-        </w:rPr>
-        <w:t>daily</w:t>
-      </w:r>
-      <w:r>
-        <w:rPr>
-          <w:rFonts w:ascii="Arial" w:hAnsi="Arial"/>
-          <w:sz w:val="24"/>
-        </w:rPr>
-        <w:t xml:space="preserve"> for the space of two and a half years in the school of Tyrannus (</w:t>
-      </w:r>
-      <w:r>
-        <w:rPr>
-          <w:rFonts w:ascii="Arial" w:hAnsi="Arial"/>
-          <w:b/>
-          <w:sz w:val="24"/>
-        </w:rPr>
-        <w:t>Acts 19:9-10</w:t>
-      </w:r>
-      <w:r>
-        <w:rPr>
-          <w:rFonts w:ascii="Arial" w:hAnsi="Arial"/>
-          <w:sz w:val="24"/>
-        </w:rPr>
-        <w:t xml:space="preserve">), testifying in </w:t>
-      </w:r>
-      <w:r>
-        <w:rPr>
-          <w:rFonts w:ascii="Arial" w:hAnsi="Arial"/>
-          <w:b/>
-          <w:sz w:val="24"/>
-        </w:rPr>
-        <w:t>Acts 20:31</w:t>
-      </w:r>
-      <w:r>
-        <w:rPr>
-          <w:rFonts w:ascii="Arial" w:hAnsi="Arial"/>
-          <w:sz w:val="24"/>
-        </w:rPr>
-        <w:t xml:space="preserve"> that for three years he warned every one night and day with tears. While a cell leader cannot physically meet with every disciple daily, they must implement a systematic plan ensuring that every individual under their care feeds upon the Word of God daily. Cell leaders must track the sermon series and audio teachings their flock listens to, following up consistently: inquiring what was learned, discussing doctrinal principles, and ensuring continuous spiritual intake.</w:t>
+        <w:t>4. Minister to Their Needs and Know Their Details</w:t>
       </w:r>
     </w:p>
     <w:p>
@@ -2506,57 +2356,34 @@
       <w:r>
         <w:rPr>
           <w:rFonts w:ascii="Arial" w:hAnsi="Arial"/>
-          <w:b/>
           <w:sz w:val="24"/>
         </w:rPr>
-        <w:t xml:space="preserve">4. Ministering to Practical Needs and Maintaining Diligent Pastoral Records: </w:t>
+        <w:t>Do you know their names, their surnames, what they do, where they live? You must have those records: full names, dates of birth, occupations, where they live. If you cannot maintain that for twenty or fifty people, how will you oversee one thousand? That is pastoring; that is oversight.</w:t>
       </w:r>
-      <w:r>
-        <w:rPr>
-          <w:rFonts w:ascii="Arial" w:hAnsi="Arial"/>
-          <w:sz w:val="24"/>
-        </w:rPr>
-        <w:t>Pastoral oversight encompasses both spiritual edification and practical care. Paul reminded the Ephesian elders that with his own hands he labored to minister to the necessities of those with him, supporting the weak (</w:t>
-      </w:r>
+    </w:p>
+    <w:p>
+      <w:pPr>
+        <w:spacing w:before="280" w:after="80"/>
+      </w:pPr>
       <w:r>
         <w:rPr>
           <w:rFonts w:ascii="Arial" w:hAnsi="Arial"/>
           <w:b/>
           <w:sz w:val="24"/>
         </w:rPr>
-        <w:t>Acts 20:34-35</w:t>
+        <w:t>Men of Purpose Are Busy People</w:t>
       </w:r>
+    </w:p>
+    <w:p>
+      <w:pPr>
+        <w:spacing w:before="80" w:after="80" w:line="276" w:lineRule="auto"/>
+      </w:pPr>
       <w:r>
         <w:rPr>
           <w:rFonts w:ascii="Arial" w:hAnsi="Arial"/>
           <w:sz w:val="24"/>
         </w:rPr>
-        <w:t>). A shepherd must know the flock intimately. Every cell leader must maintain detailed, accurate pastoral records of everyone in their unit: their full legal names, dates of birth, residential addresses, occupations, and domestic circumstances. If a leader lacks the administrative discipline to maintain accurate biographical knowledge for twenty or fifty people, they fundamentally disqualify themselves from shepherding hundreds or thousands. Pastoral oversight requires deliberate, structured familiarity with every sheep.</w:t>
-      </w:r>
-    </w:p>
-    <w:p>
-      <w:pPr>
-        <w:spacing w:before="280" w:after="80"/>
-      </w:pPr>
-      <w:r>
-        <w:rPr>
-          <w:rFonts w:ascii="Arial" w:hAnsi="Arial"/>
-          <w:b/>
-          <w:sz w:val="24"/>
-        </w:rPr>
-        <w:t>Men of Purpose Are Busy People: Relentless Labor and Faithful Fulfillment</w:t>
-      </w:r>
-    </w:p>
-    <w:p>
-      <w:pPr>
-        <w:spacing w:before="80" w:after="80" w:line="276" w:lineRule="auto"/>
-      </w:pPr>
-      <w:r>
-        <w:rPr>
-          <w:rFonts w:ascii="Arial" w:hAnsi="Arial"/>
-          <w:sz w:val="24"/>
-        </w:rPr>
-        <w:t>Pastoral ministry is a continuous, daily lifestyle. Even when a leader is not physically present, they are pastoring through prayer, communication, strategic planning, and spiritual vigilance. Operating as an effective leader requires intentional time management: carving out disciplined boundaries for personal communion with God, family responsibilities, vocational employment, physical health, and flock oversight by ruthlessly eliminating frivolous, unproductive activities.</w:t>
+        <w:t>Pastoring is a daily walk. Even when you are not physically present, you are pastoring through prayer and oversight. You create time: for family, for yourself, for your work, for your business, for your health, for souls, for church, for leaders. You must cut off frivolous things. Why? Because men of purpose are busy people.</w:t>
       </w:r>
     </w:p>
     <w:p>
@@ -2569,7 +2396,32 @@
           <w:i/>
           <w:sz w:val="24"/>
         </w:rPr>
-        <w:t>Men of purpose are inherently busy people. When you observe leaders who accomplish monumental results in industry or ministry, their lives are characterized by high-velocity focus, decisive execution, and zero tolerance for idleness. One does not attain fulfillment in ministry through passive positive confessions while lounging in slothfulness. Fulfilling ministry demands diligent, relentless labor. Let your life be characterized by purpose. Stand as a dependable steward, wholly devoted to multiplying the investment of lives committed to your hands, until the Chief Shepherd appears.</w:t>
+        <w:t>I was once in the office of one of Nigeria's billionaires. He discussed traveling to Paris and New York like someone traveling to Ikeja. Another time, he said, 'Let's go to Ilorin at 10:30 p.m.' We boarded his private jet, flew to Ilorin where he inspected a project, and within twenty minutes we flew back to Lagos. The driver who brought me was still waiting in the car park! He was that focused and busy.</w:t>
+      </w:r>
+    </w:p>
+    <w:p>
+      <w:pPr>
+        <w:spacing w:before="80" w:after="80" w:line="276" w:lineRule="auto"/>
+      </w:pPr>
+      <w:r>
+        <w:rPr>
+          <w:rFonts w:ascii="Arial" w:hAnsi="Arial"/>
+          <w:sz w:val="24"/>
+        </w:rPr>
+        <w:t>People see others accomplishing great things and think they just sat down confessing. You do not confess fulfillment in ministry; you work—you are busy!</w:t>
+      </w:r>
+    </w:p>
+    <w:p>
+      <w:pPr>
+        <w:spacing w:before="80" w:after="80" w:line="276" w:lineRule="auto"/>
+      </w:pPr>
+      <w:r>
+        <w:rPr>
+          <w:rFonts w:ascii="Arial" w:hAnsi="Arial"/>
+          <w:i/>
+          <w:sz w:val="24"/>
+        </w:rPr>
+        <w:t>A man of purpose is busy. Let us pray.</w:t>
       </w:r>
     </w:p>
     <w:sectPr>

</xml_diff>

<commit_message>
Smooth sentence structure and remove oral fillers per Refined Claude Standard
</commit_message>
<xml_diff>
--- a/Cell_Leaders_Conference_Faithfulness_in_Ministry.docx
+++ b/Cell_Leaders_Conference_Faithfulness_in_Ministry.docx
@@ -54,7 +54,7 @@
           <w:i/>
           <w:sz w:val="24"/>
         </w:rPr>
-        <w:t>First Corinthians 4. I shared this yesterday and I am just going to run through it again. I know you must have seen it on my Facebook, and I rarely share my notes like that, but I just wanted people to read it and see it.</w:t>
+        <w:t>I shared this yesterday and I am going to run through it again. Many must have seen it on my Facebook; I rarely share my notes like that, but I wanted people to read and see it.</w:t>
       </w:r>
     </w:p>
     <w:p>
@@ -66,7 +66,7 @@
           <w:rFonts w:ascii="Arial" w:hAnsi="Arial"/>
           <w:sz w:val="24"/>
         </w:rPr>
-        <w:t>First Corinthians 4:2, starting from verse 1:</w:t>
+        <w:t>In 1 Corinthians 4, beginning from verse 1:</w:t>
       </w:r>
     </w:p>
     <w:p>
@@ -122,7 +122,7 @@
           <w:rFonts w:ascii="Arial" w:hAnsi="Arial"/>
           <w:sz w:val="24"/>
         </w:rPr>
-        <w:t xml:space="preserve">That a man be found faithful. The word faithful is the same word for faith, </w:t>
+        <w:t xml:space="preserve">It is required that a man be found faithful. The word faithful is the same word for faith, </w:t>
       </w:r>
       <w:r>
         <w:rPr>
@@ -138,7 +138,7 @@
           <w:rFonts w:ascii="Arial" w:hAnsi="Arial"/>
           <w:sz w:val="24"/>
         </w:rPr>
-        <w:t>. It means to be reliable, to be trustworthy, faithful.</w:t>
+        <w:t>. It means to be reliable, to be trustworthy, and to be dependable.</w:t>
       </w:r>
     </w:p>
     <w:p>
@@ -150,7 +150,7 @@
           <w:rFonts w:ascii="Arial" w:hAnsi="Arial"/>
           <w:sz w:val="24"/>
         </w:rPr>
-        <w:t>Now, we often say God is faithful. First Corinthians chapter 10 verse 13 says God is faithful:</w:t>
+        <w:t>Believers often say, 'God is faithful.' First Corinthians 10:13 affirms that God is faithful:</w:t>
       </w:r>
     </w:p>
     <w:p>
@@ -191,34 +191,7 @@
           <w:rFonts w:ascii="Arial" w:hAnsi="Arial"/>
           <w:sz w:val="24"/>
         </w:rPr>
-        <w:t xml:space="preserve">He is faithful. We say that. </w:t>
-      </w:r>
-      <w:r>
-        <w:rPr>
-          <w:rFonts w:ascii="Arial" w:hAnsi="Arial"/>
-          <w:i/>
-          <w:sz w:val="24"/>
-        </w:rPr>
-        <w:t>You know why?</w:t>
-      </w:r>
-      <w:r>
-        <w:rPr>
-          <w:rFonts w:ascii="Arial" w:hAnsi="Arial"/>
-          <w:sz w:val="24"/>
-        </w:rPr>
-        <w:t xml:space="preserve"> Because He is reliable. What else? He is always available. He does not change His commitment. He does not change His word in spite and despite opposing circumstances. That is why faithfulness is also called loyalty, and loyalty means to be committed to a cause 100%—to be committed to a cause 100%.</w:t>
-      </w:r>
-    </w:p>
-    <w:p>
-      <w:pPr>
-        <w:spacing w:before="80" w:after="80" w:line="276" w:lineRule="auto"/>
-      </w:pPr>
-      <w:r>
-        <w:rPr>
-          <w:rFonts w:ascii="Arial" w:hAnsi="Arial"/>
-          <w:sz w:val="24"/>
-        </w:rPr>
-        <w:t>So Paul is saying it is required of a steward—a believer is a steward—that one be found loyal, loyal to what one is doing, to be faithful, to be found loyal.</w:t>
+        <w:t>God is faithful because He is reliable. He is always available. He does not alter His commitment, nor does He change His word in spite and despite opposing extremities. That is why faithfulness is also called loyalty, and loyalty means to be committed to a cause one hundred percent. Paul is saying that it is required of a steward to be found loyal—loyal to what one is doing, faithful, and dependable under every circumstance.</w:t>
       </w:r>
     </w:p>
     <w:p>
@@ -243,7 +216,7 @@
           <w:rFonts w:ascii="Arial" w:hAnsi="Arial"/>
           <w:sz w:val="24"/>
         </w:rPr>
-        <w:t>I look at Ruth and Naomi. When Ruth told Naomi:</w:t>
+        <w:t>Consider Ruth and Naomi. When Ruth spoke to Naomi:</w:t>
       </w:r>
     </w:p>
     <w:p>
@@ -284,7 +257,7 @@
           <w:rFonts w:ascii="Arial" w:hAnsi="Arial"/>
           <w:sz w:val="24"/>
         </w:rPr>
-        <w:t>She was not looking for anything. That is faithfulness.</w:t>
+        <w:t>Ruth was not looking for anything in return, and that is faithfulness.</w:t>
       </w:r>
     </w:p>
     <w:p>
@@ -296,7 +269,7 @@
           <w:rFonts w:ascii="Arial" w:hAnsi="Arial"/>
           <w:sz w:val="24"/>
         </w:rPr>
-        <w:t>There is a difference between faithfulness and ambition. And one of the ways one knows whether they are faithful or just ambitious is if their desires are not given to them. There are people who join a church or join a place so that they can rise through the ranks. They will be acting faithful, but the way one will know that they are not: any little alteration, they will change. That means they were never faithful.</w:t>
+        <w:t>There is a fundamental difference between faithfulness and ambition. One of the ways to know whether an individual is faithful or merely ambitious is when their personal desires are delayed or not given to them. There are people who join a church or enter a fellowship solely so that they can rise through the ranks. They put on an act of faithfulness, but at any slight alteration or denial of their personal desires, their attitude changes immediately. That sudden change proves they were never faithful.</w:t>
       </w:r>
     </w:p>
     <w:p>
@@ -308,7 +281,7 @@
           <w:rFonts w:ascii="Arial" w:hAnsi="Arial"/>
           <w:sz w:val="24"/>
         </w:rPr>
-        <w:t>So faithfulness has nothing to do with circumstances. God gave His word, but look at what He walked through before Christ died on the cross—it was a lot of negativities, extremities. Faithful men do not break under pressure. No, the faithful man is reliable, no excuses.</w:t>
+        <w:t>Faithfulness has nothing to do with fluctuating circumstances. God gave His word, yet consider what He walked through before Christ died on the cross—it involved intense extremities and opposition. Faithful men do not break under pressure; they remain reliable, offering no excuses.</w:t>
       </w:r>
     </w:p>
     <w:p>
@@ -321,7 +294,7 @@
           <w:b/>
           <w:sz w:val="24"/>
         </w:rPr>
-        <w:t>Serving with All the Heart: Elisha Pouring Water on Elijah's Hands</w:t>
+        <w:t>Faithful Men Do Not Break Under Pressure: Elijah and Elisha</w:t>
       </w:r>
     </w:p>
     <w:p>
@@ -333,7 +306,7 @@
           <w:rFonts w:ascii="Arial" w:hAnsi="Arial"/>
           <w:sz w:val="24"/>
         </w:rPr>
-        <w:t>We find Elijah and Elisha. Elisha did not know all that was going on; he just followed Elijah faithfully. Historical facts indicate Elisha came from a wealthy family and he probably was older, yet he served Elijah with all his heart. When the king asked who has the word of the Lord, he said:</w:t>
+        <w:t>Consider Elijah and Elisha. Elisha did not know all that lay ahead; he simply followed Elijah faithfully. Historical records suggest Elisha came from a wealthy agricultural family and was likely older, yet he served Elijah with all his heart. When the king asked who possessed the word of the Lord, the answer given was:</w:t>
       </w:r>
     </w:p>
     <w:p>
@@ -374,7 +347,7 @@
           <w:rFonts w:ascii="Arial" w:hAnsi="Arial"/>
           <w:sz w:val="24"/>
         </w:rPr>
-        <w:t xml:space="preserve">He poured water—a symbolic term on the hands of Elijah, which means he served him faithfully. And he followed him through. Notice as they were pressing through Jericho before Jordan, all the sons of the prophets stayed behind. </w:t>
+        <w:t xml:space="preserve">Pouring water on the hands of Elijah was a term signifying that he served him faithfully. Elisha followed him through. As they pressed past Jericho toward the Jordan, the sons of the prophets stayed behind, asking, </w:t>
       </w:r>
       <w:r>
         <w:rPr>
@@ -382,14 +355,14 @@
           <w:i/>
           <w:sz w:val="24"/>
         </w:rPr>
-        <w:t>They said, 'Why are you following this man? What are you following him for? Don't you know he is going today?'</w:t>
+        <w:t>'Why are you following this man? What are you following him for? Do you not know he is going away today?'</w:t>
       </w:r>
       <w:r>
         <w:rPr>
           <w:rFonts w:ascii="Arial" w:hAnsi="Arial"/>
           <w:sz w:val="24"/>
         </w:rPr>
-        <w:t xml:space="preserve"> Elisha did not answer them; he kept following. When Elijah said, 'What do you ask of me?' Elisha said, 'I want a double portion of your spirit,' which is the firstborn inheritance to be the head of the prophets.</w:t>
+        <w:t xml:space="preserve"> Elisha did not answer their cynicism; he kept following. When Elijah asked, 'What do you ask of me?' Elisha replied, 'I want a double portion of your spirit,' which was the firstborn inheritance to head the company of the prophets.</w:t>
       </w:r>
     </w:p>
     <w:p>
@@ -401,7 +374,7 @@
           <w:rFonts w:ascii="Arial" w:hAnsi="Arial"/>
           <w:sz w:val="24"/>
         </w:rPr>
-        <w:t>Elijah said, 'What you ask of me is very hard, but if you see me go, it shall be so.' And Elisha was there faithful.</w:t>
+        <w:t>Elijah told him, 'You have asked a hard thing; nevertheless, if you see me when I am taken from you, it shall be so.' And Elisha remained faithful.</w:t>
       </w:r>
     </w:p>
     <w:p>
@@ -414,7 +387,7 @@
           <w:i/>
           <w:sz w:val="24"/>
         </w:rPr>
-        <w:t>And one knows he did not do it for himself. As soon as he left—and I shared a bit of that in church today about Jordan—and the mantle came on him and he split the Jordan, he said:</w:t>
+        <w:t>One knows he was not acting for himself by what took place after Elijah was taken up and the mantle fell upon him. As he split the Jordan, he cried:</w:t>
       </w:r>
     </w:p>
     <w:p>
@@ -455,20 +428,7 @@
           <w:rFonts w:ascii="Arial" w:hAnsi="Arial"/>
           <w:sz w:val="24"/>
         </w:rPr>
-        <w:t>That is what he said. That is faithfulness. Nothing changed; he was not doing it for himself. 'Where is the Lord God?' He did not say, 'Where is the God of Elisha?' No, he said, 'Where is the Lord God of Elijah?' He is letting everybody know, 'I am wearing Elijah's ministry.' That is a faithful person. He is loyal, just like Joshua. Joshua stayed with the fact that this is the instruction of Moses, the servant of the Lord.</w:t>
-      </w:r>
-    </w:p>
-    <w:p>
-      <w:pPr>
-        <w:spacing w:before="80" w:after="80" w:line="276" w:lineRule="auto"/>
-      </w:pPr>
-      <w:r>
-        <w:rPr>
-          <w:rFonts w:ascii="Arial" w:hAnsi="Arial"/>
-          <w:i/>
-          <w:sz w:val="24"/>
-        </w:rPr>
-        <w:t>Joshua did not use Moses to preach, saying, 'Moses could have brought us here, but he is not the one that eventually entered; you know what happened to him.' No! He stayed with the fact that this is Moses' instruction.</w:t>
+        <w:t>Notice his cry: 'Where is the Lord God of Elijah?' He did not say, 'Where is the God of Elisha?' He made it known to everyone that he was wearing Elijah's ministry under the same God. That is a faithful person.</w:t>
       </w:r>
     </w:p>
     <w:p>
@@ -480,7 +440,19 @@
           <w:rFonts w:ascii="Arial" w:hAnsi="Arial"/>
           <w:sz w:val="24"/>
         </w:rPr>
-        <w:t>Loyal, faithful people do not do otherwise when leadership is not there. Faithful people will do in the service what they would have done if Jesus were seated in the front seat. Faithful people will do in the service what they would have done if Pastor were seated in the service. It is not because leadership is present; in fact, they do things behind leadership as though leadership were seated there. It is required of a steward that a man be found faithful, reliable under every circumstance—trustworthy.</w:t>
+        <w:t>He was loyal, just like Joshua. Joshua stood upon the fact that he was executing the instructions of Moses, the servant of the Lord. Joshua never used Moses' human shortcomings to preach, saying, 'Moses could have brought us in, but he was not the one who eventually entered; you know what happened to him.' Joshua stayed strictly with Moses' instructions.</w:t>
+      </w:r>
+    </w:p>
+    <w:p>
+      <w:pPr>
+        <w:spacing w:before="80" w:after="80" w:line="276" w:lineRule="auto"/>
+      </w:pPr>
+      <w:r>
+        <w:rPr>
+          <w:rFonts w:ascii="Arial" w:hAnsi="Arial"/>
+          <w:sz w:val="24"/>
+        </w:rPr>
+        <w:t>Loyal, faithful people do not act otherwise when leadership is absent. Faithful people conduct themselves in the service precisely as they would if Jesus were seated in the front row. Faithful people do in the service what they would do if their Pastor were seated right there. They do not act diligently merely because leadership is looking; in fact, they handle things behind leadership as though leadership were present. It is required in stewards that a man be found faithful, reliable, and trustworthy under every circumstance.</w:t>
       </w:r>
     </w:p>
     <w:p>
@@ -506,7 +478,7 @@
           <w:i/>
           <w:sz w:val="24"/>
         </w:rPr>
-        <w:t>Look at what Pastor Somi shared with us at the Believers Convention. I told him I was going to make it a teaching.</w:t>
+        <w:t>At the Believers Convention, Pastor Somi shared thoughts that highlighted Timothy's consistent faithfulness throughout Paul's writings.</w:t>
       </w:r>
     </w:p>
     <w:p>
@@ -518,7 +490,7 @@
           <w:rFonts w:ascii="Arial" w:hAnsi="Arial"/>
           <w:sz w:val="24"/>
         </w:rPr>
-        <w:t>We saw Timothy everywhere. One can readily call Paul's epistles Timothy's epistles—faithful, everywhere.</w:t>
+        <w:t>One could readily call Paul's epistles Timothy's epistles, because Timothy was faithful and present everywhere.</w:t>
       </w:r>
     </w:p>
     <w:p>
@@ -530,7 +502,7 @@
           <w:rFonts w:ascii="Arial" w:hAnsi="Arial"/>
           <w:sz w:val="24"/>
         </w:rPr>
-        <w:t>Proverbs 25:19:</w:t>
+        <w:t>In contrast, Proverbs 25:19 describes the pain of unfaithfulness:</w:t>
       </w:r>
     </w:p>
     <w:p>
@@ -572,7 +544,7 @@
           <w:i/>
           <w:sz w:val="24"/>
         </w:rPr>
-        <w:t>I have experienced it too. A broken tooth is painful; it cannot chew. A foot out of joint cannot walk.</w:t>
+        <w:t>I have experienced this as well. A broken tooth is painful and cannot chew; a foot out of joint cannot walk.</w:t>
       </w:r>
     </w:p>
     <w:p>
@@ -584,7 +556,7 @@
           <w:rFonts w:ascii="Arial" w:hAnsi="Arial"/>
           <w:sz w:val="24"/>
         </w:rPr>
-        <w:t>An individual is there, they have a responsibility—they have been made a cell leader, their name is on the roll, they are a head of department or a pastor—but they are like a broken tooth: we cannot chew, we cannot walk, yet they are there.</w:t>
+        <w:t>When an individual has been given responsibility—whether as a cell leader, head of department, or pastor—their name may be on the roll, but if they are unfaithful, they are like a broken tooth: the church cannot chew and cannot walk, yet they occupy the position.</w:t>
       </w:r>
     </w:p>
     <w:p>
@@ -596,7 +568,7 @@
           <w:rFonts w:ascii="Arial" w:hAnsi="Arial"/>
           <w:sz w:val="24"/>
         </w:rPr>
-        <w:t>Anybody who says that what one does in the service of God has no consequence is deceiving people.</w:t>
+        <w:t>Anyone who claims that what one does in the service of God carries no consequences is deceiving people.</w:t>
       </w:r>
     </w:p>
     <w:p>
@@ -609,7 +581,7 @@
           <w:i/>
           <w:sz w:val="24"/>
         </w:rPr>
-        <w:t>There was a guy I told last year: 'Read my lips. Before you were born, I have been teaching unconditional forgiveness. Before you were even old enough to go to hell, I have been teaching the grace of God. Watch—read my lips: you will bear the consequences.' He did not do anything to me personally, but I said, 'Hear what I have said very well: when you are serving God, you do not joke.'</w:t>
+        <w:t>I told an individual last year: 'Read my lips. Before you were born, I was already teaching unconditional forgiveness. Before you were even eligible to go to hell, I was teaching the grace of God. But watch—read my lips: you will bear the consequences of your actions.' He had done nothing to me personally, but I told him: 'When you are serving God, you do not joke.'</w:t>
       </w:r>
     </w:p>
     <w:p>
@@ -621,7 +593,7 @@
           <w:rFonts w:ascii="Arial" w:hAnsi="Arial"/>
           <w:sz w:val="24"/>
         </w:rPr>
-        <w:t>God practically treasures lives. That is why Jesus said:</w:t>
+        <w:t>God practically treasures human lives. That is why the Lord Jesus declared:</w:t>
       </w:r>
     </w:p>
     <w:p>
@@ -676,7 +648,7 @@
           <w:i/>
           <w:sz w:val="24"/>
         </w:rPr>
-        <w:t>Somebody from church came to me making plans to leave the country. I said, 'Okay, you want to leave the country—no problem. Have you thought about the people that you disciple?' He said, 'Oh, I was just thinking that since my pastor knows them...' You get to the US, the UK, or Canada, and you start to struggle in ministry, and you wonder why you are struggling. In Nigeria, you treated God's people like that! He said, 'My pastor should...' very casually. I said, 'No, you ought to have been thinking about these ones!'</w:t>
+        <w:t>A church member once came to me outlining plans to relocate abroad. I asked him, 'Have you thought about the people you disciple?' He replied casually, 'I was just thinking that since my pastor knows them, the church will take care of them.' You arrive in the United States, the United Kingdom, or Canada, and you start struggling in ministry, wondering why you are struggling—it is because back in Nigeria you treated God's people casually! I told him, 'No, you ought to have been thinking about these souls!'</w:t>
       </w:r>
     </w:p>
     <w:p>
@@ -688,7 +660,7 @@
           <w:rFonts w:ascii="Arial" w:hAnsi="Arial"/>
           <w:sz w:val="24"/>
         </w:rPr>
-        <w:t>People feel that those things are just for Saints Community—just bring people, dump them in the service, and say, 'Yeah, we are changing lives,' until another natural opportunity changes them. No—one million times no! A leader cannot think outside those people. Whatever one does to lives is how God sees them.</w:t>
+        <w:t>People often act as though discipleship is merely bringing people, dumping them into a service, and declaring that lives are being changed, until another personal opportunity changes them. A leader cannot think outside the people committed to their care. Whatever one does to human lives is how God evaluates their faithfulness.</w:t>
       </w:r>
     </w:p>
     <w:p>
@@ -700,7 +672,7 @@
           <w:rFonts w:ascii="Arial" w:hAnsi="Arial"/>
           <w:sz w:val="24"/>
         </w:rPr>
-        <w:t>Lives are like treasure; lives are like money. Most who are cell leaders have twenty or thirty people under their care; some have forty or fifty; some fellowship leaders have more than that. And then for the same twenty people, the leader does not have time for them. The leader says, 'Well, the nature of my job, you know where I live.' Excuses enough for the Old Testament have been reeled out, while praying for increase!</w:t>
+        <w:t>Lives are like treasure; lives are like money. Most cell leaders have twenty or thirty people under their care; some have forty or fifty, and fellowship leaders have even more. Yet for those same twenty people, the leader claims they have no time, citing demanding jobs or distant residences, reeling out excuses enough for the Old Testament while praying for increase.</w:t>
       </w:r>
     </w:p>
     <w:p>
@@ -713,7 +685,7 @@
           <w:b/>
           <w:sz w:val="24"/>
         </w:rPr>
-        <w:t>Lives Are Like Money: The Akara Business Illustration</w:t>
+        <w:t>Lives Are Like Money: The Akara Illustration</w:t>
       </w:r>
     </w:p>
     <w:p>
@@ -725,7 +697,7 @@
           <w:rFonts w:ascii="Arial" w:hAnsi="Arial"/>
           <w:sz w:val="24"/>
         </w:rPr>
-        <w:t>How will increase come?</w:t>
+        <w:t>How can increase come under such negligence?</w:t>
       </w:r>
     </w:p>
     <w:p>
@@ -738,7 +710,31 @@
           <w:i/>
           <w:sz w:val="24"/>
         </w:rPr>
-        <w:t>Consider the example I gave yesterday: If you give somebody one hundred thousand naira to go and do business—to fry akara (akara is bean cake). The person is happy: 'Oh, you gave me 100k so I can fry akara!' Then two weeks, three weeks, one month passes. He starts sending text messages: 'Sorry, you know there is COVID, people are not really eating akara again because they are wearing masks.' Three weeks after: 'You know beans is now expensive.'</w:t>
+        <w:t>Consider the example I gave yesterday: Suppose you give someone one hundred thousand naira to start a business frying akara (bean cakes). The individual is ecstatic at receiving the capital. But two weeks, three weeks, and a month pass, and he begins sending text messages: 'Sorry, COVID came; people are wearing masks and not eating akara.' Three weeks later, he says, 'Beans is now expensive.' When asked for the one hundred thousand naira capital, he replies, 'The capital is gone, but to the glory of God, over the next year I can recover twenty thousand naira for you.' Then he attends a convention praying for one million naira! Anyone who gives him fifty thousand naira is acting foolishly, because look at his track record. Yet leaders do the same: ten souls were committed to their cell, nine vanished through neglect with only a cousin remaining, and they stand praying for increase. More of what?</w:t>
+      </w:r>
+    </w:p>
+    <w:p>
+      <w:pPr>
+        <w:spacing w:before="80" w:after="80" w:line="276" w:lineRule="auto"/>
+      </w:pPr>
+      <w:r>
+        <w:rPr>
+          <w:rFonts w:ascii="Arial" w:hAnsi="Arial"/>
+          <w:sz w:val="24"/>
+        </w:rPr>
+        <w:t>Lives are an investment. The person who preached the gospel to you invested, and your flock represents that continued investment. For every life a leader builds, other lives are impacted; but for every life a leader neglects, lives are being wasted.</w:t>
+      </w:r>
+    </w:p>
+    <w:p>
+      <w:pPr>
+        <w:spacing w:before="80" w:after="80" w:line="276" w:lineRule="auto"/>
+      </w:pPr>
+      <w:r>
+        <w:rPr>
+          <w:rFonts w:ascii="Arial" w:hAnsi="Arial"/>
+          <w:sz w:val="24"/>
+        </w:rPr>
+        <w:t>Leaders must give daily reports on what they do concerning the lives under their charge. When a leader fails to report daily and offers excuses about depleted data or power outages, they are cultivating an unfaithful path.</w:t>
       </w:r>
     </w:p>
     <w:p>
@@ -751,43 +747,7 @@
           <w:i/>
           <w:sz w:val="24"/>
         </w:rPr>
-        <w:t>Where is the 100k? 'We cannot get the 100k back, but to the glory of God, in the next one year I can get you 20k back.' And then you come back at a convention saying, 'I want to get one million! We are changing lives!' Anybody that gives you fifty thousand naira is an idiot, because look at your track record! Ten souls were given to you, only one remains, and that one is your cousin—and you say you want more? More of what?</w:t>
-      </w:r>
-    </w:p>
-    <w:p>
-      <w:pPr>
-        <w:spacing w:before="80" w:after="80" w:line="276" w:lineRule="auto"/>
-      </w:pPr>
-      <w:r>
-        <w:rPr>
-          <w:rFonts w:ascii="Arial" w:hAnsi="Arial"/>
-          <w:sz w:val="24"/>
-        </w:rPr>
-        <w:t>Lives are like an investment. For every life, the person who preached the gospel invested, and that investment is in the flock. The person who saw to it that one grew in the Word was investing in lives they did not even know.</w:t>
-      </w:r>
-    </w:p>
-    <w:p>
-      <w:pPr>
-        <w:spacing w:before="80" w:after="80" w:line="276" w:lineRule="auto"/>
-      </w:pPr>
-      <w:r>
-        <w:rPr>
-          <w:rFonts w:ascii="Arial" w:hAnsi="Arial"/>
-          <w:sz w:val="24"/>
-        </w:rPr>
-        <w:t>Lives are like money. For every one person whose life is changed, other lives are being changed. Look at the reverse case: for every one person whose life is wasted, other lives are being wasted.</w:t>
-      </w:r>
-    </w:p>
-    <w:p>
-      <w:pPr>
-        <w:spacing w:before="80" w:after="80" w:line="276" w:lineRule="auto"/>
-      </w:pPr>
-      <w:r>
-        <w:rPr>
-          <w:rFonts w:ascii="Arial" w:hAnsi="Arial"/>
-          <w:sz w:val="24"/>
-        </w:rPr>
-        <w:t>Every day, give reports on what is done concerning lives. When a leader fails to do it daily and excuses it—'My data finished, there was no power'—a destructive path is being created.</w:t>
+        <w:t>If we were to announce an incentive of one thousand dollars per soul won, there would be no street left unreached—covering the earth would happen within a single month! Ten souls would mean ten thousand dollars, and immediately people would calculate the conversion rate. For one hundred souls, that would be one hundred thousand dollars—fifty million naira. People would ask, 'Pastor, why can't we hold outreaches every day?' No one would claim evening fatigue; they would declare, 'I am not tired in Jesus; I have the strength of God! What useless sleep am I sleeping? I am for the Lord!' Why? Because money is attached. Yet human lives are spiritual currency; they are infinitely expensive.</w:t>
       </w:r>
     </w:p>
     <w:p>
@@ -800,20 +760,7 @@
           <w:i/>
           <w:sz w:val="24"/>
         </w:rPr>
-        <w:t>If we were to say one thousand dollars per soul, there would be no street left uncovered—'covering the earth' would happen in one month! One thousand dollars: that means ten souls is ten thousand dollars. Immediately, the conversion rate is calculated. One hundred souls: 'Pastor, why can't we do Storm every day?' One hundred souls is one hundred thousand dollars—fifty million naira. Why wouldn't someone win one hundred souls a day? The excuse of being tired in the evening would vanish: 'I am not tired in Jesus! I have the strength of God! What useless sleep am I sleeping? I am for the Lord!' Why? Because money is attached. But those lives are money—they are expensive, very expensive.</w:t>
-      </w:r>
-    </w:p>
-    <w:p>
-      <w:pPr>
-        <w:spacing w:before="80" w:after="80" w:line="276" w:lineRule="auto"/>
-      </w:pPr>
-      <w:r>
-        <w:rPr>
-          <w:rFonts w:ascii="Arial" w:hAnsi="Arial"/>
-          <w:i/>
-          <w:sz w:val="24"/>
-        </w:rPr>
-        <w:t>Recently, I had this very troubling headache. Somebody in the room said, 'Pastor, rest.' I said, 'No. I know I should rest, but I will be fine. There is work to be done. I will look away from it and act like the Word of God is true. This job has to be done.'</w:t>
+        <w:t>Recently, I suffered a very severe headache. Someone in the room suggested, 'Pastor, you should rest.' I replied, 'No. I know I should rest, but there is work to be done. I will look away from physical symptoms and act like the Word of God is true. The job has to be done.'</w:t>
       </w:r>
     </w:p>
     <w:p>
@@ -838,7 +785,7 @@
           <w:rFonts w:ascii="Arial" w:hAnsi="Arial"/>
           <w:sz w:val="24"/>
         </w:rPr>
-        <w:t>Jesus said:</w:t>
+        <w:t>As Jesus declared:</w:t>
       </w:r>
     </w:p>
     <w:p>
@@ -879,7 +826,7 @@
           <w:rFonts w:ascii="Arial" w:hAnsi="Arial"/>
           <w:sz w:val="24"/>
         </w:rPr>
-        <w:t>Who will commit much to your hands? Sometimes people look at numerically grown churches and think, 'It is because they are preaching false doctrine.' Go and try preaching false doctrine and let us see! Are there not people preaching false doctrine in your backyard? People think, 'It is because they are using oil and mantles.' That is not it! In many instances, you find people who are totally dedicated to what they are doing, totally given to it.</w:t>
+        <w:t>If a leader is not faithful with little, who will commit greater trust into their hands? People sometimes observe numerically large churches and assume their growth is merely the result of preaching false doctrine, using mantles, or distributing anointing oil. That is not the case. In many instances, those works expand because the people involved are totally dedicated, disciplined, and hardworking. Erroneous doctrine in itself does not build; dedication and discipline do.</w:t>
       </w:r>
     </w:p>
     <w:p>
@@ -892,7 +839,7 @@
           <w:i/>
           <w:sz w:val="24"/>
         </w:rPr>
-        <w:t>My dad told me that success is planned. He said that when he got to school, because he knew his reading attention span was just one hour, he ensured that he read one hour five times a day. He cut short a lot of activities and he made a first class. He planned it.</w:t>
+        <w:t>My father always told me that success is planned. When he entered the university, knowing his reading attention span did not exceed one hour, he did not surrender to that limitation. Instead, he ensured that he read for one hour five separate times each day, resting between sessions. He cut short unnecessary social activities and graduated with first-class honors. He planned his success.</w:t>
       </w:r>
     </w:p>
     <w:p>
@@ -904,7 +851,7 @@
           <w:rFonts w:ascii="Arial" w:hAnsi="Arial"/>
           <w:sz w:val="24"/>
         </w:rPr>
-        <w:t>In the same way, ministry cannot just grow because one is praying. Praying while doing the exact opposite is like having bullets and no gun to shoot them. The prayer is the ammunition, but it is not being utilized through practical execution.</w:t>
+        <w:t>In the same way, ministry cannot grow merely because one is praying while neglecting practical execution. Praying without disciplined planning is like stockpiling ammunition in an armory without having a firearm to shoot it. Prayer provides the spiritual ammunition, but practical execution must discharge it.</w:t>
       </w:r>
     </w:p>
     <w:p>
@@ -917,7 +864,7 @@
           <w:i/>
           <w:sz w:val="24"/>
         </w:rPr>
-        <w:t>I told the pastors that for every soul that comes to our conventions—while we may not be able to account for those from other churches—we must give account of each one of ours. If we do not learn to do it with ten thousand, we will not be able to do it with one hundred thousand or one million. We must show accountability.</w:t>
+        <w:t>I told our pastors that for every soul attending our conventions, while we may not account for visitors from other churches, we must give an accurate account of every single one of our own members. If we do not learn accountability with ten thousand, we will never manage one hundred thousand or one million. We must demonstrate accountability.</w:t>
       </w:r>
     </w:p>
     <w:p>
@@ -929,7 +876,7 @@
           <w:rFonts w:ascii="Arial" w:hAnsi="Arial"/>
           <w:sz w:val="24"/>
         </w:rPr>
-        <w:t>Faithfulness is the breath of ministry: always being at one's duty post. The holiday period is not a holiday for ministry. No, it is not!</w:t>
+        <w:t>Faithfulness is the breath of ministry: it means always being at one's duty post.</w:t>
       </w:r>
     </w:p>
     <w:p>
@@ -952,10 +899,9 @@
       <w:r>
         <w:rPr>
           <w:rFonts w:ascii="Arial" w:hAnsi="Arial"/>
-          <w:i/>
           <w:sz w:val="24"/>
         </w:rPr>
-        <w:t>A holiday from the government is not a gift. If you are a businessman and took credit from the bank, interest runs on the holiday while you are praying on Sunday morning! How much more in ministry?</w:t>
+        <w:t>The holiday season is not a holiday from ministry. A public holiday declared by the government does not suspend ministerial responsibility. If a businessman took a loan from the bank, interest runs through the holiday, even on Sunday morning while he is in church. How much more in spiritual ministry?</w:t>
       </w:r>
     </w:p>
     <w:p>
@@ -968,20 +914,7 @@
           <w:i/>
           <w:sz w:val="24"/>
         </w:rPr>
-        <w:t>One day I was coming back from the US on Christmas Day. I was in Dallas and Brother Pelumi was hosting me. Somehow we got talking and hugging, and I missed my flight. (I did that with Femi Adetimobi too at the airport).</w:t>
-      </w:r>
-    </w:p>
-    <w:p>
-      <w:pPr>
-        <w:spacing w:before="80" w:after="80" w:line="276" w:lineRule="auto"/>
-      </w:pPr>
-      <w:r>
-        <w:rPr>
-          <w:rFonts w:ascii="Arial" w:hAnsi="Arial"/>
-          <w:i/>
-          <w:sz w:val="24"/>
-        </w:rPr>
-        <w:t>On Christmas Day, on the plane, I made observations: security personnel were working, planes were operating, air traffic controllers were directing planes without singing 'Jingle Bells.' Doctors were working on call on Christmas Day. Babies were being born on Christmas Day, and doctors were on duty. The police were saying, 'Merry Christmas, please let me check your car boot.' Everybody was working around the clock. So I told myself: 'I am a preacher of the gospel; I must be alert.'</w:t>
+        <w:t>One Christmas Day, while returning from the United States through Dallas where Brother Pelumi was hosting me, we spent so much time greeting and talking that I missed my flight. Later, while traveling, I observed that security personnel were actively on duty, airplanes were operating, and air traffic controllers were directing flights without distraction. Doctors were on call delivering babies on Christmas Day, and police officers were inspecting vehicle trunks while greeting motorists with 'Merry Christmas.' Operations were running around the clock. I told myself: 'I am a preacher of the gospel; I must maintain spiritual alertness.'</w:t>
       </w:r>
     </w:p>
     <w:p>
@@ -993,7 +926,7 @@
           <w:rFonts w:ascii="Arial" w:hAnsi="Arial"/>
           <w:sz w:val="24"/>
         </w:rPr>
-        <w:t>One must be faithful with time, faithful with alertness in the things committed to them.</w:t>
+        <w:t>A minister must be faithful with time and faithful with alertness in all assigned duties.</w:t>
       </w:r>
     </w:p>
     <w:p>
@@ -1018,7 +951,7 @@
           <w:rFonts w:ascii="Arial" w:hAnsi="Arial"/>
           <w:sz w:val="24"/>
         </w:rPr>
-        <w:t>Things will come to test that one is faithful. Remember when Eliab was to be anointed by Samuel in 1 Samuel 16? Samuel said, 'Surely the Lord's anointed is before me.' But the Lord said, 'No, it is not Eliab; I have rejected him.' The Hebrew carries the force of someone who failed the test.</w:t>
+        <w:t>Circumstances will come to test an individual's faithfulness. When Samuel went to Bethlehem to anoint a king in 1 Samuel 16, he looked upon Eliab and assumed he was the Lord's anointed. But the Lord told Samuel that He had rejected Eliab. In the Hebrew text, the word carries the meaning of someone who failed the test.</w:t>
       </w:r>
     </w:p>
     <w:p>
@@ -1030,7 +963,7 @@
           <w:rFonts w:ascii="Arial" w:hAnsi="Arial"/>
           <w:sz w:val="24"/>
         </w:rPr>
-        <w:t>One never knows when the test comes. God tests people—not so that they fail, but the way one test-drives a car. Look at what He said about Job: 'Have you considered My servant Job?' What a boast! He has integrity.</w:t>
+        <w:t>One never knows when a test arrives. God tests people—not to destroy them, but the way an automobile is test-driven to verify its integrity. God boasted of Job: 'Have you considered My servant Job?' When trials come, James instructs:</w:t>
       </w:r>
     </w:p>
     <w:p>
@@ -1101,7 +1034,7 @@
           <w:rFonts w:ascii="Arial" w:hAnsi="Arial"/>
           <w:sz w:val="24"/>
         </w:rPr>
-        <w:t>When one runs from tests, one runs from the character required to do the work of the ministry.</w:t>
+        <w:t>When an individual runs from tests, they run from the very character required for ministry.</w:t>
       </w:r>
     </w:p>
     <w:p>
@@ -1113,7 +1046,7 @@
           <w:rFonts w:ascii="Arial" w:hAnsi="Arial"/>
           <w:sz w:val="24"/>
         </w:rPr>
-        <w:t>In 1 Timothy chapter 3, Paul writes concerning deacons—the associates of the pastor:</w:t>
+        <w:t>In 1 Timothy 3, Paul writes concerning deacons—the associates of the pastor:</w:t>
       </w:r>
     </w:p>
     <w:p>
@@ -1183,7 +1116,7 @@
           <w:rFonts w:ascii="Arial" w:hAnsi="Arial"/>
           <w:sz w:val="24"/>
         </w:rPr>
-        <w:t>Let them be examined closely, tested thoroughly. Who does the proving? Does Paul say the Spirit of God will prove them? No—the leader will do it! In leadership, one opens their eyes to know people and their true character.</w:t>
+        <w:t>To be proved means to be examined closely and tested thoroughly. Who does the proving? Paul does not say that the Holy Spirit will perform this proving in a mystical manner; rather, leadership must do it. In leadership, one must keep their eyes open to observe people and perceive their true character.</w:t>
       </w:r>
     </w:p>
     <w:p>
@@ -1224,7 +1157,7 @@
           <w:rFonts w:ascii="Arial" w:hAnsi="Arial"/>
           <w:sz w:val="24"/>
         </w:rPr>
-        <w:t>'Approved' is the same word: tested—a tested workman. A leader cannot be untested.</w:t>
+        <w:t>The word 'approved' denotes one who has been tested. A leader cannot be untested; there must be proven experience through testing.</w:t>
       </w:r>
     </w:p>
     <w:p>
@@ -1236,7 +1169,7 @@
           <w:rFonts w:ascii="Arial" w:hAnsi="Arial"/>
           <w:sz w:val="24"/>
         </w:rPr>
-        <w:t>When the apostles in Acts 15 were going to send Paul and Barnabas to the Gentile churches:</w:t>
+        <w:t>When the apostles in Acts 15 sent representatives to the Gentile churches, they commended Paul and Barnabas with these words:</w:t>
       </w:r>
     </w:p>
     <w:p>
@@ -1277,7 +1210,7 @@
           <w:rFonts w:ascii="Arial" w:hAnsi="Arial"/>
           <w:sz w:val="24"/>
         </w:rPr>
-        <w:t>They knew they had been proven. They put everything on the table. The apostles said, 'We know these men; we have seen them through hard times. They are not fair-weather men; listen to them.'</w:t>
+        <w:t>They were chosen because they had been proven. They had put everything on the line, having stood firm through severe adversity rather than being fair-weather workers.</w:t>
       </w:r>
     </w:p>
     <w:p>
@@ -1290,7 +1223,7 @@
           <w:i/>
           <w:sz w:val="24"/>
         </w:rPr>
-        <w:t>There are people who joined this church and ran away. Why? They were trying to get visibility. Even if you were an Archbishop where you came from, pocket it at the door when you arrive here! Join membership class. We will test you with the Operations department, then Works, then Security. Those who were singing were assigned to Operations to watch toilets!</w:t>
+        <w:t>There are individuals who joined this church and quickly left because their objective was mere personal visibility. Even if someone arrived carrying the title of an Archbishop from elsewhere, they must pocket that title at the door, attend membership classes, and undergo testing in the Operations department, Works, or Security. Those who came desiring only to sing in the choir were assigned to Operations to clean the restrooms.</w:t>
       </w:r>
     </w:p>
     <w:p>
@@ -1302,7 +1235,7 @@
           <w:rFonts w:ascii="Arial" w:hAnsi="Arial"/>
           <w:sz w:val="24"/>
         </w:rPr>
-        <w:t>People must be proven. Did one come to have a position, or to serve? If one came to serve, anywhere they are placed, they will serve.</w:t>
+        <w:t>Workers must be proven. If someone came to serve rather than to seek a position, they will gladly serve wherever they are placed.</w:t>
       </w:r>
     </w:p>
     <w:p>
@@ -1315,7 +1248,7 @@
           <w:b/>
           <w:sz w:val="24"/>
         </w:rPr>
-        <w:t>Joseph vs. Gehazi: Integrity Across Circumstances</w:t>
+        <w:t>Joseph vs. Gehazi: Faithfulness Across Every Circumstance</w:t>
       </w:r>
     </w:p>
     <w:p>
@@ -1339,7 +1272,7 @@
           <w:rFonts w:ascii="Arial" w:hAnsi="Arial"/>
           <w:sz w:val="24"/>
         </w:rPr>
-        <w:t>Joseph was faithful as the father's favorite son. When he was sold as a slave into Potiphar's house, no circumstance changed him. He was faithful, and Potiphar committed the whole house into his hands. When Potiphar's wife tested him, saying her husband would not know, Joseph said, 'How can I sin against God?' She pressed him repeatedly, and eventually defamed him.</w:t>
+        <w:t>Joseph was faithful as his father's favored son. When he was sold as a slave into Potiphar's house, no circumstance changed his integrity; he remained faithful, and Potiphar placed the entire estate under his hand. When Potiphar's wife solicited him, saying her husband would never know, Joseph declared that he would not sin against God. Even when she defamed him and had him cast into prison, he did not lapse into bitterness or plot a prison escape.</w:t>
       </w:r>
     </w:p>
     <w:p>
@@ -1351,7 +1284,7 @@
           <w:rFonts w:ascii="Arial" w:hAnsi="Arial"/>
           <w:sz w:val="24"/>
         </w:rPr>
-        <w:t>He arrived in prison and did not grumble or say, 'After serving God, look at what happened; let me plan a prison escape.' In prison, when the butler and baker had dreams, he was not bitter, saying, 'Is it not dreams that got me here? I am not ready for all this ministry nonsense.' No—he simply interpreted the dreams. Faithful! And when the butler forgot him, he did not grumble.</w:t>
+        <w:t>In prison, when the butler and the baker had dreams, Joseph was not resentful, complaining that dreams had caused his troubles. Instead, he faithfully interpreted their dreams. When the butler forgot him for two years, Joseph did not grumble. If an individual is going to manage a nation, they must know how to handle trouble.</w:t>
       </w:r>
     </w:p>
     <w:p>
@@ -1363,7 +1296,7 @@
           <w:rFonts w:ascii="Arial" w:hAnsi="Arial"/>
           <w:sz w:val="24"/>
         </w:rPr>
-        <w:t>If one is going to handle a nation, one must know how to handle trouble. When summoned before Pharaoh, Joseph did not set conditions: 'First, you must release me; second, execute the woman who lied against me; third, send me home.' He simply gave the interpretation and said God would give Pharaoh an answer of peace. Pharaoh recognized that the Spirit of God was in him, and placed him in charge of the entire nation.</w:t>
+        <w:t>When summoned before Pharaoh, Joseph did not set personal conditions demanding release, revenge against Potiphar's wife, or compensation. He simply declared that God would provide Pharaoh an answer of peace. Pharaoh recognized that the Spirit of God was in him, and placed him in charge of the nation.</w:t>
       </w:r>
     </w:p>
     <w:p>
@@ -1376,7 +1309,7 @@
           <w:i/>
           <w:sz w:val="24"/>
         </w:rPr>
-        <w:t>He was now in charge of the whole nation, including Potiphar's household. When Potiphar's wife came for rations, Joseph did not seek vengeance; he provided food and let her go.</w:t>
+        <w:t>Joseph was now in charge of the entire land, including Potiphar's household. When Potiphar's wife came seeking food provisions, Joseph did not retaliate; he provided rations and treated her with grace.</w:t>
       </w:r>
     </w:p>
     <w:p>
@@ -1388,7 +1321,7 @@
           <w:rFonts w:ascii="Arial" w:hAnsi="Arial"/>
           <w:sz w:val="24"/>
         </w:rPr>
-        <w:t>When the brothers came after their father died, they were afraid and conjured up a message claiming their father asked Joseph to forgive them. Joseph wept and said:</w:t>
+        <w:t>When his brothers arrived fearful after their father's death, manufacturing a message urging forgiveness, Joseph wept and comforted them:</w:t>
       </w:r>
     </w:p>
     <w:p>
@@ -1429,7 +1362,7 @@
           <w:rFonts w:ascii="Arial" w:hAnsi="Arial"/>
           <w:sz w:val="24"/>
         </w:rPr>
-        <w:t>See the character of Jesus Christ. That is faithfulness. No circumstance changes a faithful man.</w:t>
+        <w:t>That reveals the character of Jesus Christ. No circumstance changes a faithful person.</w:t>
       </w:r>
     </w:p>
     <w:p>
@@ -1441,19 +1374,7 @@
           <w:rFonts w:ascii="Arial" w:hAnsi="Arial"/>
           <w:sz w:val="24"/>
         </w:rPr>
-        <w:t>As a minister, one could be like Gehazi. Gehazi wanted something material; he ran after Naaman and contracted leprosy.</w:t>
-      </w:r>
-    </w:p>
-    <w:p>
-      <w:pPr>
-        <w:spacing w:before="80" w:after="80" w:line="276" w:lineRule="auto"/>
-      </w:pPr>
-      <w:r>
-        <w:rPr>
-          <w:rFonts w:ascii="Arial" w:hAnsi="Arial"/>
-          <w:sz w:val="24"/>
-        </w:rPr>
-        <w:t>God does not use people He does not test. He tests one so that He can entrust more to them. He builds character, strength, and commitment.</w:t>
+        <w:t>In contrast, Gehazi allowed covetousness to rule him; he ran after Naaman for material gain and contracted leprosy. God does not use people without testing them. He tests workers to build stamina and commitment so that He can entrust more into their hands.</w:t>
       </w:r>
     </w:p>
     <w:p>
@@ -1478,7 +1399,7 @@
           <w:rFonts w:ascii="Arial" w:hAnsi="Arial"/>
           <w:sz w:val="24"/>
         </w:rPr>
-        <w:t>All leaders must hear this: do not use people you have not proven. Do not donate responsibility to people.</w:t>
+        <w:t>Leaders must never assign responsibility to people who have not been proven. Responsibility should never be handed out casually.</w:t>
       </w:r>
     </w:p>
     <w:p>
@@ -1491,7 +1412,7 @@
           <w:i/>
           <w:sz w:val="24"/>
         </w:rPr>
-        <w:t>Someone once told me, 'Pastor, I am gathering some people in church.' I said, 'Go and do it in your zone and submit reports to your Zonal Pastor.' The person became uncomfortable, and I knew he was ambitious; he does not attend anymore because his motive was merely to be noticed by the senior pastor.</w:t>
+        <w:t>Someone once told me, 'Pastor, I am gathering some people in church.' I told him, 'Go and do that within your zone and submit your reports to the Zonal Pastor.' The person immediately became uncomfortable, and he stopped attending because his motive was simply to gain personal notice from the senior pastor.</w:t>
       </w:r>
     </w:p>
     <w:p>
@@ -1503,7 +1424,7 @@
           <w:rFonts w:ascii="Arial" w:hAnsi="Arial"/>
           <w:sz w:val="24"/>
         </w:rPr>
-        <w:t>Pastors, do not change the method. Let us see what workers do ourselves.</w:t>
+        <w:t>Pastors must not alter this standard; workers must be observed directly.</w:t>
       </w:r>
     </w:p>
     <w:p>
@@ -1516,7 +1437,7 @@
           <w:i/>
           <w:sz w:val="24"/>
         </w:rPr>
-        <w:t>If you are placed on a committee to supervise a hostel at Believers Convention and everything falls apart, we look at that. If you are assigned to Works and arrive late, that matters. If you had eight workers and only two remain while six are gone, that matters a lot. Eye-service will not take anyone far.</w:t>
+        <w:t>If someone is appointed to a committee to supervise accommodations during a convention and the arrangement collapses, that is noted. If someone assigned to Works arrives late, that matters. If a leader had eight workers and six have disappeared with only two remaining, that matters significantly. Eye-service will not sustain anyone.</w:t>
       </w:r>
     </w:p>
     <w:p>
@@ -1529,7 +1450,7 @@
           <w:i/>
           <w:sz w:val="24"/>
         </w:rPr>
-        <w:t>God allows certain fires so that those who cannot be with you in the promised land do not cross the desert.</w:t>
+        <w:t>God permits certain fires so that those who cannot stand with leadership in the promised land do not cross the desert.</w:t>
       </w:r>
     </w:p>
     <w:p>
@@ -1542,7 +1463,7 @@
           <w:i/>
           <w:sz w:val="24"/>
         </w:rPr>
-        <w:t>Forget all this social media pastoring. God does not give pastoral oversight through social media. There is no scripture for having oversight over people through media—following people online is not pastoring. Do not run from tests; be faithful.</w:t>
+        <w:t>Furthermore, pastoral oversight cannot be exercised through social media. Following followers on an online page is not pastoring; there is no scriptural basis for pastoring through social media. Do not flee from testing; remain faithful.</w:t>
       </w:r>
     </w:p>
     <w:p>
@@ -1567,7 +1488,7 @@
           <w:rFonts w:ascii="Arial" w:hAnsi="Arial"/>
           <w:sz w:val="24"/>
         </w:rPr>
-        <w:t>Look at David in 1 Samuel 16. In Ezekiel 34, the prophetic name given to Jesus is David. Look at David the shepherd: the very first time we hear about him in 1 Samuel 16:</w:t>
+        <w:t>Consider David the shepherd. In Ezekiel 34, the prophetic name applied to Jesus is David. Look at the very first mention of David in 1 Samuel 16: when Samuel asked Jesse whether all his sons were present, Jesse replied:</w:t>
       </w:r>
     </w:p>
     <w:p>
@@ -1608,7 +1529,7 @@
           <w:rFonts w:ascii="Arial" w:hAnsi="Arial"/>
           <w:sz w:val="24"/>
         </w:rPr>
-        <w:t>The very first thing known of him was that he was keeping the sheep.</w:t>
+        <w:t>The foundational testimony concerning David was that he was keeping the sheep.</w:t>
       </w:r>
     </w:p>
     <w:p>
@@ -1620,19 +1541,7 @@
           <w:rFonts w:ascii="Arial" w:hAnsi="Arial"/>
           <w:sz w:val="24"/>
         </w:rPr>
-        <w:t>When he went to the battlefield and his brother Eliab mocked him concerning the few sheep in the wilderness, David had left them in good care with a keeper.</w:t>
-      </w:r>
-    </w:p>
-    <w:p>
-      <w:pPr>
-        <w:spacing w:before="80" w:after="80" w:line="276" w:lineRule="auto"/>
-      </w:pPr>
-      <w:r>
-        <w:rPr>
-          <w:rFonts w:ascii="Arial" w:hAnsi="Arial"/>
-          <w:sz w:val="24"/>
-        </w:rPr>
-        <w:t>When he stood before Saul, what were his credentials?</w:t>
+        <w:t>When David went to the battlefront and his older brother Eliab mocked him concerning the few sheep left in the wilderness, David had already ensured that those sheep were left in the care of a keeper. When brought before King Saul, David cited his pastoral vigilance:</w:t>
       </w:r>
     </w:p>
     <w:p>
@@ -1703,7 +1612,7 @@
           <w:rFonts w:ascii="Arial" w:hAnsi="Arial"/>
           <w:sz w:val="24"/>
         </w:rPr>
-        <w:t>He did not lose a single sheep. He mirrored the Good Shepherd. Faithful with a few! God proved David with the sheep, and then gave him the nation—just as Moses was forty years faithful with the flock before God gave him Israel. Faithfulness must never be in the past; faithfulness is what one is doing now. Lives are God's investment into other lives.</w:t>
+        <w:t>David did not lose a single lamb; he mirrored the Good Shepherd. He was faithful with the few. God proved David with the flock before entrusting him with the nation—just as Moses spent forty years tending sheep before leading Israel. Faithfulness must never be merely a thing of the past; faithfulness is what one is actively doing now.</w:t>
       </w:r>
     </w:p>
     <w:p>
@@ -1716,7 +1625,7 @@
           <w:b/>
           <w:sz w:val="24"/>
         </w:rPr>
-        <w:t>The Word and the Spirit: Resources to Manage Lives</w:t>
+        <w:t>The Word and the Spirit: Resources to Multiply Lives</w:t>
       </w:r>
     </w:p>
     <w:p>
@@ -1728,7 +1637,7 @@
           <w:rFonts w:ascii="Arial" w:hAnsi="Arial"/>
           <w:sz w:val="24"/>
         </w:rPr>
-        <w:t>The Word and the Spirit are the resources to multiply what God has given. The Word: you preach it, teach it, and act upon it. A leader is not just a preacher giving instructions left and right, but an example:</w:t>
+        <w:t>The Word of God and the Holy Spirit are the minister's resources to multiply what God has committed to their hands. The Word is what you preach, teach, and act upon. A leader is not called merely to give instructions in every direction, but to stand as an example:</w:t>
       </w:r>
     </w:p>
     <w:p>
@@ -1798,7 +1707,7 @@
           <w:rFonts w:ascii="Arial" w:hAnsi="Arial"/>
           <w:sz w:val="24"/>
         </w:rPr>
-        <w:t>A leader listens to God's Word with the 'second hearing'—hearing not just for oneself, but on behalf of nations.</w:t>
+        <w:t>A leader must listen to God's Word with 'the second hearing.' A leader does not listen merely for personal benefit; a leader listens on behalf of nations. That requires deep attention rather than casual listening. The Word of God and the Spirit are your resources; if you mishandle them, the work suffers. When teaching books are released, no one should need to compel a leader to acquire them.</w:t>
       </w:r>
     </w:p>
     <w:p>
@@ -1811,7 +1720,7 @@
           <w:i/>
           <w:sz w:val="24"/>
         </w:rPr>
-        <w:t>When we release books, nobody should need to compel a leader to get them. Decades ago, I would walk to Christian bookshops in Isolo, in a corner off Oshodi way. I would ask when Reverend Matthew was releasing the next books by Kenneth Hagin or Frederick K.C. Price. When they said two weeks, I would book down a copy in advance. They started a book club and I became number three in Nigeria as a teenager. Nobody compelled me.</w:t>
+        <w:t>Years ago, I would walk to Christian book distributors in Isolo, asking when new books by Kenneth Hagin or Frederick K.C. Price were arriving, booking copies down weeks in advance. When they began a national book club, I was among the top three in Nigeria as a teenager. Nobody had to compel me to purchase books.</w:t>
       </w:r>
     </w:p>
     <w:p>
@@ -1824,7 +1733,7 @@
           <w:i/>
           <w:sz w:val="24"/>
         </w:rPr>
-        <w:t>When the Amplified Bible was very rare, I would visit the only person I knew who had a copy, sit down for thirty minutes, and copy out the translation into my notebook by hand. You have to be that hungry! Today people can download tapes. There was a bookshop opposite Deeper Life where I went to buy Brother Hagin's tapes and T.L. Osborn's materials—there was no tape they had that I did not buy.</w:t>
+        <w:t>When the Amplified Bible was extraordinarily rare, I would visit the only person I knew who owned a copy, sit down for thirty allotted minutes, and copy out the verses and cross-references by hand into my notebook. One must have that degree of spiritual hunger. Today, people can easily download recordings. There was a bookshop opposite Deeper Life where I purchased every cassette tape available by Brother Hagin and T.L. Osborn. In 1994, I went to a tape kiosk wearing slippers and requested every tape by Pastor Chris. The attendant looked at me and asked, 'Do you know what you are talking about? There are over two hundred tapes!' I replied that I wanted everything, and I purchased them all. That is dedication: you do not go halfway, and you do not simply display them on a shelf—you study them.</w:t>
       </w:r>
     </w:p>
     <w:p>
@@ -1837,7 +1746,7 @@
           <w:i/>
           <w:sz w:val="24"/>
         </w:rPr>
-        <w:t>In 1994, I went to a tape kiosk wearing slippers and told the attendant, 'I want all of Pastor Chris's tapes.' The attendant said, 'Do you know what you are talking about? There are over two hundred tapes!' I said, 'I want everything.' And I got them all. That is dedication—you do not go halfway, and you do not just put them on a shelf; you study them.</w:t>
+        <w:t>Twenty-four years ago, I began the Living Word Correspondence course, providing study books and examination questions to believers so they could study systematically. When you see our dedication to study today, it is not a recent development. Recently, a denomination asked me to review an 1,800-page curriculum. When they asked how long it would take, I requested four days. They asked, 'Did you say four months?' I said, 'Four days.' Within four days, I completed the review and returned it.</w:t>
       </w:r>
     </w:p>
     <w:p>
@@ -1850,7 +1759,7 @@
           <w:i/>
           <w:sz w:val="24"/>
         </w:rPr>
-        <w:t>We began Living Word Correspondence twenty-four years ago, giving study books and questions to believers so they could study as students.</w:t>
+        <w:t>In 1994, God spoke to my heart: 'Do not follow people's results; follow their labor.' What are they doing? If they are fasting and praying, do it. If they are giving their all, do it. Ministry is not merely stepping onto a pulpit and telling people to raise their hands toward heaven.</w:t>
       </w:r>
     </w:p>
     <w:p>
@@ -1863,7 +1772,19 @@
           <w:i/>
           <w:sz w:val="24"/>
         </w:rPr>
-        <w:t>Early in November, a denomination asked me to review materials totaling 1,800 pages. They asked, 'Can you review it?' I said, 'Give me four days.' They asked, 'Did you say four months?' I said, 'Four days.' In four days, I reviewed and returned everything.</w:t>
+        <w:t>In 1995 and 1996, when I lacked the money to buy books for everyone, I made photocopies of Brother Hagin's Bible study courses and distributed them during teaching meetings. What I am instructing you to do is not mere theory; give your all to acquire materials and invest in your spiritual life.</w:t>
+      </w:r>
+    </w:p>
+    <w:p>
+      <w:pPr>
+        <w:spacing w:before="80" w:after="80" w:line="276" w:lineRule="auto"/>
+      </w:pPr>
+      <w:r>
+        <w:rPr>
+          <w:rFonts w:ascii="Arial" w:hAnsi="Arial"/>
+          <w:sz w:val="24"/>
+        </w:rPr>
+        <w:t>When listening to God's Word in conventions or church services, listen on behalf of nations. Take utterances and prayers personally. When the service ends, put what you heard into practice. Whenever God repeats something continuously, it indicates that it has not yet been practiced.</w:t>
       </w:r>
     </w:p>
     <w:p>
@@ -1876,7 +1797,7 @@
           <w:i/>
           <w:sz w:val="24"/>
         </w:rPr>
-        <w:t>In 1994, God spoke to me: 'Do not follow people's results; follow their labor.' What are they doing? They are fasting and praying—do it! They are giving their all—do it! Not just how they stand on the pulpit waving their hands.</w:t>
+        <w:t>Many of you have demonstrated this consecration in the past: you used to walk long distances under the sun to attend meetings when you had no money for transit. Now, leaders excuse themselves because a vehicle broke down. There was a time in this ministry when confessing sickness was rejected; believers were compelled to stand upon divine healing.</w:t>
       </w:r>
     </w:p>
     <w:p>
@@ -1889,19 +1810,7 @@
           <w:i/>
           <w:sz w:val="24"/>
         </w:rPr>
-        <w:t>In 1995 and 1996, when I did not have money to buy books for everyone, I made photocopies of Brother Hagin's Bible study courses and distributed them to believers in teaching meetings. What I am telling you to do is not theory. You give your all to get materials. Invest your life, because that is your life.</w:t>
-      </w:r>
-    </w:p>
-    <w:p>
-      <w:pPr>
-        <w:spacing w:before="80" w:after="80" w:line="276" w:lineRule="auto"/>
-      </w:pPr>
-      <w:r>
-        <w:rPr>
-          <w:rFonts w:ascii="Arial" w:hAnsi="Arial"/>
-          <w:sz w:val="24"/>
-        </w:rPr>
-        <w:t>When listening to God's Word at Camp Meeting, Believers Convention, or church service, a leader listens for nations. Your resources are the Word and the Holy Ghost. Utterances, prayer—take them specially. When service ends, put them into practice. Whenever you notice God repeating something again and again, it means you have not been doing it.</w:t>
+        <w:t>We used to host Bible seminars on environmental sanitation Saturdays. Brethren would travel from Oyo State or Ogun State, arriving before 6:30 a.m. In the era of compact discs, believers would do anything to obtain a teaching disc. Today, recordings can be downloaded directly onto a phone; leaders must listen with headphones and feed upon the Word continuously.</w:t>
       </w:r>
     </w:p>
     <w:p>
@@ -1914,33 +1823,7 @@
           <w:i/>
           <w:sz w:val="24"/>
         </w:rPr>
-        <w:t>Some of you used to walk to meetings in the sun when you did not have money. Now you say your car broke down—did you have a car then? There was a time in this ministry it was almost a sin to say you were sick; you were forced to practice divine healing! You have done these things before—you have not outgrown them.</w:t>
-      </w:r>
-    </w:p>
-    <w:p>
-      <w:pPr>
-        <w:spacing w:before="80" w:after="80" w:line="276" w:lineRule="auto"/>
-      </w:pPr>
-      <w:r>
-        <w:rPr>
-          <w:rFonts w:ascii="Arial" w:hAnsi="Arial"/>
-          <w:i/>
-          <w:sz w:val="24"/>
-        </w:rPr>
-        <w:t>We used to hold Bible seminars on sanitation Saturdays. People would arrive from Oyo State or Ogun State before 6:30 a.m. In the days of CDs, people would do anything for a CD. Now you download messages on your phone—listen to them with headphones and feed on them continuously, because those are your resources for ministry.</w:t>
-      </w:r>
-    </w:p>
-    <w:p>
-      <w:pPr>
-        <w:spacing w:before="80" w:after="80" w:line="276" w:lineRule="auto"/>
-      </w:pPr>
-      <w:r>
-        <w:rPr>
-          <w:rFonts w:ascii="Arial" w:hAnsi="Arial"/>
-          <w:i/>
-          <w:sz w:val="24"/>
-        </w:rPr>
-        <w:t>Brother Toks is one of the most consistent human beings I know—annoyingly consistent. If you wanted to meet him at five minutes to twelve, he was praying in tongues. Consistent! That is faithfulness, commitment, doggedness.</w:t>
+        <w:t>Brother Toks is one of the most consistent men I know. If you wished to meet him, you simply stood before his door at five minutes before noon, and you would find him praying in tongues every single day. That is faithfulness, dedication, and consistency.</w:t>
       </w:r>
     </w:p>
     <w:p>
@@ -1994,7 +1877,7 @@
           <w:rFonts w:ascii="Arial" w:hAnsi="Arial"/>
           <w:sz w:val="24"/>
         </w:rPr>
-        <w:t>That habit of taking other people's church members must never be found among us! If someone asks about your disciple and you say, 'He attends that other church'—that is not your disciple. Your disciple is someone who was unsaved, unchurched, undiscipled. Not someone you dazzled with words or kidnapped—raise people from scratch: unsaved, untaught, unchurched. That is your work.</w:t>
+        <w:t>The practice of taking members from other assemblies must never be found among us. A disciple is someone who was unchurched, unsaved, and undiscipled—not someone dazzled with words or transferred from another fellowship. Leaders must raise believers from the foundation.</w:t>
       </w:r>
     </w:p>
     <w:p>
@@ -2006,7 +1889,7 @@
           <w:rFonts w:ascii="Arial" w:hAnsi="Arial"/>
           <w:sz w:val="24"/>
         </w:rPr>
-        <w:t>Four things are required of you concerning your flock:</w:t>
+        <w:t>Four operational responsibilities are required of every cell leader:</w:t>
       </w:r>
     </w:p>
     <w:p>
@@ -2031,7 +1914,7 @@
           <w:rFonts w:ascii="Arial" w:hAnsi="Arial"/>
           <w:sz w:val="24"/>
         </w:rPr>
-        <w:t>They must be saved through you.</w:t>
+        <w:t>The flock must be won through active evangelism:</w:t>
       </w:r>
     </w:p>
     <w:p>
@@ -2101,7 +1984,7 @@
           <w:rFonts w:ascii="Arial" w:hAnsi="Arial"/>
           <w:sz w:val="24"/>
         </w:rPr>
-        <w:t>If your meeting venue is not full, it is because your soul winning is not on fire. When you see empty seats, it shows a lack of passion for souls.</w:t>
+        <w:t>If a meeting venue has empty seats, it reflects a diminishing passion for souls.</w:t>
       </w:r>
     </w:p>
     <w:p>
@@ -2114,7 +1997,7 @@
           <w:i/>
           <w:sz w:val="24"/>
         </w:rPr>
-        <w:t>When Wizkid planned a concert in London at the O2 Arena, they had to stretch it to three days because people filled the venue even when ticket prices increased. There are people out there—we just have to work and win souls!</w:t>
+        <w:t>When Wizkid scheduled a concert in London at the O2 Arena, demand compelled organizers to extend it across three days. The people are out there in the city; we simply must labor to win them.</w:t>
       </w:r>
     </w:p>
     <w:p>
@@ -2139,7 +2022,7 @@
           <w:rFonts w:ascii="Arial" w:hAnsi="Arial"/>
           <w:sz w:val="24"/>
         </w:rPr>
-        <w:t>Inculcate this into all workers: it is utterly irresponsible to just send disciples to church. You do not bring people to church; you come with your disciples to church. Their church attendance is part of your discipleship.</w:t>
+        <w:t>Leaders must not merely invite people or dispatch them to church; a leader comes to church together with their disciples. Church attendance is an integral continuation of discipleship.</w:t>
       </w:r>
     </w:p>
     <w:p>
@@ -2151,19 +2034,7 @@
           <w:rFonts w:ascii="Arial" w:hAnsi="Arial"/>
           <w:sz w:val="24"/>
         </w:rPr>
-        <w:t>It is irresponsible for a leader to come into the service, sit in front, while the people they are mentoring are seated far away somewhere else. You sit around the same area! Part of your work is to watch how they are studying, how they are praying. You are not here alone.</w:t>
-      </w:r>
-    </w:p>
-    <w:p>
-      <w:pPr>
-        <w:spacing w:before="80" w:after="80" w:line="276" w:lineRule="auto"/>
-      </w:pPr>
-      <w:r>
-        <w:rPr>
-          <w:rFonts w:ascii="Arial" w:hAnsi="Arial"/>
-          <w:sz w:val="24"/>
-        </w:rPr>
-        <w:t>It is an insult for your disciple to be in the service without a Bible. If church attendance is a continuation of discipleship, they know they are coming to service in continuation of what you are teaching them. Do not delegate that job to the pastors; you are their pastor. You sit together: watch if they are singing, watch if they are writing notes. It is called oversight (</w:t>
+        <w:t>It is irresponsible for a leader to sit in the front rows while their disciples are scattered across the auditorium. Leaders must sit in the same area with their disciples to observe how they study, sing, worship, and take notes. Disciples should never sit through service without a Bible. Do not delegate that oversight to senior pastors; a cell leader is their pastor. That attentiveness is the very definition of pastoral oversight (</w:t>
       </w:r>
       <w:r>
         <w:rPr>
@@ -2179,7 +2050,7 @@
           <w:rFonts w:ascii="Arial" w:hAnsi="Arial"/>
           <w:sz w:val="24"/>
         </w:rPr>
-        <w:t>)—paying attention to behavior, paying attention to everything. Bad parenting results in an unruly society; bad pastoring results in careless Christians.</w:t>
+        <w:t>). Just as poor parenting produces disorder in society, careless pastoring produces undisciplined believers.</w:t>
       </w:r>
     </w:p>
     <w:p>
@@ -2204,7 +2075,7 @@
           <w:rFonts w:ascii="Arial" w:hAnsi="Arial"/>
           <w:sz w:val="24"/>
         </w:rPr>
-        <w:t>Do you have a plan on how your flock feeds on the Word of God daily? That does not mean you must see them physically every day—that is impossible—but do you have a plan for everyone under you to feed on God's Word daily? The work of ministry is not for weekends.</w:t>
+        <w:t>Leaders must have a structured plan ensuring that their flock feeds upon the Word of God daily. That does not mean physically meeting every day, but tracking their daily spiritual intake:</w:t>
       </w:r>
     </w:p>
     <w:p>
@@ -2289,7 +2160,7 @@
           <w:rFonts w:ascii="Arial" w:hAnsi="Arial"/>
           <w:sz w:val="24"/>
         </w:rPr>
-        <w:t>Daily teaching! What is everyone listening to in your cell this week? Follow up: 'Have you listened to that series? Tell me what you learned.' Follow-up is not just asking, 'Hope you are not forgetting service on Sunday?' You do not merely invite disciples; you inform them and you come together.</w:t>
+        <w:t>Paul taught daily in Ephesus. Cell leaders must actively follow up on what sermon series their flock is listening to, inquiring what was learned and ensuring continuous spiritual growth. Disciples are not merely invited to meetings; they are informed and brought together.</w:t>
       </w:r>
     </w:p>
     <w:p>
@@ -2302,7 +2173,7 @@
           <w:b/>
           <w:sz w:val="24"/>
         </w:rPr>
-        <w:t>4. Minister to Their Needs and Know Their Details</w:t>
+        <w:t>4. Minister to Their Needs and Maintain Detailed Pastoral Records</w:t>
       </w:r>
     </w:p>
     <w:p>
@@ -2358,7 +2229,7 @@
           <w:rFonts w:ascii="Arial" w:hAnsi="Arial"/>
           <w:sz w:val="24"/>
         </w:rPr>
-        <w:t>Do you know their names, their surnames, what they do, where they live? You must have those records: full names, dates of birth, occupations, where they live. If you cannot maintain that for twenty or fifty people, how will you oversee one thousand? That is pastoring; that is oversight.</w:t>
+        <w:t>A leader must maintain accurate pastoral records of every individual under their care: full legal names, dates of birth, residential addresses, and occupations. If a leader cannot maintain diligent familiarity with twenty or fifty people, they cannot oversee hundreds or thousands.</w:t>
       </w:r>
     </w:p>
     <w:p>
@@ -2383,7 +2254,7 @@
           <w:rFonts w:ascii="Arial" w:hAnsi="Arial"/>
           <w:sz w:val="24"/>
         </w:rPr>
-        <w:t>Pastoring is a daily walk. Even when you are not physically present, you are pastoring through prayer and oversight. You create time: for family, for yourself, for your work, for your business, for your health, for souls, for church, for leaders. You must cut off frivolous things. Why? Because men of purpose are busy people.</w:t>
+        <w:t>Pastoral ministry is a continuous, daily lifestyle. Even when a leader is not physically present, they are pastoring through prayer, planning, and communication. A leader must manage time intentionally, making room for family, vocational employment, personal communion, health, and flock oversight by removing frivolous activities.</w:t>
       </w:r>
     </w:p>
     <w:p>
@@ -2396,7 +2267,7 @@
           <w:i/>
           <w:sz w:val="24"/>
         </w:rPr>
-        <w:t>I was once in the office of one of Nigeria's billionaires. He discussed traveling to Paris and New York like someone traveling to Ikeja. Another time, he said, 'Let's go to Ilorin at 10:30 p.m.' We boarded his private jet, flew to Ilorin where he inspected a project, and within twenty minutes we flew back to Lagos. The driver who brought me was still waiting in the car park! He was that focused and busy.</w:t>
+        <w:t>Men of purpose are inherently busy people. I once visited a prominent Nigerian businessman in his office. He managed flights to Paris and New York with remarkable speed. On one occasion at 10:30 p.m., he invited me on his private jet to Ilorin to inspect an ongoing project; within twenty minutes of inspecting it, we flew back to Lagos before the driver waiting for me in the parking lot realized we had left.</w:t>
       </w:r>
     </w:p>
     <w:p>
@@ -2408,7 +2279,7 @@
           <w:rFonts w:ascii="Arial" w:hAnsi="Arial"/>
           <w:sz w:val="24"/>
         </w:rPr>
-        <w:t>People see others accomplishing great things and think they just sat down confessing. You do not confess fulfillment in ministry; you work—you are busy!</w:t>
+        <w:t>People observe great results and assume they were achieved merely by passive confessions. Fulfillment in ministry is never achieved by mere confession; it demands relentless, disciplined labor.</w:t>
       </w:r>
     </w:p>
     <w:p>

</xml_diff>

<commit_message>
Eliminate opening stage banter and refine transcript opening at 1 Cor 4
</commit_message>
<xml_diff>
--- a/Cell_Leaders_Conference_Faithfulness_in_Ministry.docx
+++ b/Cell_Leaders_Conference_Faithfulness_in_Ministry.docx
@@ -42,19 +42,6 @@
           <w:sz w:val="24"/>
         </w:rPr>
         <w:t>It Is Required in Stewards That a Man Be Found Faithful</w:t>
-      </w:r>
-    </w:p>
-    <w:p>
-      <w:pPr>
-        <w:spacing w:before="80" w:after="80" w:line="276" w:lineRule="auto"/>
-      </w:pPr>
-      <w:r>
-        <w:rPr>
-          <w:rFonts w:ascii="Arial" w:hAnsi="Arial"/>
-          <w:i/>
-          <w:sz w:val="24"/>
-        </w:rPr>
-        <w:t>I shared this yesterday and I am going to run through it again. Many must have seen it on my Facebook; I rarely share my notes like that, but I wanted people to read and see it.</w:t>
       </w:r>
     </w:p>
     <w:p>
@@ -387,7 +374,7 @@
           <w:i/>
           <w:sz w:val="24"/>
         </w:rPr>
-        <w:t>One knows he was not acting for himself by what took place after Elijah was taken up and the mantle fell upon him. As he split the Jordan, he cried:</w:t>
+        <w:t>When Elijah was taken up and the mantle fell upon him, as he split the Jordan, he cried:</w:t>
       </w:r>
     </w:p>
     <w:p>
@@ -475,10 +462,9 @@
       <w:r>
         <w:rPr>
           <w:rFonts w:ascii="Arial" w:hAnsi="Arial"/>
-          <w:i/>
           <w:sz w:val="24"/>
         </w:rPr>
-        <w:t>At the Believers Convention, Pastor Somi shared thoughts that highlighted Timothy's consistent faithfulness throughout Paul's writings.</w:t>
+        <w:t>Throughout the New Testament epistles, Timothy was so consistently faithful and present everywhere that one could readily refer to Paul's epistles as Timothy's epistles.</w:t>
       </w:r>
     </w:p>
     <w:p>
@@ -490,19 +476,7 @@
           <w:rFonts w:ascii="Arial" w:hAnsi="Arial"/>
           <w:sz w:val="24"/>
         </w:rPr>
-        <w:t>One could readily call Paul's epistles Timothy's epistles, because Timothy was faithful and present everywhere.</w:t>
-      </w:r>
-    </w:p>
-    <w:p>
-      <w:pPr>
-        <w:spacing w:before="80" w:after="80" w:line="276" w:lineRule="auto"/>
-      </w:pPr>
-      <w:r>
-        <w:rPr>
-          <w:rFonts w:ascii="Arial" w:hAnsi="Arial"/>
-          <w:sz w:val="24"/>
-        </w:rPr>
-        <w:t>In contrast, Proverbs 25:19 describes the pain of unfaithfulness:</w:t>
+        <w:t>In contrast, Proverbs 25:19 describes the acute dysfunction of unfaithfulness:</w:t>
       </w:r>
     </w:p>
     <w:p>
@@ -544,7 +518,7 @@
           <w:i/>
           <w:sz w:val="24"/>
         </w:rPr>
-        <w:t>I have experienced this as well. A broken tooth is painful and cannot chew; a foot out of joint cannot walk.</w:t>
+        <w:t>A broken tooth is painful and cannot chew; a foot out of joint cannot walk.</w:t>
       </w:r>
     </w:p>
     <w:p>
@@ -914,7 +888,7 @@
           <w:i/>
           <w:sz w:val="24"/>
         </w:rPr>
-        <w:t>One Christmas Day, while returning from the United States through Dallas where Brother Pelumi was hosting me, we spent so much time greeting and talking that I missed my flight. Later, while traveling, I observed that security personnel were actively on duty, airplanes were operating, and air traffic controllers were directing flights without distraction. Doctors were on call delivering babies on Christmas Day, and police officers were inspecting vehicle trunks while greeting motorists with 'Merry Christmas.' Operations were running around the clock. I told myself: 'I am a preacher of the gospel; I must maintain spiritual alertness.'</w:t>
+        <w:t>One Christmas Day, while returning from the United States through Dallas, I observed that security personnel were actively on duty, airplanes were operating, and air traffic controllers were directing flights without distraction. Doctors were on call delivering babies on Christmas Day, and police officers were inspecting vehicle trunks while greeting motorists with 'Merry Christmas.' Operations were running around the clock. I told myself: 'I am a preacher of the gospel; I must maintain spiritual alertness.'</w:t>
       </w:r>
     </w:p>
     <w:p>
@@ -1463,7 +1437,7 @@
           <w:i/>
           <w:sz w:val="24"/>
         </w:rPr>
-        <w:t>Furthermore, pastoral oversight cannot be exercised through social media. Following followers on an online page is not pastoring; there is no scriptural basis for pastoring through social media. Do not flee from testing; remain faithful.</w:t>
+        <w:t>Furthermore, pastoral oversight cannot be exercised through social media. Following people on an online church page is not pastoring; there is no scriptural basis for pastoring through social media. Do not flee from testing; remain faithful.</w:t>
       </w:r>
     </w:p>
     <w:p>
@@ -1797,7 +1771,7 @@
           <w:i/>
           <w:sz w:val="24"/>
         </w:rPr>
-        <w:t>Many of you have demonstrated this consecration in the past: you used to walk long distances under the sun to attend meetings when you had no money for transit. Now, leaders excuse themselves because a vehicle broke down. There was a time in this ministry when confessing sickness was rejected; believers were compelled to stand upon divine healing.</w:t>
+        <w:t>Many demonstrated great consecration in earlier years, walking long distances under the sun to attend meetings when there was no transit fare. Leaders must not allow vehicles or natural conveniences to dilute that stamina. There was a time in this ministry when confessing sickness was rejected; believers stood upon divine healing.</w:t>
       </w:r>
     </w:p>
     <w:p>
@@ -2289,10 +2263,10 @@
       <w:r>
         <w:rPr>
           <w:rFonts w:ascii="Arial" w:hAnsi="Arial"/>
-          <w:i/>
+          <w:b/>
           <w:sz w:val="24"/>
         </w:rPr>
-        <w:t>A man of purpose is busy. Let us pray.</w:t>
+        <w:t>A man of purpose is busy.</w:t>
       </w:r>
     </w:p>
     <w:sectPr>

</xml_diff>